<commit_message>
Fix margins: every figure and table now fits within the printable area
- Set explicit 0.75 in page margins (7.0 in usable width).
- All figures sized via an img_size() helper that caps the long edge
  at 6.5 in width / 8.0 in height, preserving aspect ratio.
- All flextables now use explicit per-column widths (summing to
  <= 7.0 in) with layout = "fixed", so columns can no longer
  auto-grow off the page.
- Long auto-generated labels were also cleaned up: the cumulative-
  relapse strata are now "MAP3K8-high" / "MAP3K8-low" (not
  "MAP3K8_grp=MAP3K8-high"), and the multivariable Cox term
  names are rewritten to "MAP3K8: high", "RCB: III", "Stage IIIA",
  etc., so the Term column fits comfortably in its allotted width.

Co-Authored-By: Claude Opus 4.7 (1M context) <noreply@anthropic.com>
</commit_message>
<xml_diff>
--- a/08_MAP3K8_Chemoresistance_Prognosis/MAP3K8_Chemoresistance_Report.docx
+++ b/08_MAP3K8_Chemoresistance_Prognosis/MAP3K8_Chemoresistance_Report.docx
@@ -15,7 +15,7 @@
         <w:pStyle w:val="Normal"/>
       </w:pPr>
       <w:r>
-        <w:t xml:space="preserve">GSE25066, n = 178 · neoadjuvant anthracycline-taxane chemotherapy · distant relapse-free survival endpoint</w:t>
+        <w:t xml:space="preserve">GSE25066, n = 178 - neoadjuvant anthracycline-taxane chemotherapy - distant relapse-free survival endpoint</w:t>
       </w:r>
     </w:p>
     <w:p>
@@ -31,7 +31,7 @@
         <w:pStyle w:val="Normal"/>
       </w:pPr>
       <w:r>
-        <w:t xml:space="preserve">MAP3K8-high tumours in chemo-treated TNBC showed a 1.8-fold higher rate of distant relapse compared with MAP3K8-low tumours (HR 1.80, 95% CI 1.09 – 2.98, log-rank P = 0.020). The effect remained directionally consistent after multivariable adjustment for age, AJCC stage, and Residual Cancer Burden (RCB) class (HR 1.71, 95% CI 1.00 – 2.94, P = 0.050), indicating that MAP3K8 carries prognostic information independent of initial chemoresponse. In the pre-specified RCB-II/III residual-disease subgroup, MAP3K8-high further stratified outcomes (HR 2.13, 95% CI 1.16 – 3.90, log-rank P = 0.013). At five years, the cumulative distant relapse rate was 50.5% in MAP3K8-high tumours versus 34.8% in MAP3K8-low — a 16-point absolute difference. Together with the absence of an MAP3K8 association with pathological complete response (AUC = 0.52; logistic OR per unit log2 expression 1.01, P = 0.96; Cohen's κ versus the Hatzis chemosensitivity signature = 0.08), these data position MAP3K8 as a marker of clinical chemoresistance — manifesting as post-treatment distant relapse rather than as primary chemoresponse failure.</w:t>
+        <w:t xml:space="preserve">MAP3K8-high tumours in chemo-treated TNBC showed a 1.8-fold higher rate of distant relapse compared with MAP3K8-low tumours (HR 1.80, 95% CI 1.09 - 2.98, log-rank P = 0.020). The effect remained directionally consistent after multivariable adjustment for age, AJCC stage, and Residual Cancer Burden (RCB) class (HR 1.71, 95% CI 1.00 - 2.94, P = 0.050), indicating that MAP3K8 carries prognostic information independent of initial chemoresponse. In the pre-specified RCB-II/III residual-disease subgroup, MAP3K8-high further stratified outcomes (HR 2.13, 95% CI 1.16 - 3.90, log-rank P = 0.013). At five years, the cumulative distant relapse rate was 50.5% in MAP3K8-high tumours versus 34.8% in MAP3K8-low - a 16-point absolute difference. Together with the absence of an MAP3K8 association with pathological complete response (AUC = 0.52; logistic OR per unit log2 expression 1.01, P = 0.96; Cohen's kappa versus the Hatzis chemosensitivity signature = 0.08), these data position MAP3K8 as a marker of clinical chemoresistance - manifesting as post-treatment distant relapse rather than as primary chemoresponse failure.</w:t>
       </w:r>
     </w:p>
     <w:p>
@@ -55,7 +55,7 @@
         <w:pStyle w:val="Normal"/>
       </w:pPr>
       <w:r>
-        <w:t xml:space="preserve">GSE25066 (Hatzis &amp; Pusztai, JAMA 2011; Booser series) — 508 women with primary breast cancer treated with neoadjuvant anthracycline-taxane chemotherapy, profiled on Affymetrix HG-U133A (GPL96, MAS5.0). The triple-negative subset (n = 178) was defined as ER-IHC negative AND PR-IHC negative AND HER2 negative; this subset is used for every analysis below.</w:t>
+        <w:t xml:space="preserve">GSE25066 (Hatzis &amp; Pusztai, JAMA 2011; Booser series) - 508 women with primary breast cancer treated with neoadjuvant anthracycline-taxane chemotherapy, profiled on Affymetrix HG-U133A (GPL96, MAS5.0). The triple-negative subset (n = 178) was defined as ER-IHC negative AND PR-IHC negative AND HER2 negative; this subset is used for every analysis below.</w:t>
       </w:r>
     </w:p>
     <w:p>
@@ -87,7 +87,7 @@
         <w:pStyle w:val="Normal"/>
       </w:pPr>
       <w:r>
-        <w:t xml:space="preserve">MAP3K8 mRNA expression from probe 205027_s_at on the GPL96 platform, log2-scaled in the original series matrix. Patients were dichotomised at the cohort median (log2 = 6.85); MAP3K8-high was defined as ≥ median, MAP3K8-low as &lt; median. MAP3K8-low was used as the reference group in every Cox and Kaplan-Meier comparison, so reported hazard ratios are for high vs low.</w:t>
+        <w:t xml:space="preserve">MAP3K8 mRNA expression from probe 205027_s_at on the GPL96 platform, log2-scaled in the original series matrix. Patients were dichotomised at the cohort median (log2 = 6.85); MAP3K8-high was defined as at least the median, MAP3K8-low as below. MAP3K8-low was used as the reference group in every Cox and Kaplan-Meier comparison, so reported hazard ratios are for high versus low.</w:t>
       </w:r>
     </w:p>
     <w:p>
@@ -159,7 +159,7 @@
         <w:pStyle w:val="Normal"/>
       </w:pPr>
       <w:r>
-        <w:t xml:space="preserve">HR(MAP3K8-high vs MAP3K8-low) = 1.80 (95% CI 1.09 – 2.98), log-rank P = 0.020, Cox P = 0.021. The Kaplan-Meier curves separate early and continue to diverge over follow-up. At 60 months the MAP3K8-high group has lost roughly half of its patients to distant relapse, while the MAP3K8-low group has retained two-thirds.</w:t>
+        <w:t xml:space="preserve">HR(MAP3K8-high vs MAP3K8-low) = 1.80 (95% CI 1.09 - 2.98), log-rank P = 0.020, Cox P = 0.021. The Kaplan-Meier curves separate early and continue to diverge over follow-up. At 60 months the MAP3K8-high group has lost roughly half of its patients to distant relapse, while the MAP3K8-low group has retained two-thirds.</w:t>
       </w:r>
     </w:p>
     <w:p>
@@ -170,7 +170,7 @@
         <w:rPr/>
         <w:drawing>
           <wp:inline distT="0" distB="0" distL="0" distR="0">
-            <wp:extent cx="5669280" cy="5486400"/>
+            <wp:extent cx="5943600" cy="5715000"/>
             <wp:docPr id="1" name="" descr=""/>
             <wp:cNvGraphicFramePr>
               <a:graphicFrameLocks xmlns:a="http://schemas.openxmlformats.org/drawingml/2006/main" noChangeAspect="1"/>
@@ -193,7 +193,7 @@
                   <pic:spPr bwMode="auto">
                     <a:xfrm>
                       <a:off x="0" y="0"/>
-                      <a:ext cx="5669280" cy="5486400"/>
+                      <a:ext cx="5943600" cy="5715000"/>
                     </a:xfrm>
                     <a:prstGeom prst="rect">
                       <a:avLst/>
@@ -230,16 +230,16 @@
         <w:tblLook w:firstRow="1" w:lastRow="0" w:firstColumn="0" w:lastColumn="0" w:noHBand="0" w:noVBand="1"/>
       </w:tblPr>
       <w:tblGrid>
-        <w:gridCol w:w="3205"/>
-        <w:gridCol w:w="1670"/>
-        <w:gridCol w:w="961"/>
-        <w:gridCol w:w="1279"/>
-        <w:gridCol w:w="1316"/>
-        <w:gridCol w:w="1548"/>
+        <w:gridCol w:w="2016"/>
+        <w:gridCol w:w="1296"/>
+        <w:gridCol w:w="1440"/>
+        <w:gridCol w:w="1440"/>
+        <w:gridCol w:w="1440"/>
+        <w:gridCol w:w="1440"/>
       </w:tblGrid>
       <w:tr>
         <w:trPr>
-          <w:trHeight w:val="619" w:hRule="auto"/>
+          <w:trHeight w:val="360" w:hRule="auto"/>
           <w:tblHeader/>
         </w:trPr>
         <w:tc>
@@ -269,8 +269,8 @@
                 <w:left w:val="none" w:sz="0" w:space="0" w:color="000000"/>
                 <w:right w:val="none" w:sz="0" w:space="0" w:color="000000"/>
               </w:pBdr>
-              <w:spacing w:after="100" w:before="100" w:line="240"/>
-              <w:ind w:left="100" w:right="100" w:firstLine="0" w:firstLineChars="0"/>
+              <w:spacing w:after="60" w:before="60" w:line="240"/>
+              <w:ind w:left="60" w:right="60" w:firstLine="0" w:firstLineChars="0"/>
               <w:rPr>
                 <w:rFonts w:ascii="Helvetica" w:hAnsi="Helvetica" w:eastAsia="Helvetica" w:cs="Helvetica"/>
                 <w:i w:val="false"/>
@@ -293,7 +293,7 @@
                 <w:szCs w:val="18"/>
                 <w:color w:val="000000"/>
               </w:rPr>
-              <w:t xml:space="preserve">group</w:t>
+              <w:t xml:space="preserve">MAP3K8 group</w:t>
             </w:r>
           </w:p>
         </w:tc>
@@ -317,15 +317,15 @@
           <w:p>
             <w:pPr>
               <w:pStyle w:val="Normal"/>
-              <w:jc w:val="right"/>
-              <w:pBdr>
-                <w:bottom w:val="none" w:sz="0" w:space="0" w:color="000000"/>
-                <w:top w:val="none" w:sz="0" w:space="0" w:color="000000"/>
-                <w:left w:val="none" w:sz="0" w:space="0" w:color="000000"/>
-                <w:right w:val="none" w:sz="0" w:space="0" w:color="000000"/>
-              </w:pBdr>
-              <w:spacing w:after="100" w:before="100" w:line="240"/>
-              <w:ind w:left="100" w:right="100" w:firstLine="0" w:firstLineChars="0"/>
+              <w:jc w:val="left"/>
+              <w:pBdr>
+                <w:bottom w:val="none" w:sz="0" w:space="0" w:color="000000"/>
+                <w:top w:val="none" w:sz="0" w:space="0" w:color="000000"/>
+                <w:left w:val="none" w:sz="0" w:space="0" w:color="000000"/>
+                <w:right w:val="none" w:sz="0" w:space="0" w:color="000000"/>
+              </w:pBdr>
+              <w:spacing w:after="60" w:before="60" w:line="240"/>
+              <w:ind w:left="60" w:right="60" w:firstLine="0" w:firstLineChars="0"/>
               <w:rPr>
                 <w:rFonts w:ascii="Helvetica" w:hAnsi="Helvetica" w:eastAsia="Helvetica" w:cs="Helvetica"/>
                 <w:i w:val="false"/>
@@ -348,7 +348,7 @@
                 <w:szCs w:val="18"/>
                 <w:color w:val="000000"/>
               </w:rPr>
-              <w:t xml:space="preserve">time_months</w:t>
+              <w:t xml:space="preserve">Time (mo)</w:t>
             </w:r>
           </w:p>
         </w:tc>
@@ -372,15 +372,15 @@
           <w:p>
             <w:pPr>
               <w:pStyle w:val="Normal"/>
-              <w:jc w:val="right"/>
-              <w:pBdr>
-                <w:bottom w:val="none" w:sz="0" w:space="0" w:color="000000"/>
-                <w:top w:val="none" w:sz="0" w:space="0" w:color="000000"/>
-                <w:left w:val="none" w:sz="0" w:space="0" w:color="000000"/>
-                <w:right w:val="none" w:sz="0" w:space="0" w:color="000000"/>
-              </w:pBdr>
-              <w:spacing w:after="100" w:before="100" w:line="240"/>
-              <w:ind w:left="100" w:right="100" w:firstLine="0" w:firstLineChars="0"/>
+              <w:jc w:val="left"/>
+              <w:pBdr>
+                <w:bottom w:val="none" w:sz="0" w:space="0" w:color="000000"/>
+                <w:top w:val="none" w:sz="0" w:space="0" w:color="000000"/>
+                <w:left w:val="none" w:sz="0" w:space="0" w:color="000000"/>
+                <w:right w:val="none" w:sz="0" w:space="0" w:color="000000"/>
+              </w:pBdr>
+              <w:spacing w:after="60" w:before="60" w:line="240"/>
+              <w:ind w:left="60" w:right="60" w:firstLine="0" w:firstLineChars="0"/>
               <w:rPr>
                 <w:rFonts w:ascii="Helvetica" w:hAnsi="Helvetica" w:eastAsia="Helvetica" w:cs="Helvetica"/>
                 <w:i w:val="false"/>
@@ -403,7 +403,7 @@
                 <w:szCs w:val="18"/>
                 <w:color w:val="000000"/>
               </w:rPr>
-              <w:t xml:space="preserve">S_t</w:t>
+              <w:t xml:space="preserve">Survival</w:t>
             </w:r>
           </w:p>
         </w:tc>
@@ -427,15 +427,15 @@
           <w:p>
             <w:pPr>
               <w:pStyle w:val="Normal"/>
-              <w:jc w:val="right"/>
-              <w:pBdr>
-                <w:bottom w:val="none" w:sz="0" w:space="0" w:color="000000"/>
-                <w:top w:val="none" w:sz="0" w:space="0" w:color="000000"/>
-                <w:left w:val="none" w:sz="0" w:space="0" w:color="000000"/>
-                <w:right w:val="none" w:sz="0" w:space="0" w:color="000000"/>
-              </w:pBdr>
-              <w:spacing w:after="100" w:before="100" w:line="240"/>
-              <w:ind w:left="100" w:right="100" w:firstLine="0" w:firstLineChars="0"/>
+              <w:jc w:val="left"/>
+              <w:pBdr>
+                <w:bottom w:val="none" w:sz="0" w:space="0" w:color="000000"/>
+                <w:top w:val="none" w:sz="0" w:space="0" w:color="000000"/>
+                <w:left w:val="none" w:sz="0" w:space="0" w:color="000000"/>
+                <w:right w:val="none" w:sz="0" w:space="0" w:color="000000"/>
+              </w:pBdr>
+              <w:spacing w:after="60" w:before="60" w:line="240"/>
+              <w:ind w:left="60" w:right="60" w:firstLine="0" w:firstLineChars="0"/>
               <w:rPr>
                 <w:rFonts w:ascii="Helvetica" w:hAnsi="Helvetica" w:eastAsia="Helvetica" w:cs="Helvetica"/>
                 <w:i w:val="false"/>
@@ -458,7 +458,7 @@
                 <w:szCs w:val="18"/>
                 <w:color w:val="000000"/>
               </w:rPr>
-              <w:t xml:space="preserve">CI_lower</w:t>
+              <w:t xml:space="preserve">CI lower</w:t>
             </w:r>
           </w:p>
         </w:tc>
@@ -482,15 +482,15 @@
           <w:p>
             <w:pPr>
               <w:pStyle w:val="Normal"/>
-              <w:jc w:val="right"/>
-              <w:pBdr>
-                <w:bottom w:val="none" w:sz="0" w:space="0" w:color="000000"/>
-                <w:top w:val="none" w:sz="0" w:space="0" w:color="000000"/>
-                <w:left w:val="none" w:sz="0" w:space="0" w:color="000000"/>
-                <w:right w:val="none" w:sz="0" w:space="0" w:color="000000"/>
-              </w:pBdr>
-              <w:spacing w:after="100" w:before="100" w:line="240"/>
-              <w:ind w:left="100" w:right="100" w:firstLine="0" w:firstLineChars="0"/>
+              <w:jc w:val="left"/>
+              <w:pBdr>
+                <w:bottom w:val="none" w:sz="0" w:space="0" w:color="000000"/>
+                <w:top w:val="none" w:sz="0" w:space="0" w:color="000000"/>
+                <w:left w:val="none" w:sz="0" w:space="0" w:color="000000"/>
+                <w:right w:val="none" w:sz="0" w:space="0" w:color="000000"/>
+              </w:pBdr>
+              <w:spacing w:after="60" w:before="60" w:line="240"/>
+              <w:ind w:left="60" w:right="60" w:firstLine="0" w:firstLineChars="0"/>
               <w:rPr>
                 <w:rFonts w:ascii="Helvetica" w:hAnsi="Helvetica" w:eastAsia="Helvetica" w:cs="Helvetica"/>
                 <w:i w:val="false"/>
@@ -513,7 +513,7 @@
                 <w:szCs w:val="18"/>
                 <w:color w:val="000000"/>
               </w:rPr>
-              <w:t xml:space="preserve">CI_upper</w:t>
+              <w:t xml:space="preserve">CI upper</w:t>
             </w:r>
           </w:p>
         </w:tc>
@@ -537,15 +537,15 @@
           <w:p>
             <w:pPr>
               <w:pStyle w:val="Normal"/>
-              <w:jc w:val="right"/>
-              <w:pBdr>
-                <w:bottom w:val="none" w:sz="0" w:space="0" w:color="000000"/>
-                <w:top w:val="none" w:sz="0" w:space="0" w:color="000000"/>
-                <w:left w:val="none" w:sz="0" w:space="0" w:color="000000"/>
-                <w:right w:val="none" w:sz="0" w:space="0" w:color="000000"/>
-              </w:pBdr>
-              <w:spacing w:after="100" w:before="100" w:line="240"/>
-              <w:ind w:left="100" w:right="100" w:firstLine="0" w:firstLineChars="0"/>
+              <w:jc w:val="left"/>
+              <w:pBdr>
+                <w:bottom w:val="none" w:sz="0" w:space="0" w:color="000000"/>
+                <w:top w:val="none" w:sz="0" w:space="0" w:color="000000"/>
+                <w:left w:val="none" w:sz="0" w:space="0" w:color="000000"/>
+                <w:right w:val="none" w:sz="0" w:space="0" w:color="000000"/>
+              </w:pBdr>
+              <w:spacing w:after="60" w:before="60" w:line="240"/>
+              <w:ind w:left="60" w:right="60" w:firstLine="0" w:firstLineChars="0"/>
               <w:rPr>
                 <w:rFonts w:ascii="Helvetica" w:hAnsi="Helvetica" w:eastAsia="Helvetica" w:cs="Helvetica"/>
                 <w:i w:val="false"/>
@@ -568,14 +568,14 @@
                 <w:szCs w:val="18"/>
                 <w:color w:val="000000"/>
               </w:rPr>
-              <w:t xml:space="preserve">relapse_pct</w:t>
+              <w:t xml:space="preserve">Relapse %</w:t>
             </w:r>
           </w:p>
         </w:tc>
       </w:tr>
       <w:tr>
         <w:trPr>
-          <w:trHeight w:val="617" w:hRule="auto"/>
+          <w:trHeight w:val="360" w:hRule="auto"/>
         </w:trPr>
         <w:tc>
           <w:tcPr>
@@ -604,31 +604,31 @@
                 <w:left w:val="none" w:sz="0" w:space="0" w:color="000000"/>
                 <w:right w:val="none" w:sz="0" w:space="0" w:color="000000"/>
               </w:pBdr>
-              <w:spacing w:after="100" w:before="100" w:line="240"/>
-              <w:ind w:left="100" w:right="100" w:firstLine="0" w:firstLineChars="0"/>
-              <w:rPr>
-                <w:rFonts w:ascii="Helvetica" w:hAnsi="Helvetica" w:eastAsia="Helvetica" w:cs="Helvetica"/>
-                <w:i w:val="false"/>
-                <w:b w:val="false"/>
-                <w:u w:val="none"/>
-                <w:strike w:val="false"/>
-                <w:sz w:val="18"/>
-                <w:szCs w:val="18"/>
-                <w:color w:val="000000"/>
-              </w:rPr>
-            </w:pPr>
-            <w:r>
-              <w:rPr>
-                <w:rFonts w:ascii="Helvetica" w:hAnsi="Helvetica" w:eastAsia="Helvetica" w:cs="Helvetica"/>
-                <w:i w:val="false"/>
-                <w:b w:val="false"/>
-                <w:u w:val="none"/>
-                <w:strike w:val="false"/>
-                <w:sz w:val="18"/>
-                <w:szCs w:val="18"/>
-                <w:color w:val="000000"/>
-              </w:rPr>
-              <w:t xml:space="preserve">MAP3K8_grp=MAP3K8-low</w:t>
+              <w:spacing w:after="60" w:before="60" w:line="240"/>
+              <w:ind w:left="60" w:right="60" w:firstLine="0" w:firstLineChars="0"/>
+              <w:rPr>
+                <w:rFonts w:ascii="Helvetica" w:hAnsi="Helvetica" w:eastAsia="Helvetica" w:cs="Helvetica"/>
+                <w:i w:val="false"/>
+                <w:b w:val="false"/>
+                <w:u w:val="none"/>
+                <w:strike w:val="false"/>
+                <w:sz w:val="18"/>
+                <w:szCs w:val="18"/>
+                <w:color w:val="000000"/>
+              </w:rPr>
+            </w:pPr>
+            <w:r>
+              <w:rPr>
+                <w:rFonts w:ascii="Helvetica" w:hAnsi="Helvetica" w:eastAsia="Helvetica" w:cs="Helvetica"/>
+                <w:i w:val="false"/>
+                <w:b w:val="false"/>
+                <w:u w:val="none"/>
+                <w:strike w:val="false"/>
+                <w:sz w:val="18"/>
+                <w:szCs w:val="18"/>
+                <w:color w:val="000000"/>
+              </w:rPr>
+              <w:t xml:space="preserve">MAP3K8-low</w:t>
             </w:r>
           </w:p>
         </w:tc>
@@ -652,15 +652,15 @@
           <w:p>
             <w:pPr>
               <w:pStyle w:val="Normal"/>
-              <w:jc w:val="right"/>
-              <w:pBdr>
-                <w:bottom w:val="none" w:sz="0" w:space="0" w:color="000000"/>
-                <w:top w:val="none" w:sz="0" w:space="0" w:color="000000"/>
-                <w:left w:val="none" w:sz="0" w:space="0" w:color="000000"/>
-                <w:right w:val="none" w:sz="0" w:space="0" w:color="000000"/>
-              </w:pBdr>
-              <w:spacing w:after="100" w:before="100" w:line="240"/>
-              <w:ind w:left="100" w:right="100" w:firstLine="0" w:firstLineChars="0"/>
+              <w:jc w:val="center"/>
+              <w:pBdr>
+                <w:bottom w:val="none" w:sz="0" w:space="0" w:color="000000"/>
+                <w:top w:val="none" w:sz="0" w:space="0" w:color="000000"/>
+                <w:left w:val="none" w:sz="0" w:space="0" w:color="000000"/>
+                <w:right w:val="none" w:sz="0" w:space="0" w:color="000000"/>
+              </w:pBdr>
+              <w:spacing w:after="60" w:before="60" w:line="240"/>
+              <w:ind w:left="60" w:right="60" w:firstLine="0" w:firstLineChars="0"/>
               <w:rPr>
                 <w:rFonts w:ascii="Helvetica" w:hAnsi="Helvetica" w:eastAsia="Helvetica" w:cs="Helvetica"/>
                 <w:i w:val="false"/>
@@ -707,15 +707,15 @@
           <w:p>
             <w:pPr>
               <w:pStyle w:val="Normal"/>
-              <w:jc w:val="right"/>
-              <w:pBdr>
-                <w:bottom w:val="none" w:sz="0" w:space="0" w:color="000000"/>
-                <w:top w:val="none" w:sz="0" w:space="0" w:color="000000"/>
-                <w:left w:val="none" w:sz="0" w:space="0" w:color="000000"/>
-                <w:right w:val="none" w:sz="0" w:space="0" w:color="000000"/>
-              </w:pBdr>
-              <w:spacing w:after="100" w:before="100" w:line="240"/>
-              <w:ind w:left="100" w:right="100" w:firstLine="0" w:firstLineChars="0"/>
+              <w:jc w:val="center"/>
+              <w:pBdr>
+                <w:bottom w:val="none" w:sz="0" w:space="0" w:color="000000"/>
+                <w:top w:val="none" w:sz="0" w:space="0" w:color="000000"/>
+                <w:left w:val="none" w:sz="0" w:space="0" w:color="000000"/>
+                <w:right w:val="none" w:sz="0" w:space="0" w:color="000000"/>
+              </w:pBdr>
+              <w:spacing w:after="60" w:before="60" w:line="240"/>
+              <w:ind w:left="60" w:right="60" w:firstLine="0" w:firstLineChars="0"/>
               <w:rPr>
                 <w:rFonts w:ascii="Helvetica" w:hAnsi="Helvetica" w:eastAsia="Helvetica" w:cs="Helvetica"/>
                 <w:i w:val="false"/>
@@ -762,15 +762,15 @@
           <w:p>
             <w:pPr>
               <w:pStyle w:val="Normal"/>
-              <w:jc w:val="right"/>
-              <w:pBdr>
-                <w:bottom w:val="none" w:sz="0" w:space="0" w:color="000000"/>
-                <w:top w:val="none" w:sz="0" w:space="0" w:color="000000"/>
-                <w:left w:val="none" w:sz="0" w:space="0" w:color="000000"/>
-                <w:right w:val="none" w:sz="0" w:space="0" w:color="000000"/>
-              </w:pBdr>
-              <w:spacing w:after="100" w:before="100" w:line="240"/>
-              <w:ind w:left="100" w:right="100" w:firstLine="0" w:firstLineChars="0"/>
+              <w:jc w:val="center"/>
+              <w:pBdr>
+                <w:bottom w:val="none" w:sz="0" w:space="0" w:color="000000"/>
+                <w:top w:val="none" w:sz="0" w:space="0" w:color="000000"/>
+                <w:left w:val="none" w:sz="0" w:space="0" w:color="000000"/>
+                <w:right w:val="none" w:sz="0" w:space="0" w:color="000000"/>
+              </w:pBdr>
+              <w:spacing w:after="60" w:before="60" w:line="240"/>
+              <w:ind w:left="60" w:right="60" w:firstLine="0" w:firstLineChars="0"/>
               <w:rPr>
                 <w:rFonts w:ascii="Helvetica" w:hAnsi="Helvetica" w:eastAsia="Helvetica" w:cs="Helvetica"/>
                 <w:i w:val="false"/>
@@ -817,15 +817,15 @@
           <w:p>
             <w:pPr>
               <w:pStyle w:val="Normal"/>
-              <w:jc w:val="right"/>
-              <w:pBdr>
-                <w:bottom w:val="none" w:sz="0" w:space="0" w:color="000000"/>
-                <w:top w:val="none" w:sz="0" w:space="0" w:color="000000"/>
-                <w:left w:val="none" w:sz="0" w:space="0" w:color="000000"/>
-                <w:right w:val="none" w:sz="0" w:space="0" w:color="000000"/>
-              </w:pBdr>
-              <w:spacing w:after="100" w:before="100" w:line="240"/>
-              <w:ind w:left="100" w:right="100" w:firstLine="0" w:firstLineChars="0"/>
+              <w:jc w:val="center"/>
+              <w:pBdr>
+                <w:bottom w:val="none" w:sz="0" w:space="0" w:color="000000"/>
+                <w:top w:val="none" w:sz="0" w:space="0" w:color="000000"/>
+                <w:left w:val="none" w:sz="0" w:space="0" w:color="000000"/>
+                <w:right w:val="none" w:sz="0" w:space="0" w:color="000000"/>
+              </w:pBdr>
+              <w:spacing w:after="60" w:before="60" w:line="240"/>
+              <w:ind w:left="60" w:right="60" w:firstLine="0" w:firstLineChars="0"/>
               <w:rPr>
                 <w:rFonts w:ascii="Helvetica" w:hAnsi="Helvetica" w:eastAsia="Helvetica" w:cs="Helvetica"/>
                 <w:i w:val="false"/>
@@ -872,15 +872,15 @@
           <w:p>
             <w:pPr>
               <w:pStyle w:val="Normal"/>
-              <w:jc w:val="right"/>
-              <w:pBdr>
-                <w:bottom w:val="none" w:sz="0" w:space="0" w:color="000000"/>
-                <w:top w:val="none" w:sz="0" w:space="0" w:color="000000"/>
-                <w:left w:val="none" w:sz="0" w:space="0" w:color="000000"/>
-                <w:right w:val="none" w:sz="0" w:space="0" w:color="000000"/>
-              </w:pBdr>
-              <w:spacing w:after="100" w:before="100" w:line="240"/>
-              <w:ind w:left="100" w:right="100" w:firstLine="0" w:firstLineChars="0"/>
+              <w:jc w:val="center"/>
+              <w:pBdr>
+                <w:bottom w:val="none" w:sz="0" w:space="0" w:color="000000"/>
+                <w:top w:val="none" w:sz="0" w:space="0" w:color="000000"/>
+                <w:left w:val="none" w:sz="0" w:space="0" w:color="000000"/>
+                <w:right w:val="none" w:sz="0" w:space="0" w:color="000000"/>
+              </w:pBdr>
+              <w:spacing w:after="60" w:before="60" w:line="240"/>
+              <w:ind w:left="60" w:right="60" w:firstLine="0" w:firstLineChars="0"/>
               <w:rPr>
                 <w:rFonts w:ascii="Helvetica" w:hAnsi="Helvetica" w:eastAsia="Helvetica" w:cs="Helvetica"/>
                 <w:i w:val="false"/>
@@ -910,7 +910,7 @@
       </w:tr>
       <w:tr>
         <w:trPr>
-          <w:trHeight w:val="617" w:hRule="auto"/>
+          <w:trHeight w:val="360" w:hRule="auto"/>
         </w:trPr>
         <w:tc>
           <w:tcPr>
@@ -939,31 +939,31 @@
                 <w:left w:val="none" w:sz="0" w:space="0" w:color="000000"/>
                 <w:right w:val="none" w:sz="0" w:space="0" w:color="000000"/>
               </w:pBdr>
-              <w:spacing w:after="100" w:before="100" w:line="240"/>
-              <w:ind w:left="100" w:right="100" w:firstLine="0" w:firstLineChars="0"/>
-              <w:rPr>
-                <w:rFonts w:ascii="Helvetica" w:hAnsi="Helvetica" w:eastAsia="Helvetica" w:cs="Helvetica"/>
-                <w:i w:val="false"/>
-                <w:b w:val="false"/>
-                <w:u w:val="none"/>
-                <w:strike w:val="false"/>
-                <w:sz w:val="18"/>
-                <w:szCs w:val="18"/>
-                <w:color w:val="000000"/>
-              </w:rPr>
-            </w:pPr>
-            <w:r>
-              <w:rPr>
-                <w:rFonts w:ascii="Helvetica" w:hAnsi="Helvetica" w:eastAsia="Helvetica" w:cs="Helvetica"/>
-                <w:i w:val="false"/>
-                <w:b w:val="false"/>
-                <w:u w:val="none"/>
-                <w:strike w:val="false"/>
-                <w:sz w:val="18"/>
-                <w:szCs w:val="18"/>
-                <w:color w:val="000000"/>
-              </w:rPr>
-              <w:t xml:space="preserve">MAP3K8_grp=MAP3K8-low</w:t>
+              <w:spacing w:after="60" w:before="60" w:line="240"/>
+              <w:ind w:left="60" w:right="60" w:firstLine="0" w:firstLineChars="0"/>
+              <w:rPr>
+                <w:rFonts w:ascii="Helvetica" w:hAnsi="Helvetica" w:eastAsia="Helvetica" w:cs="Helvetica"/>
+                <w:i w:val="false"/>
+                <w:b w:val="false"/>
+                <w:u w:val="none"/>
+                <w:strike w:val="false"/>
+                <w:sz w:val="18"/>
+                <w:szCs w:val="18"/>
+                <w:color w:val="000000"/>
+              </w:rPr>
+            </w:pPr>
+            <w:r>
+              <w:rPr>
+                <w:rFonts w:ascii="Helvetica" w:hAnsi="Helvetica" w:eastAsia="Helvetica" w:cs="Helvetica"/>
+                <w:i w:val="false"/>
+                <w:b w:val="false"/>
+                <w:u w:val="none"/>
+                <w:strike w:val="false"/>
+                <w:sz w:val="18"/>
+                <w:szCs w:val="18"/>
+                <w:color w:val="000000"/>
+              </w:rPr>
+              <w:t xml:space="preserve">MAP3K8-low</w:t>
             </w:r>
           </w:p>
         </w:tc>
@@ -987,15 +987,15 @@
           <w:p>
             <w:pPr>
               <w:pStyle w:val="Normal"/>
-              <w:jc w:val="right"/>
-              <w:pBdr>
-                <w:bottom w:val="none" w:sz="0" w:space="0" w:color="000000"/>
-                <w:top w:val="none" w:sz="0" w:space="0" w:color="000000"/>
-                <w:left w:val="none" w:sz="0" w:space="0" w:color="000000"/>
-                <w:right w:val="none" w:sz="0" w:space="0" w:color="000000"/>
-              </w:pBdr>
-              <w:spacing w:after="100" w:before="100" w:line="240"/>
-              <w:ind w:left="100" w:right="100" w:firstLine="0" w:firstLineChars="0"/>
+              <w:jc w:val="center"/>
+              <w:pBdr>
+                <w:bottom w:val="none" w:sz="0" w:space="0" w:color="000000"/>
+                <w:top w:val="none" w:sz="0" w:space="0" w:color="000000"/>
+                <w:left w:val="none" w:sz="0" w:space="0" w:color="000000"/>
+                <w:right w:val="none" w:sz="0" w:space="0" w:color="000000"/>
+              </w:pBdr>
+              <w:spacing w:after="60" w:before="60" w:line="240"/>
+              <w:ind w:left="60" w:right="60" w:firstLine="0" w:firstLineChars="0"/>
               <w:rPr>
                 <w:rFonts w:ascii="Helvetica" w:hAnsi="Helvetica" w:eastAsia="Helvetica" w:cs="Helvetica"/>
                 <w:i w:val="false"/>
@@ -1042,15 +1042,15 @@
           <w:p>
             <w:pPr>
               <w:pStyle w:val="Normal"/>
-              <w:jc w:val="right"/>
-              <w:pBdr>
-                <w:bottom w:val="none" w:sz="0" w:space="0" w:color="000000"/>
-                <w:top w:val="none" w:sz="0" w:space="0" w:color="000000"/>
-                <w:left w:val="none" w:sz="0" w:space="0" w:color="000000"/>
-                <w:right w:val="none" w:sz="0" w:space="0" w:color="000000"/>
-              </w:pBdr>
-              <w:spacing w:after="100" w:before="100" w:line="240"/>
-              <w:ind w:left="100" w:right="100" w:firstLine="0" w:firstLineChars="0"/>
+              <w:jc w:val="center"/>
+              <w:pBdr>
+                <w:bottom w:val="none" w:sz="0" w:space="0" w:color="000000"/>
+                <w:top w:val="none" w:sz="0" w:space="0" w:color="000000"/>
+                <w:left w:val="none" w:sz="0" w:space="0" w:color="000000"/>
+                <w:right w:val="none" w:sz="0" w:space="0" w:color="000000"/>
+              </w:pBdr>
+              <w:spacing w:after="60" w:before="60" w:line="240"/>
+              <w:ind w:left="60" w:right="60" w:firstLine="0" w:firstLineChars="0"/>
               <w:rPr>
                 <w:rFonts w:ascii="Helvetica" w:hAnsi="Helvetica" w:eastAsia="Helvetica" w:cs="Helvetica"/>
                 <w:i w:val="false"/>
@@ -1097,15 +1097,15 @@
           <w:p>
             <w:pPr>
               <w:pStyle w:val="Normal"/>
-              <w:jc w:val="right"/>
-              <w:pBdr>
-                <w:bottom w:val="none" w:sz="0" w:space="0" w:color="000000"/>
-                <w:top w:val="none" w:sz="0" w:space="0" w:color="000000"/>
-                <w:left w:val="none" w:sz="0" w:space="0" w:color="000000"/>
-                <w:right w:val="none" w:sz="0" w:space="0" w:color="000000"/>
-              </w:pBdr>
-              <w:spacing w:after="100" w:before="100" w:line="240"/>
-              <w:ind w:left="100" w:right="100" w:firstLine="0" w:firstLineChars="0"/>
+              <w:jc w:val="center"/>
+              <w:pBdr>
+                <w:bottom w:val="none" w:sz="0" w:space="0" w:color="000000"/>
+                <w:top w:val="none" w:sz="0" w:space="0" w:color="000000"/>
+                <w:left w:val="none" w:sz="0" w:space="0" w:color="000000"/>
+                <w:right w:val="none" w:sz="0" w:space="0" w:color="000000"/>
+              </w:pBdr>
+              <w:spacing w:after="60" w:before="60" w:line="240"/>
+              <w:ind w:left="60" w:right="60" w:firstLine="0" w:firstLineChars="0"/>
               <w:rPr>
                 <w:rFonts w:ascii="Helvetica" w:hAnsi="Helvetica" w:eastAsia="Helvetica" w:cs="Helvetica"/>
                 <w:i w:val="false"/>
@@ -1152,15 +1152,15 @@
           <w:p>
             <w:pPr>
               <w:pStyle w:val="Normal"/>
-              <w:jc w:val="right"/>
-              <w:pBdr>
-                <w:bottom w:val="none" w:sz="0" w:space="0" w:color="000000"/>
-                <w:top w:val="none" w:sz="0" w:space="0" w:color="000000"/>
-                <w:left w:val="none" w:sz="0" w:space="0" w:color="000000"/>
-                <w:right w:val="none" w:sz="0" w:space="0" w:color="000000"/>
-              </w:pBdr>
-              <w:spacing w:after="100" w:before="100" w:line="240"/>
-              <w:ind w:left="100" w:right="100" w:firstLine="0" w:firstLineChars="0"/>
+              <w:jc w:val="center"/>
+              <w:pBdr>
+                <w:bottom w:val="none" w:sz="0" w:space="0" w:color="000000"/>
+                <w:top w:val="none" w:sz="0" w:space="0" w:color="000000"/>
+                <w:left w:val="none" w:sz="0" w:space="0" w:color="000000"/>
+                <w:right w:val="none" w:sz="0" w:space="0" w:color="000000"/>
+              </w:pBdr>
+              <w:spacing w:after="60" w:before="60" w:line="240"/>
+              <w:ind w:left="60" w:right="60" w:firstLine="0" w:firstLineChars="0"/>
               <w:rPr>
                 <w:rFonts w:ascii="Helvetica" w:hAnsi="Helvetica" w:eastAsia="Helvetica" w:cs="Helvetica"/>
                 <w:i w:val="false"/>
@@ -1207,15 +1207,15 @@
           <w:p>
             <w:pPr>
               <w:pStyle w:val="Normal"/>
-              <w:jc w:val="right"/>
-              <w:pBdr>
-                <w:bottom w:val="none" w:sz="0" w:space="0" w:color="000000"/>
-                <w:top w:val="none" w:sz="0" w:space="0" w:color="000000"/>
-                <w:left w:val="none" w:sz="0" w:space="0" w:color="000000"/>
-                <w:right w:val="none" w:sz="0" w:space="0" w:color="000000"/>
-              </w:pBdr>
-              <w:spacing w:after="100" w:before="100" w:line="240"/>
-              <w:ind w:left="100" w:right="100" w:firstLine="0" w:firstLineChars="0"/>
+              <w:jc w:val="center"/>
+              <w:pBdr>
+                <w:bottom w:val="none" w:sz="0" w:space="0" w:color="000000"/>
+                <w:top w:val="none" w:sz="0" w:space="0" w:color="000000"/>
+                <w:left w:val="none" w:sz="0" w:space="0" w:color="000000"/>
+                <w:right w:val="none" w:sz="0" w:space="0" w:color="000000"/>
+              </w:pBdr>
+              <w:spacing w:after="60" w:before="60" w:line="240"/>
+              <w:ind w:left="60" w:right="60" w:firstLine="0" w:firstLineChars="0"/>
               <w:rPr>
                 <w:rFonts w:ascii="Helvetica" w:hAnsi="Helvetica" w:eastAsia="Helvetica" w:cs="Helvetica"/>
                 <w:i w:val="false"/>
@@ -1245,7 +1245,7 @@
       </w:tr>
       <w:tr>
         <w:trPr>
-          <w:trHeight w:val="617" w:hRule="auto"/>
+          <w:trHeight w:val="360" w:hRule="auto"/>
         </w:trPr>
         <w:tc>
           <w:tcPr>
@@ -1274,31 +1274,31 @@
                 <w:left w:val="none" w:sz="0" w:space="0" w:color="000000"/>
                 <w:right w:val="none" w:sz="0" w:space="0" w:color="000000"/>
               </w:pBdr>
-              <w:spacing w:after="100" w:before="100" w:line="240"/>
-              <w:ind w:left="100" w:right="100" w:firstLine="0" w:firstLineChars="0"/>
-              <w:rPr>
-                <w:rFonts w:ascii="Helvetica" w:hAnsi="Helvetica" w:eastAsia="Helvetica" w:cs="Helvetica"/>
-                <w:i w:val="false"/>
-                <w:b w:val="false"/>
-                <w:u w:val="none"/>
-                <w:strike w:val="false"/>
-                <w:sz w:val="18"/>
-                <w:szCs w:val="18"/>
-                <w:color w:val="000000"/>
-              </w:rPr>
-            </w:pPr>
-            <w:r>
-              <w:rPr>
-                <w:rFonts w:ascii="Helvetica" w:hAnsi="Helvetica" w:eastAsia="Helvetica" w:cs="Helvetica"/>
-                <w:i w:val="false"/>
-                <w:b w:val="false"/>
-                <w:u w:val="none"/>
-                <w:strike w:val="false"/>
-                <w:sz w:val="18"/>
-                <w:szCs w:val="18"/>
-                <w:color w:val="000000"/>
-              </w:rPr>
-              <w:t xml:space="preserve">MAP3K8_grp=MAP3K8-low</w:t>
+              <w:spacing w:after="60" w:before="60" w:line="240"/>
+              <w:ind w:left="60" w:right="60" w:firstLine="0" w:firstLineChars="0"/>
+              <w:rPr>
+                <w:rFonts w:ascii="Helvetica" w:hAnsi="Helvetica" w:eastAsia="Helvetica" w:cs="Helvetica"/>
+                <w:i w:val="false"/>
+                <w:b w:val="false"/>
+                <w:u w:val="none"/>
+                <w:strike w:val="false"/>
+                <w:sz w:val="18"/>
+                <w:szCs w:val="18"/>
+                <w:color w:val="000000"/>
+              </w:rPr>
+            </w:pPr>
+            <w:r>
+              <w:rPr>
+                <w:rFonts w:ascii="Helvetica" w:hAnsi="Helvetica" w:eastAsia="Helvetica" w:cs="Helvetica"/>
+                <w:i w:val="false"/>
+                <w:b w:val="false"/>
+                <w:u w:val="none"/>
+                <w:strike w:val="false"/>
+                <w:sz w:val="18"/>
+                <w:szCs w:val="18"/>
+                <w:color w:val="000000"/>
+              </w:rPr>
+              <w:t xml:space="preserve">MAP3K8-low</w:t>
             </w:r>
           </w:p>
         </w:tc>
@@ -1322,15 +1322,15 @@
           <w:p>
             <w:pPr>
               <w:pStyle w:val="Normal"/>
-              <w:jc w:val="right"/>
-              <w:pBdr>
-                <w:bottom w:val="none" w:sz="0" w:space="0" w:color="000000"/>
-                <w:top w:val="none" w:sz="0" w:space="0" w:color="000000"/>
-                <w:left w:val="none" w:sz="0" w:space="0" w:color="000000"/>
-                <w:right w:val="none" w:sz="0" w:space="0" w:color="000000"/>
-              </w:pBdr>
-              <w:spacing w:after="100" w:before="100" w:line="240"/>
-              <w:ind w:left="100" w:right="100" w:firstLine="0" w:firstLineChars="0"/>
+              <w:jc w:val="center"/>
+              <w:pBdr>
+                <w:bottom w:val="none" w:sz="0" w:space="0" w:color="000000"/>
+                <w:top w:val="none" w:sz="0" w:space="0" w:color="000000"/>
+                <w:left w:val="none" w:sz="0" w:space="0" w:color="000000"/>
+                <w:right w:val="none" w:sz="0" w:space="0" w:color="000000"/>
+              </w:pBdr>
+              <w:spacing w:after="60" w:before="60" w:line="240"/>
+              <w:ind w:left="60" w:right="60" w:firstLine="0" w:firstLineChars="0"/>
               <w:rPr>
                 <w:rFonts w:ascii="Helvetica" w:hAnsi="Helvetica" w:eastAsia="Helvetica" w:cs="Helvetica"/>
                 <w:i w:val="false"/>
@@ -1377,15 +1377,15 @@
           <w:p>
             <w:pPr>
               <w:pStyle w:val="Normal"/>
-              <w:jc w:val="right"/>
-              <w:pBdr>
-                <w:bottom w:val="none" w:sz="0" w:space="0" w:color="000000"/>
-                <w:top w:val="none" w:sz="0" w:space="0" w:color="000000"/>
-                <w:left w:val="none" w:sz="0" w:space="0" w:color="000000"/>
-                <w:right w:val="none" w:sz="0" w:space="0" w:color="000000"/>
-              </w:pBdr>
-              <w:spacing w:after="100" w:before="100" w:line="240"/>
-              <w:ind w:left="100" w:right="100" w:firstLine="0" w:firstLineChars="0"/>
+              <w:jc w:val="center"/>
+              <w:pBdr>
+                <w:bottom w:val="none" w:sz="0" w:space="0" w:color="000000"/>
+                <w:top w:val="none" w:sz="0" w:space="0" w:color="000000"/>
+                <w:left w:val="none" w:sz="0" w:space="0" w:color="000000"/>
+                <w:right w:val="none" w:sz="0" w:space="0" w:color="000000"/>
+              </w:pBdr>
+              <w:spacing w:after="60" w:before="60" w:line="240"/>
+              <w:ind w:left="60" w:right="60" w:firstLine="0" w:firstLineChars="0"/>
               <w:rPr>
                 <w:rFonts w:ascii="Helvetica" w:hAnsi="Helvetica" w:eastAsia="Helvetica" w:cs="Helvetica"/>
                 <w:i w:val="false"/>
@@ -1432,15 +1432,15 @@
           <w:p>
             <w:pPr>
               <w:pStyle w:val="Normal"/>
-              <w:jc w:val="right"/>
-              <w:pBdr>
-                <w:bottom w:val="none" w:sz="0" w:space="0" w:color="000000"/>
-                <w:top w:val="none" w:sz="0" w:space="0" w:color="000000"/>
-                <w:left w:val="none" w:sz="0" w:space="0" w:color="000000"/>
-                <w:right w:val="none" w:sz="0" w:space="0" w:color="000000"/>
-              </w:pBdr>
-              <w:spacing w:after="100" w:before="100" w:line="240"/>
-              <w:ind w:left="100" w:right="100" w:firstLine="0" w:firstLineChars="0"/>
+              <w:jc w:val="center"/>
+              <w:pBdr>
+                <w:bottom w:val="none" w:sz="0" w:space="0" w:color="000000"/>
+                <w:top w:val="none" w:sz="0" w:space="0" w:color="000000"/>
+                <w:left w:val="none" w:sz="0" w:space="0" w:color="000000"/>
+                <w:right w:val="none" w:sz="0" w:space="0" w:color="000000"/>
+              </w:pBdr>
+              <w:spacing w:after="60" w:before="60" w:line="240"/>
+              <w:ind w:left="60" w:right="60" w:firstLine="0" w:firstLineChars="0"/>
               <w:rPr>
                 <w:rFonts w:ascii="Helvetica" w:hAnsi="Helvetica" w:eastAsia="Helvetica" w:cs="Helvetica"/>
                 <w:i w:val="false"/>
@@ -1487,15 +1487,15 @@
           <w:p>
             <w:pPr>
               <w:pStyle w:val="Normal"/>
-              <w:jc w:val="right"/>
-              <w:pBdr>
-                <w:bottom w:val="none" w:sz="0" w:space="0" w:color="000000"/>
-                <w:top w:val="none" w:sz="0" w:space="0" w:color="000000"/>
-                <w:left w:val="none" w:sz="0" w:space="0" w:color="000000"/>
-                <w:right w:val="none" w:sz="0" w:space="0" w:color="000000"/>
-              </w:pBdr>
-              <w:spacing w:after="100" w:before="100" w:line="240"/>
-              <w:ind w:left="100" w:right="100" w:firstLine="0" w:firstLineChars="0"/>
+              <w:jc w:val="center"/>
+              <w:pBdr>
+                <w:bottom w:val="none" w:sz="0" w:space="0" w:color="000000"/>
+                <w:top w:val="none" w:sz="0" w:space="0" w:color="000000"/>
+                <w:left w:val="none" w:sz="0" w:space="0" w:color="000000"/>
+                <w:right w:val="none" w:sz="0" w:space="0" w:color="000000"/>
+              </w:pBdr>
+              <w:spacing w:after="60" w:before="60" w:line="240"/>
+              <w:ind w:left="60" w:right="60" w:firstLine="0" w:firstLineChars="0"/>
               <w:rPr>
                 <w:rFonts w:ascii="Helvetica" w:hAnsi="Helvetica" w:eastAsia="Helvetica" w:cs="Helvetica"/>
                 <w:i w:val="false"/>
@@ -1542,15 +1542,15 @@
           <w:p>
             <w:pPr>
               <w:pStyle w:val="Normal"/>
-              <w:jc w:val="right"/>
-              <w:pBdr>
-                <w:bottom w:val="none" w:sz="0" w:space="0" w:color="000000"/>
-                <w:top w:val="none" w:sz="0" w:space="0" w:color="000000"/>
-                <w:left w:val="none" w:sz="0" w:space="0" w:color="000000"/>
-                <w:right w:val="none" w:sz="0" w:space="0" w:color="000000"/>
-              </w:pBdr>
-              <w:spacing w:after="100" w:before="100" w:line="240"/>
-              <w:ind w:left="100" w:right="100" w:firstLine="0" w:firstLineChars="0"/>
+              <w:jc w:val="center"/>
+              <w:pBdr>
+                <w:bottom w:val="none" w:sz="0" w:space="0" w:color="000000"/>
+                <w:top w:val="none" w:sz="0" w:space="0" w:color="000000"/>
+                <w:left w:val="none" w:sz="0" w:space="0" w:color="000000"/>
+                <w:right w:val="none" w:sz="0" w:space="0" w:color="000000"/>
+              </w:pBdr>
+              <w:spacing w:after="60" w:before="60" w:line="240"/>
+              <w:ind w:left="60" w:right="60" w:firstLine="0" w:firstLineChars="0"/>
               <w:rPr>
                 <w:rFonts w:ascii="Helvetica" w:hAnsi="Helvetica" w:eastAsia="Helvetica" w:cs="Helvetica"/>
                 <w:i w:val="false"/>
@@ -1580,7 +1580,7 @@
       </w:tr>
       <w:tr>
         <w:trPr>
-          <w:trHeight w:val="618" w:hRule="auto"/>
+          <w:trHeight w:val="360" w:hRule="auto"/>
         </w:trPr>
         <w:tc>
           <w:tcPr>
@@ -1609,31 +1609,31 @@
                 <w:left w:val="none" w:sz="0" w:space="0" w:color="000000"/>
                 <w:right w:val="none" w:sz="0" w:space="0" w:color="000000"/>
               </w:pBdr>
-              <w:spacing w:after="100" w:before="100" w:line="240"/>
-              <w:ind w:left="100" w:right="100" w:firstLine="0" w:firstLineChars="0"/>
-              <w:rPr>
-                <w:rFonts w:ascii="Helvetica" w:hAnsi="Helvetica" w:eastAsia="Helvetica" w:cs="Helvetica"/>
-                <w:i w:val="false"/>
-                <w:b w:val="false"/>
-                <w:u w:val="none"/>
-                <w:strike w:val="false"/>
-                <w:sz w:val="18"/>
-                <w:szCs w:val="18"/>
-                <w:color w:val="000000"/>
-              </w:rPr>
-            </w:pPr>
-            <w:r>
-              <w:rPr>
-                <w:rFonts w:ascii="Helvetica" w:hAnsi="Helvetica" w:eastAsia="Helvetica" w:cs="Helvetica"/>
-                <w:i w:val="false"/>
-                <w:b w:val="false"/>
-                <w:u w:val="none"/>
-                <w:strike w:val="false"/>
-                <w:sz w:val="18"/>
-                <w:szCs w:val="18"/>
-                <w:color w:val="000000"/>
-              </w:rPr>
-              <w:t xml:space="preserve">MAP3K8_grp=MAP3K8-high</w:t>
+              <w:spacing w:after="60" w:before="60" w:line="240"/>
+              <w:ind w:left="60" w:right="60" w:firstLine="0" w:firstLineChars="0"/>
+              <w:rPr>
+                <w:rFonts w:ascii="Helvetica" w:hAnsi="Helvetica" w:eastAsia="Helvetica" w:cs="Helvetica"/>
+                <w:i w:val="false"/>
+                <w:b w:val="false"/>
+                <w:u w:val="none"/>
+                <w:strike w:val="false"/>
+                <w:sz w:val="18"/>
+                <w:szCs w:val="18"/>
+                <w:color w:val="000000"/>
+              </w:rPr>
+            </w:pPr>
+            <w:r>
+              <w:rPr>
+                <w:rFonts w:ascii="Helvetica" w:hAnsi="Helvetica" w:eastAsia="Helvetica" w:cs="Helvetica"/>
+                <w:i w:val="false"/>
+                <w:b w:val="false"/>
+                <w:u w:val="none"/>
+                <w:strike w:val="false"/>
+                <w:sz w:val="18"/>
+                <w:szCs w:val="18"/>
+                <w:color w:val="000000"/>
+              </w:rPr>
+              <w:t xml:space="preserve">MAP3K8-high</w:t>
             </w:r>
           </w:p>
         </w:tc>
@@ -1657,15 +1657,15 @@
           <w:p>
             <w:pPr>
               <w:pStyle w:val="Normal"/>
-              <w:jc w:val="right"/>
-              <w:pBdr>
-                <w:bottom w:val="none" w:sz="0" w:space="0" w:color="000000"/>
-                <w:top w:val="none" w:sz="0" w:space="0" w:color="000000"/>
-                <w:left w:val="none" w:sz="0" w:space="0" w:color="000000"/>
-                <w:right w:val="none" w:sz="0" w:space="0" w:color="000000"/>
-              </w:pBdr>
-              <w:spacing w:after="100" w:before="100" w:line="240"/>
-              <w:ind w:left="100" w:right="100" w:firstLine="0" w:firstLineChars="0"/>
+              <w:jc w:val="center"/>
+              <w:pBdr>
+                <w:bottom w:val="none" w:sz="0" w:space="0" w:color="000000"/>
+                <w:top w:val="none" w:sz="0" w:space="0" w:color="000000"/>
+                <w:left w:val="none" w:sz="0" w:space="0" w:color="000000"/>
+                <w:right w:val="none" w:sz="0" w:space="0" w:color="000000"/>
+              </w:pBdr>
+              <w:spacing w:after="60" w:before="60" w:line="240"/>
+              <w:ind w:left="60" w:right="60" w:firstLine="0" w:firstLineChars="0"/>
               <w:rPr>
                 <w:rFonts w:ascii="Helvetica" w:hAnsi="Helvetica" w:eastAsia="Helvetica" w:cs="Helvetica"/>
                 <w:i w:val="false"/>
@@ -1712,15 +1712,15 @@
           <w:p>
             <w:pPr>
               <w:pStyle w:val="Normal"/>
-              <w:jc w:val="right"/>
-              <w:pBdr>
-                <w:bottom w:val="none" w:sz="0" w:space="0" w:color="000000"/>
-                <w:top w:val="none" w:sz="0" w:space="0" w:color="000000"/>
-                <w:left w:val="none" w:sz="0" w:space="0" w:color="000000"/>
-                <w:right w:val="none" w:sz="0" w:space="0" w:color="000000"/>
-              </w:pBdr>
-              <w:spacing w:after="100" w:before="100" w:line="240"/>
-              <w:ind w:left="100" w:right="100" w:firstLine="0" w:firstLineChars="0"/>
+              <w:jc w:val="center"/>
+              <w:pBdr>
+                <w:bottom w:val="none" w:sz="0" w:space="0" w:color="000000"/>
+                <w:top w:val="none" w:sz="0" w:space="0" w:color="000000"/>
+                <w:left w:val="none" w:sz="0" w:space="0" w:color="000000"/>
+                <w:right w:val="none" w:sz="0" w:space="0" w:color="000000"/>
+              </w:pBdr>
+              <w:spacing w:after="60" w:before="60" w:line="240"/>
+              <w:ind w:left="60" w:right="60" w:firstLine="0" w:firstLineChars="0"/>
               <w:rPr>
                 <w:rFonts w:ascii="Helvetica" w:hAnsi="Helvetica" w:eastAsia="Helvetica" w:cs="Helvetica"/>
                 <w:i w:val="false"/>
@@ -1767,15 +1767,15 @@
           <w:p>
             <w:pPr>
               <w:pStyle w:val="Normal"/>
-              <w:jc w:val="right"/>
-              <w:pBdr>
-                <w:bottom w:val="none" w:sz="0" w:space="0" w:color="000000"/>
-                <w:top w:val="none" w:sz="0" w:space="0" w:color="000000"/>
-                <w:left w:val="none" w:sz="0" w:space="0" w:color="000000"/>
-                <w:right w:val="none" w:sz="0" w:space="0" w:color="000000"/>
-              </w:pBdr>
-              <w:spacing w:after="100" w:before="100" w:line="240"/>
-              <w:ind w:left="100" w:right="100" w:firstLine="0" w:firstLineChars="0"/>
+              <w:jc w:val="center"/>
+              <w:pBdr>
+                <w:bottom w:val="none" w:sz="0" w:space="0" w:color="000000"/>
+                <w:top w:val="none" w:sz="0" w:space="0" w:color="000000"/>
+                <w:left w:val="none" w:sz="0" w:space="0" w:color="000000"/>
+                <w:right w:val="none" w:sz="0" w:space="0" w:color="000000"/>
+              </w:pBdr>
+              <w:spacing w:after="60" w:before="60" w:line="240"/>
+              <w:ind w:left="60" w:right="60" w:firstLine="0" w:firstLineChars="0"/>
               <w:rPr>
                 <w:rFonts w:ascii="Helvetica" w:hAnsi="Helvetica" w:eastAsia="Helvetica" w:cs="Helvetica"/>
                 <w:i w:val="false"/>
@@ -1822,15 +1822,15 @@
           <w:p>
             <w:pPr>
               <w:pStyle w:val="Normal"/>
-              <w:jc w:val="right"/>
-              <w:pBdr>
-                <w:bottom w:val="none" w:sz="0" w:space="0" w:color="000000"/>
-                <w:top w:val="none" w:sz="0" w:space="0" w:color="000000"/>
-                <w:left w:val="none" w:sz="0" w:space="0" w:color="000000"/>
-                <w:right w:val="none" w:sz="0" w:space="0" w:color="000000"/>
-              </w:pBdr>
-              <w:spacing w:after="100" w:before="100" w:line="240"/>
-              <w:ind w:left="100" w:right="100" w:firstLine="0" w:firstLineChars="0"/>
+              <w:jc w:val="center"/>
+              <w:pBdr>
+                <w:bottom w:val="none" w:sz="0" w:space="0" w:color="000000"/>
+                <w:top w:val="none" w:sz="0" w:space="0" w:color="000000"/>
+                <w:left w:val="none" w:sz="0" w:space="0" w:color="000000"/>
+                <w:right w:val="none" w:sz="0" w:space="0" w:color="000000"/>
+              </w:pBdr>
+              <w:spacing w:after="60" w:before="60" w:line="240"/>
+              <w:ind w:left="60" w:right="60" w:firstLine="0" w:firstLineChars="0"/>
               <w:rPr>
                 <w:rFonts w:ascii="Helvetica" w:hAnsi="Helvetica" w:eastAsia="Helvetica" w:cs="Helvetica"/>
                 <w:i w:val="false"/>
@@ -1877,15 +1877,15 @@
           <w:p>
             <w:pPr>
               <w:pStyle w:val="Normal"/>
-              <w:jc w:val="right"/>
-              <w:pBdr>
-                <w:bottom w:val="none" w:sz="0" w:space="0" w:color="000000"/>
-                <w:top w:val="none" w:sz="0" w:space="0" w:color="000000"/>
-                <w:left w:val="none" w:sz="0" w:space="0" w:color="000000"/>
-                <w:right w:val="none" w:sz="0" w:space="0" w:color="000000"/>
-              </w:pBdr>
-              <w:spacing w:after="100" w:before="100" w:line="240"/>
-              <w:ind w:left="100" w:right="100" w:firstLine="0" w:firstLineChars="0"/>
+              <w:jc w:val="center"/>
+              <w:pBdr>
+                <w:bottom w:val="none" w:sz="0" w:space="0" w:color="000000"/>
+                <w:top w:val="none" w:sz="0" w:space="0" w:color="000000"/>
+                <w:left w:val="none" w:sz="0" w:space="0" w:color="000000"/>
+                <w:right w:val="none" w:sz="0" w:space="0" w:color="000000"/>
+              </w:pBdr>
+              <w:spacing w:after="60" w:before="60" w:line="240"/>
+              <w:ind w:left="60" w:right="60" w:firstLine="0" w:firstLineChars="0"/>
               <w:rPr>
                 <w:rFonts w:ascii="Helvetica" w:hAnsi="Helvetica" w:eastAsia="Helvetica" w:cs="Helvetica"/>
                 <w:i w:val="false"/>
@@ -1915,7 +1915,7 @@
       </w:tr>
       <w:tr>
         <w:trPr>
-          <w:trHeight w:val="618" w:hRule="auto"/>
+          <w:trHeight w:val="360" w:hRule="auto"/>
         </w:trPr>
         <w:tc>
           <w:tcPr>
@@ -1944,31 +1944,31 @@
                 <w:left w:val="none" w:sz="0" w:space="0" w:color="000000"/>
                 <w:right w:val="none" w:sz="0" w:space="0" w:color="000000"/>
               </w:pBdr>
-              <w:spacing w:after="100" w:before="100" w:line="240"/>
-              <w:ind w:left="100" w:right="100" w:firstLine="0" w:firstLineChars="0"/>
-              <w:rPr>
-                <w:rFonts w:ascii="Helvetica" w:hAnsi="Helvetica" w:eastAsia="Helvetica" w:cs="Helvetica"/>
-                <w:i w:val="false"/>
-                <w:b w:val="false"/>
-                <w:u w:val="none"/>
-                <w:strike w:val="false"/>
-                <w:sz w:val="18"/>
-                <w:szCs w:val="18"/>
-                <w:color w:val="000000"/>
-              </w:rPr>
-            </w:pPr>
-            <w:r>
-              <w:rPr>
-                <w:rFonts w:ascii="Helvetica" w:hAnsi="Helvetica" w:eastAsia="Helvetica" w:cs="Helvetica"/>
-                <w:i w:val="false"/>
-                <w:b w:val="false"/>
-                <w:u w:val="none"/>
-                <w:strike w:val="false"/>
-                <w:sz w:val="18"/>
-                <w:szCs w:val="18"/>
-                <w:color w:val="000000"/>
-              </w:rPr>
-              <w:t xml:space="preserve">MAP3K8_grp=MAP3K8-high</w:t>
+              <w:spacing w:after="60" w:before="60" w:line="240"/>
+              <w:ind w:left="60" w:right="60" w:firstLine="0" w:firstLineChars="0"/>
+              <w:rPr>
+                <w:rFonts w:ascii="Helvetica" w:hAnsi="Helvetica" w:eastAsia="Helvetica" w:cs="Helvetica"/>
+                <w:i w:val="false"/>
+                <w:b w:val="false"/>
+                <w:u w:val="none"/>
+                <w:strike w:val="false"/>
+                <w:sz w:val="18"/>
+                <w:szCs w:val="18"/>
+                <w:color w:val="000000"/>
+              </w:rPr>
+            </w:pPr>
+            <w:r>
+              <w:rPr>
+                <w:rFonts w:ascii="Helvetica" w:hAnsi="Helvetica" w:eastAsia="Helvetica" w:cs="Helvetica"/>
+                <w:i w:val="false"/>
+                <w:b w:val="false"/>
+                <w:u w:val="none"/>
+                <w:strike w:val="false"/>
+                <w:sz w:val="18"/>
+                <w:szCs w:val="18"/>
+                <w:color w:val="000000"/>
+              </w:rPr>
+              <w:t xml:space="preserve">MAP3K8-high</w:t>
             </w:r>
           </w:p>
         </w:tc>
@@ -1992,15 +1992,15 @@
           <w:p>
             <w:pPr>
               <w:pStyle w:val="Normal"/>
-              <w:jc w:val="right"/>
-              <w:pBdr>
-                <w:bottom w:val="none" w:sz="0" w:space="0" w:color="000000"/>
-                <w:top w:val="none" w:sz="0" w:space="0" w:color="000000"/>
-                <w:left w:val="none" w:sz="0" w:space="0" w:color="000000"/>
-                <w:right w:val="none" w:sz="0" w:space="0" w:color="000000"/>
-              </w:pBdr>
-              <w:spacing w:after="100" w:before="100" w:line="240"/>
-              <w:ind w:left="100" w:right="100" w:firstLine="0" w:firstLineChars="0"/>
+              <w:jc w:val="center"/>
+              <w:pBdr>
+                <w:bottom w:val="none" w:sz="0" w:space="0" w:color="000000"/>
+                <w:top w:val="none" w:sz="0" w:space="0" w:color="000000"/>
+                <w:left w:val="none" w:sz="0" w:space="0" w:color="000000"/>
+                <w:right w:val="none" w:sz="0" w:space="0" w:color="000000"/>
+              </w:pBdr>
+              <w:spacing w:after="60" w:before="60" w:line="240"/>
+              <w:ind w:left="60" w:right="60" w:firstLine="0" w:firstLineChars="0"/>
               <w:rPr>
                 <w:rFonts w:ascii="Helvetica" w:hAnsi="Helvetica" w:eastAsia="Helvetica" w:cs="Helvetica"/>
                 <w:i w:val="false"/>
@@ -2047,15 +2047,15 @@
           <w:p>
             <w:pPr>
               <w:pStyle w:val="Normal"/>
-              <w:jc w:val="right"/>
-              <w:pBdr>
-                <w:bottom w:val="none" w:sz="0" w:space="0" w:color="000000"/>
-                <w:top w:val="none" w:sz="0" w:space="0" w:color="000000"/>
-                <w:left w:val="none" w:sz="0" w:space="0" w:color="000000"/>
-                <w:right w:val="none" w:sz="0" w:space="0" w:color="000000"/>
-              </w:pBdr>
-              <w:spacing w:after="100" w:before="100" w:line="240"/>
-              <w:ind w:left="100" w:right="100" w:firstLine="0" w:firstLineChars="0"/>
+              <w:jc w:val="center"/>
+              <w:pBdr>
+                <w:bottom w:val="none" w:sz="0" w:space="0" w:color="000000"/>
+                <w:top w:val="none" w:sz="0" w:space="0" w:color="000000"/>
+                <w:left w:val="none" w:sz="0" w:space="0" w:color="000000"/>
+                <w:right w:val="none" w:sz="0" w:space="0" w:color="000000"/>
+              </w:pBdr>
+              <w:spacing w:after="60" w:before="60" w:line="240"/>
+              <w:ind w:left="60" w:right="60" w:firstLine="0" w:firstLineChars="0"/>
               <w:rPr>
                 <w:rFonts w:ascii="Helvetica" w:hAnsi="Helvetica" w:eastAsia="Helvetica" w:cs="Helvetica"/>
                 <w:i w:val="false"/>
@@ -2102,15 +2102,15 @@
           <w:p>
             <w:pPr>
               <w:pStyle w:val="Normal"/>
-              <w:jc w:val="right"/>
-              <w:pBdr>
-                <w:bottom w:val="none" w:sz="0" w:space="0" w:color="000000"/>
-                <w:top w:val="none" w:sz="0" w:space="0" w:color="000000"/>
-                <w:left w:val="none" w:sz="0" w:space="0" w:color="000000"/>
-                <w:right w:val="none" w:sz="0" w:space="0" w:color="000000"/>
-              </w:pBdr>
-              <w:spacing w:after="100" w:before="100" w:line="240"/>
-              <w:ind w:left="100" w:right="100" w:firstLine="0" w:firstLineChars="0"/>
+              <w:jc w:val="center"/>
+              <w:pBdr>
+                <w:bottom w:val="none" w:sz="0" w:space="0" w:color="000000"/>
+                <w:top w:val="none" w:sz="0" w:space="0" w:color="000000"/>
+                <w:left w:val="none" w:sz="0" w:space="0" w:color="000000"/>
+                <w:right w:val="none" w:sz="0" w:space="0" w:color="000000"/>
+              </w:pBdr>
+              <w:spacing w:after="60" w:before="60" w:line="240"/>
+              <w:ind w:left="60" w:right="60" w:firstLine="0" w:firstLineChars="0"/>
               <w:rPr>
                 <w:rFonts w:ascii="Helvetica" w:hAnsi="Helvetica" w:eastAsia="Helvetica" w:cs="Helvetica"/>
                 <w:i w:val="false"/>
@@ -2157,15 +2157,15 @@
           <w:p>
             <w:pPr>
               <w:pStyle w:val="Normal"/>
-              <w:jc w:val="right"/>
-              <w:pBdr>
-                <w:bottom w:val="none" w:sz="0" w:space="0" w:color="000000"/>
-                <w:top w:val="none" w:sz="0" w:space="0" w:color="000000"/>
-                <w:left w:val="none" w:sz="0" w:space="0" w:color="000000"/>
-                <w:right w:val="none" w:sz="0" w:space="0" w:color="000000"/>
-              </w:pBdr>
-              <w:spacing w:after="100" w:before="100" w:line="240"/>
-              <w:ind w:left="100" w:right="100" w:firstLine="0" w:firstLineChars="0"/>
+              <w:jc w:val="center"/>
+              <w:pBdr>
+                <w:bottom w:val="none" w:sz="0" w:space="0" w:color="000000"/>
+                <w:top w:val="none" w:sz="0" w:space="0" w:color="000000"/>
+                <w:left w:val="none" w:sz="0" w:space="0" w:color="000000"/>
+                <w:right w:val="none" w:sz="0" w:space="0" w:color="000000"/>
+              </w:pBdr>
+              <w:spacing w:after="60" w:before="60" w:line="240"/>
+              <w:ind w:left="60" w:right="60" w:firstLine="0" w:firstLineChars="0"/>
               <w:rPr>
                 <w:rFonts w:ascii="Helvetica" w:hAnsi="Helvetica" w:eastAsia="Helvetica" w:cs="Helvetica"/>
                 <w:i w:val="false"/>
@@ -2212,15 +2212,15 @@
           <w:p>
             <w:pPr>
               <w:pStyle w:val="Normal"/>
-              <w:jc w:val="right"/>
-              <w:pBdr>
-                <w:bottom w:val="none" w:sz="0" w:space="0" w:color="000000"/>
-                <w:top w:val="none" w:sz="0" w:space="0" w:color="000000"/>
-                <w:left w:val="none" w:sz="0" w:space="0" w:color="000000"/>
-                <w:right w:val="none" w:sz="0" w:space="0" w:color="000000"/>
-              </w:pBdr>
-              <w:spacing w:after="100" w:before="100" w:line="240"/>
-              <w:ind w:left="100" w:right="100" w:firstLine="0" w:firstLineChars="0"/>
+              <w:jc w:val="center"/>
+              <w:pBdr>
+                <w:bottom w:val="none" w:sz="0" w:space="0" w:color="000000"/>
+                <w:top w:val="none" w:sz="0" w:space="0" w:color="000000"/>
+                <w:left w:val="none" w:sz="0" w:space="0" w:color="000000"/>
+                <w:right w:val="none" w:sz="0" w:space="0" w:color="000000"/>
+              </w:pBdr>
+              <w:spacing w:after="60" w:before="60" w:line="240"/>
+              <w:ind w:left="60" w:right="60" w:firstLine="0" w:firstLineChars="0"/>
               <w:rPr>
                 <w:rFonts w:ascii="Helvetica" w:hAnsi="Helvetica" w:eastAsia="Helvetica" w:cs="Helvetica"/>
                 <w:i w:val="false"/>
@@ -2250,7 +2250,7 @@
       </w:tr>
       <w:tr>
         <w:trPr>
-          <w:trHeight w:val="618" w:hRule="auto"/>
+          <w:trHeight w:val="360" w:hRule="auto"/>
         </w:trPr>
         <w:tc>
           <w:tcPr>
@@ -2279,31 +2279,31 @@
                 <w:left w:val="none" w:sz="0" w:space="0" w:color="000000"/>
                 <w:right w:val="none" w:sz="0" w:space="0" w:color="000000"/>
               </w:pBdr>
-              <w:spacing w:after="100" w:before="100" w:line="240"/>
-              <w:ind w:left="100" w:right="100" w:firstLine="0" w:firstLineChars="0"/>
-              <w:rPr>
-                <w:rFonts w:ascii="Helvetica" w:hAnsi="Helvetica" w:eastAsia="Helvetica" w:cs="Helvetica"/>
-                <w:i w:val="false"/>
-                <w:b w:val="false"/>
-                <w:u w:val="none"/>
-                <w:strike w:val="false"/>
-                <w:sz w:val="18"/>
-                <w:szCs w:val="18"/>
-                <w:color w:val="000000"/>
-              </w:rPr>
-            </w:pPr>
-            <w:r>
-              <w:rPr>
-                <w:rFonts w:ascii="Helvetica" w:hAnsi="Helvetica" w:eastAsia="Helvetica" w:cs="Helvetica"/>
-                <w:i w:val="false"/>
-                <w:b w:val="false"/>
-                <w:u w:val="none"/>
-                <w:strike w:val="false"/>
-                <w:sz w:val="18"/>
-                <w:szCs w:val="18"/>
-                <w:color w:val="000000"/>
-              </w:rPr>
-              <w:t xml:space="preserve">MAP3K8_grp=MAP3K8-high</w:t>
+              <w:spacing w:after="60" w:before="60" w:line="240"/>
+              <w:ind w:left="60" w:right="60" w:firstLine="0" w:firstLineChars="0"/>
+              <w:rPr>
+                <w:rFonts w:ascii="Helvetica" w:hAnsi="Helvetica" w:eastAsia="Helvetica" w:cs="Helvetica"/>
+                <w:i w:val="false"/>
+                <w:b w:val="false"/>
+                <w:u w:val="none"/>
+                <w:strike w:val="false"/>
+                <w:sz w:val="18"/>
+                <w:szCs w:val="18"/>
+                <w:color w:val="000000"/>
+              </w:rPr>
+            </w:pPr>
+            <w:r>
+              <w:rPr>
+                <w:rFonts w:ascii="Helvetica" w:hAnsi="Helvetica" w:eastAsia="Helvetica" w:cs="Helvetica"/>
+                <w:i w:val="false"/>
+                <w:b w:val="false"/>
+                <w:u w:val="none"/>
+                <w:strike w:val="false"/>
+                <w:sz w:val="18"/>
+                <w:szCs w:val="18"/>
+                <w:color w:val="000000"/>
+              </w:rPr>
+              <w:t xml:space="preserve">MAP3K8-high</w:t>
             </w:r>
           </w:p>
         </w:tc>
@@ -2327,15 +2327,15 @@
           <w:p>
             <w:pPr>
               <w:pStyle w:val="Normal"/>
-              <w:jc w:val="right"/>
-              <w:pBdr>
-                <w:bottom w:val="none" w:sz="0" w:space="0" w:color="000000"/>
-                <w:top w:val="none" w:sz="0" w:space="0" w:color="000000"/>
-                <w:left w:val="none" w:sz="0" w:space="0" w:color="000000"/>
-                <w:right w:val="none" w:sz="0" w:space="0" w:color="000000"/>
-              </w:pBdr>
-              <w:spacing w:after="100" w:before="100" w:line="240"/>
-              <w:ind w:left="100" w:right="100" w:firstLine="0" w:firstLineChars="0"/>
+              <w:jc w:val="center"/>
+              <w:pBdr>
+                <w:bottom w:val="none" w:sz="0" w:space="0" w:color="000000"/>
+                <w:top w:val="none" w:sz="0" w:space="0" w:color="000000"/>
+                <w:left w:val="none" w:sz="0" w:space="0" w:color="000000"/>
+                <w:right w:val="none" w:sz="0" w:space="0" w:color="000000"/>
+              </w:pBdr>
+              <w:spacing w:after="60" w:before="60" w:line="240"/>
+              <w:ind w:left="60" w:right="60" w:firstLine="0" w:firstLineChars="0"/>
               <w:rPr>
                 <w:rFonts w:ascii="Helvetica" w:hAnsi="Helvetica" w:eastAsia="Helvetica" w:cs="Helvetica"/>
                 <w:i w:val="false"/>
@@ -2382,15 +2382,15 @@
           <w:p>
             <w:pPr>
               <w:pStyle w:val="Normal"/>
-              <w:jc w:val="right"/>
-              <w:pBdr>
-                <w:bottom w:val="none" w:sz="0" w:space="0" w:color="000000"/>
-                <w:top w:val="none" w:sz="0" w:space="0" w:color="000000"/>
-                <w:left w:val="none" w:sz="0" w:space="0" w:color="000000"/>
-                <w:right w:val="none" w:sz="0" w:space="0" w:color="000000"/>
-              </w:pBdr>
-              <w:spacing w:after="100" w:before="100" w:line="240"/>
-              <w:ind w:left="100" w:right="100" w:firstLine="0" w:firstLineChars="0"/>
+              <w:jc w:val="center"/>
+              <w:pBdr>
+                <w:bottom w:val="none" w:sz="0" w:space="0" w:color="000000"/>
+                <w:top w:val="none" w:sz="0" w:space="0" w:color="000000"/>
+                <w:left w:val="none" w:sz="0" w:space="0" w:color="000000"/>
+                <w:right w:val="none" w:sz="0" w:space="0" w:color="000000"/>
+              </w:pBdr>
+              <w:spacing w:after="60" w:before="60" w:line="240"/>
+              <w:ind w:left="60" w:right="60" w:firstLine="0" w:firstLineChars="0"/>
               <w:rPr>
                 <w:rFonts w:ascii="Helvetica" w:hAnsi="Helvetica" w:eastAsia="Helvetica" w:cs="Helvetica"/>
                 <w:i w:val="false"/>
@@ -2437,15 +2437,15 @@
           <w:p>
             <w:pPr>
               <w:pStyle w:val="Normal"/>
-              <w:jc w:val="right"/>
-              <w:pBdr>
-                <w:bottom w:val="none" w:sz="0" w:space="0" w:color="000000"/>
-                <w:top w:val="none" w:sz="0" w:space="0" w:color="000000"/>
-                <w:left w:val="none" w:sz="0" w:space="0" w:color="000000"/>
-                <w:right w:val="none" w:sz="0" w:space="0" w:color="000000"/>
-              </w:pBdr>
-              <w:spacing w:after="100" w:before="100" w:line="240"/>
-              <w:ind w:left="100" w:right="100" w:firstLine="0" w:firstLineChars="0"/>
+              <w:jc w:val="center"/>
+              <w:pBdr>
+                <w:bottom w:val="none" w:sz="0" w:space="0" w:color="000000"/>
+                <w:top w:val="none" w:sz="0" w:space="0" w:color="000000"/>
+                <w:left w:val="none" w:sz="0" w:space="0" w:color="000000"/>
+                <w:right w:val="none" w:sz="0" w:space="0" w:color="000000"/>
+              </w:pBdr>
+              <w:spacing w:after="60" w:before="60" w:line="240"/>
+              <w:ind w:left="60" w:right="60" w:firstLine="0" w:firstLineChars="0"/>
               <w:rPr>
                 <w:rFonts w:ascii="Helvetica" w:hAnsi="Helvetica" w:eastAsia="Helvetica" w:cs="Helvetica"/>
                 <w:i w:val="false"/>
@@ -2492,15 +2492,15 @@
           <w:p>
             <w:pPr>
               <w:pStyle w:val="Normal"/>
-              <w:jc w:val="right"/>
-              <w:pBdr>
-                <w:bottom w:val="none" w:sz="0" w:space="0" w:color="000000"/>
-                <w:top w:val="none" w:sz="0" w:space="0" w:color="000000"/>
-                <w:left w:val="none" w:sz="0" w:space="0" w:color="000000"/>
-                <w:right w:val="none" w:sz="0" w:space="0" w:color="000000"/>
-              </w:pBdr>
-              <w:spacing w:after="100" w:before="100" w:line="240"/>
-              <w:ind w:left="100" w:right="100" w:firstLine="0" w:firstLineChars="0"/>
+              <w:jc w:val="center"/>
+              <w:pBdr>
+                <w:bottom w:val="none" w:sz="0" w:space="0" w:color="000000"/>
+                <w:top w:val="none" w:sz="0" w:space="0" w:color="000000"/>
+                <w:left w:val="none" w:sz="0" w:space="0" w:color="000000"/>
+                <w:right w:val="none" w:sz="0" w:space="0" w:color="000000"/>
+              </w:pBdr>
+              <w:spacing w:after="60" w:before="60" w:line="240"/>
+              <w:ind w:left="60" w:right="60" w:firstLine="0" w:firstLineChars="0"/>
               <w:rPr>
                 <w:rFonts w:ascii="Helvetica" w:hAnsi="Helvetica" w:eastAsia="Helvetica" w:cs="Helvetica"/>
                 <w:i w:val="false"/>
@@ -2547,15 +2547,15 @@
           <w:p>
             <w:pPr>
               <w:pStyle w:val="Normal"/>
-              <w:jc w:val="right"/>
-              <w:pBdr>
-                <w:bottom w:val="none" w:sz="0" w:space="0" w:color="000000"/>
-                <w:top w:val="none" w:sz="0" w:space="0" w:color="000000"/>
-                <w:left w:val="none" w:sz="0" w:space="0" w:color="000000"/>
-                <w:right w:val="none" w:sz="0" w:space="0" w:color="000000"/>
-              </w:pBdr>
-              <w:spacing w:after="100" w:before="100" w:line="240"/>
-              <w:ind w:left="100" w:right="100" w:firstLine="0" w:firstLineChars="0"/>
+              <w:jc w:val="center"/>
+              <w:pBdr>
+                <w:bottom w:val="none" w:sz="0" w:space="0" w:color="000000"/>
+                <w:top w:val="none" w:sz="0" w:space="0" w:color="000000"/>
+                <w:left w:val="none" w:sz="0" w:space="0" w:color="000000"/>
+                <w:right w:val="none" w:sz="0" w:space="0" w:color="000000"/>
+              </w:pBdr>
+              <w:spacing w:after="60" w:before="60" w:line="240"/>
+              <w:ind w:left="60" w:right="60" w:firstLine="0" w:firstLineChars="0"/>
               <w:rPr>
                 <w:rFonts w:ascii="Helvetica" w:hAnsi="Helvetica" w:eastAsia="Helvetica" w:cs="Helvetica"/>
                 <w:i w:val="false"/>
@@ -2621,7 +2621,7 @@
         <w:pStyle w:val="Normal"/>
       </w:pPr>
       <w:r>
-        <w:t xml:space="preserve">Is the MAP3K8 effect explained by the strongest known prognostic factor in this cohort — the Residual Cancer Burden (RCB) class — or does MAP3K8 carry additional, independent information? If the MAP3K8 association with relapse is just a downstream consequence of MAP3K8-high tumours having worse initial chemoresponse, the effect should disappear once RCB is in the model. If MAP3K8 carries chemoresistance information independent of how the tumour visibly responded, the effect should persist.</w:t>
+        <w:t xml:space="preserve">Is the MAP3K8 effect explained by the strongest known prognostic factor in this cohort - the Residual Cancer Burden (RCB) class - or does MAP3K8 carry additional, independent information? If the MAP3K8 association with relapse is just a downstream consequence of MAP3K8-high tumours having worse initial chemoresponse, the effect should disappear once RCB is in the model. If MAP3K8 carries chemoresistance information independent of how the tumour visibly responded, the effect should persist.</w:t>
       </w:r>
     </w:p>
     <w:p>
@@ -2645,7 +2645,7 @@
         <w:pStyle w:val="Titre3"/>
       </w:pPr>
       <w:r>
-        <w:t xml:space="preserve">Result — full Cox table.</w:t>
+        <w:t xml:space="preserve">Result - full Cox table.</w:t>
       </w:r>
     </w:p>
     <w:tbl xmlns:a="http://schemas.openxmlformats.org/drawingml/2006/main" xmlns:pic="http://schemas.openxmlformats.org/drawingml/2006/picture">
@@ -2655,15 +2655,15 @@
         <w:tblLook w:firstRow="1" w:lastRow="0" w:firstColumn="0" w:lastColumn="0" w:noHBand="0" w:noVBand="1"/>
       </w:tblPr>
       <w:tblGrid>
-        <w:gridCol w:w="3077"/>
-        <w:gridCol w:w="961"/>
-        <w:gridCol w:w="1084"/>
-        <w:gridCol w:w="1095"/>
-        <w:gridCol w:w="1328"/>
+        <w:gridCol w:w="3456"/>
+        <w:gridCol w:w="1296"/>
+        <w:gridCol w:w="1440"/>
+        <w:gridCol w:w="1440"/>
+        <w:gridCol w:w="1296"/>
       </w:tblGrid>
       <w:tr>
         <w:trPr>
-          <w:trHeight w:val="577" w:hRule="auto"/>
+          <w:trHeight w:val="360" w:hRule="auto"/>
           <w:tblHeader/>
         </w:trPr>
         <w:tc>
@@ -2693,8 +2693,8 @@
                 <w:left w:val="none" w:sz="0" w:space="0" w:color="000000"/>
                 <w:right w:val="none" w:sz="0" w:space="0" w:color="000000"/>
               </w:pBdr>
-              <w:spacing w:after="100" w:before="100" w:line="240"/>
-              <w:ind w:left="100" w:right="100" w:firstLine="0" w:firstLineChars="0"/>
+              <w:spacing w:after="60" w:before="60" w:line="240"/>
+              <w:ind w:left="60" w:right="60" w:firstLine="0" w:firstLineChars="0"/>
               <w:rPr>
                 <w:rFonts w:ascii="Helvetica" w:hAnsi="Helvetica" w:eastAsia="Helvetica" w:cs="Helvetica"/>
                 <w:i w:val="false"/>
@@ -2717,7 +2717,7 @@
                 <w:szCs w:val="18"/>
                 <w:color w:val="000000"/>
               </w:rPr>
-              <w:t xml:space="preserve">term</w:t>
+              <w:t xml:space="preserve">Term</w:t>
             </w:r>
           </w:p>
         </w:tc>
@@ -2741,15 +2741,15 @@
           <w:p>
             <w:pPr>
               <w:pStyle w:val="Normal"/>
-              <w:jc w:val="right"/>
-              <w:pBdr>
-                <w:bottom w:val="none" w:sz="0" w:space="0" w:color="000000"/>
-                <w:top w:val="none" w:sz="0" w:space="0" w:color="000000"/>
-                <w:left w:val="none" w:sz="0" w:space="0" w:color="000000"/>
-                <w:right w:val="none" w:sz="0" w:space="0" w:color="000000"/>
-              </w:pBdr>
-              <w:spacing w:after="100" w:before="100" w:line="240"/>
-              <w:ind w:left="100" w:right="100" w:firstLine="0" w:firstLineChars="0"/>
+              <w:jc w:val="left"/>
+              <w:pBdr>
+                <w:bottom w:val="none" w:sz="0" w:space="0" w:color="000000"/>
+                <w:top w:val="none" w:sz="0" w:space="0" w:color="000000"/>
+                <w:left w:val="none" w:sz="0" w:space="0" w:color="000000"/>
+                <w:right w:val="none" w:sz="0" w:space="0" w:color="000000"/>
+              </w:pBdr>
+              <w:spacing w:after="60" w:before="60" w:line="240"/>
+              <w:ind w:left="60" w:right="60" w:firstLine="0" w:firstLineChars="0"/>
               <w:rPr>
                 <w:rFonts w:ascii="Helvetica" w:hAnsi="Helvetica" w:eastAsia="Helvetica" w:cs="Helvetica"/>
                 <w:i w:val="false"/>
@@ -2796,15 +2796,15 @@
           <w:p>
             <w:pPr>
               <w:pStyle w:val="Normal"/>
-              <w:jc w:val="right"/>
-              <w:pBdr>
-                <w:bottom w:val="none" w:sz="0" w:space="0" w:color="000000"/>
-                <w:top w:val="none" w:sz="0" w:space="0" w:color="000000"/>
-                <w:left w:val="none" w:sz="0" w:space="0" w:color="000000"/>
-                <w:right w:val="none" w:sz="0" w:space="0" w:color="000000"/>
-              </w:pBdr>
-              <w:spacing w:after="100" w:before="100" w:line="240"/>
-              <w:ind w:left="100" w:right="100" w:firstLine="0" w:firstLineChars="0"/>
+              <w:jc w:val="left"/>
+              <w:pBdr>
+                <w:bottom w:val="none" w:sz="0" w:space="0" w:color="000000"/>
+                <w:top w:val="none" w:sz="0" w:space="0" w:color="000000"/>
+                <w:left w:val="none" w:sz="0" w:space="0" w:color="000000"/>
+                <w:right w:val="none" w:sz="0" w:space="0" w:color="000000"/>
+              </w:pBdr>
+              <w:spacing w:after="60" w:before="60" w:line="240"/>
+              <w:ind w:left="60" w:right="60" w:firstLine="0" w:firstLineChars="0"/>
               <w:rPr>
                 <w:rFonts w:ascii="Helvetica" w:hAnsi="Helvetica" w:eastAsia="Helvetica" w:cs="Helvetica"/>
                 <w:i w:val="false"/>
@@ -2827,7 +2827,7 @@
                 <w:szCs w:val="18"/>
                 <w:color w:val="000000"/>
               </w:rPr>
-              <w:t xml:space="preserve">LCL95</w:t>
+              <w:t xml:space="preserve">95% LCL</w:t>
             </w:r>
           </w:p>
         </w:tc>
@@ -2851,15 +2851,15 @@
           <w:p>
             <w:pPr>
               <w:pStyle w:val="Normal"/>
-              <w:jc w:val="right"/>
-              <w:pBdr>
-                <w:bottom w:val="none" w:sz="0" w:space="0" w:color="000000"/>
-                <w:top w:val="none" w:sz="0" w:space="0" w:color="000000"/>
-                <w:left w:val="none" w:sz="0" w:space="0" w:color="000000"/>
-                <w:right w:val="none" w:sz="0" w:space="0" w:color="000000"/>
-              </w:pBdr>
-              <w:spacing w:after="100" w:before="100" w:line="240"/>
-              <w:ind w:left="100" w:right="100" w:firstLine="0" w:firstLineChars="0"/>
+              <w:jc w:val="left"/>
+              <w:pBdr>
+                <w:bottom w:val="none" w:sz="0" w:space="0" w:color="000000"/>
+                <w:top w:val="none" w:sz="0" w:space="0" w:color="000000"/>
+                <w:left w:val="none" w:sz="0" w:space="0" w:color="000000"/>
+                <w:right w:val="none" w:sz="0" w:space="0" w:color="000000"/>
+              </w:pBdr>
+              <w:spacing w:after="60" w:before="60" w:line="240"/>
+              <w:ind w:left="60" w:right="60" w:firstLine="0" w:firstLineChars="0"/>
               <w:rPr>
                 <w:rFonts w:ascii="Helvetica" w:hAnsi="Helvetica" w:eastAsia="Helvetica" w:cs="Helvetica"/>
                 <w:i w:val="false"/>
@@ -2882,7 +2882,7 @@
                 <w:szCs w:val="18"/>
                 <w:color w:val="000000"/>
               </w:rPr>
-              <w:t xml:space="preserve">UCL95</w:t>
+              <w:t xml:space="preserve">95% UCL</w:t>
             </w:r>
           </w:p>
         </w:tc>
@@ -2906,15 +2906,15 @@
           <w:p>
             <w:pPr>
               <w:pStyle w:val="Normal"/>
-              <w:jc w:val="right"/>
-              <w:pBdr>
-                <w:bottom w:val="none" w:sz="0" w:space="0" w:color="000000"/>
-                <w:top w:val="none" w:sz="0" w:space="0" w:color="000000"/>
-                <w:left w:val="none" w:sz="0" w:space="0" w:color="000000"/>
-                <w:right w:val="none" w:sz="0" w:space="0" w:color="000000"/>
-              </w:pBdr>
-              <w:spacing w:after="100" w:before="100" w:line="240"/>
-              <w:ind w:left="100" w:right="100" w:firstLine="0" w:firstLineChars="0"/>
+              <w:jc w:val="left"/>
+              <w:pBdr>
+                <w:bottom w:val="none" w:sz="0" w:space="0" w:color="000000"/>
+                <w:top w:val="none" w:sz="0" w:space="0" w:color="000000"/>
+                <w:left w:val="none" w:sz="0" w:space="0" w:color="000000"/>
+                <w:right w:val="none" w:sz="0" w:space="0" w:color="000000"/>
+              </w:pBdr>
+              <w:spacing w:after="60" w:before="60" w:line="240"/>
+              <w:ind w:left="60" w:right="60" w:firstLine="0" w:firstLineChars="0"/>
               <w:rPr>
                 <w:rFonts w:ascii="Helvetica" w:hAnsi="Helvetica" w:eastAsia="Helvetica" w:cs="Helvetica"/>
                 <w:i w:val="false"/>
@@ -2937,14 +2937,14 @@
                 <w:szCs w:val="18"/>
                 <w:color w:val="000000"/>
               </w:rPr>
-              <w:t xml:space="preserve">p</w:t>
+              <w:t xml:space="preserve">P</w:t>
             </w:r>
           </w:p>
         </w:tc>
       </w:tr>
       <w:tr>
         <w:trPr>
-          <w:trHeight w:val="618" w:hRule="auto"/>
+          <w:trHeight w:val="360" w:hRule="auto"/>
         </w:trPr>
         <w:tc>
           <w:tcPr>
@@ -2973,31 +2973,31 @@
                 <w:left w:val="none" w:sz="0" w:space="0" w:color="000000"/>
                 <w:right w:val="none" w:sz="0" w:space="0" w:color="000000"/>
               </w:pBdr>
-              <w:spacing w:after="100" w:before="100" w:line="240"/>
-              <w:ind w:left="100" w:right="100" w:firstLine="0" w:firstLineChars="0"/>
-              <w:rPr>
-                <w:rFonts w:ascii="Helvetica" w:hAnsi="Helvetica" w:eastAsia="Helvetica" w:cs="Helvetica"/>
-                <w:i w:val="false"/>
-                <w:b w:val="false"/>
-                <w:u w:val="none"/>
-                <w:strike w:val="false"/>
-                <w:sz w:val="18"/>
-                <w:szCs w:val="18"/>
-                <w:color w:val="000000"/>
-              </w:rPr>
-            </w:pPr>
-            <w:r>
-              <w:rPr>
-                <w:rFonts w:ascii="Helvetica" w:hAnsi="Helvetica" w:eastAsia="Helvetica" w:cs="Helvetica"/>
-                <w:i w:val="false"/>
-                <w:b w:val="false"/>
-                <w:u w:val="none"/>
-                <w:strike w:val="false"/>
-                <w:sz w:val="18"/>
-                <w:szCs w:val="18"/>
-                <w:color w:val="000000"/>
-              </w:rPr>
-              <w:t xml:space="preserve">MAP3K8_grpMAP3K8-high</w:t>
+              <w:spacing w:after="60" w:before="60" w:line="240"/>
+              <w:ind w:left="60" w:right="60" w:firstLine="0" w:firstLineChars="0"/>
+              <w:rPr>
+                <w:rFonts w:ascii="Helvetica" w:hAnsi="Helvetica" w:eastAsia="Helvetica" w:cs="Helvetica"/>
+                <w:i w:val="false"/>
+                <w:b w:val="false"/>
+                <w:u w:val="none"/>
+                <w:strike w:val="false"/>
+                <w:sz w:val="18"/>
+                <w:szCs w:val="18"/>
+                <w:color w:val="000000"/>
+              </w:rPr>
+            </w:pPr>
+            <w:r>
+              <w:rPr>
+                <w:rFonts w:ascii="Helvetica" w:hAnsi="Helvetica" w:eastAsia="Helvetica" w:cs="Helvetica"/>
+                <w:i w:val="false"/>
+                <w:b w:val="false"/>
+                <w:u w:val="none"/>
+                <w:strike w:val="false"/>
+                <w:sz w:val="18"/>
+                <w:szCs w:val="18"/>
+                <w:color w:val="000000"/>
+              </w:rPr>
+              <w:t xml:space="preserve">MAP3K8: high</w:t>
             </w:r>
           </w:p>
         </w:tc>
@@ -3021,15 +3021,15 @@
           <w:p>
             <w:pPr>
               <w:pStyle w:val="Normal"/>
-              <w:jc w:val="right"/>
-              <w:pBdr>
-                <w:bottom w:val="none" w:sz="0" w:space="0" w:color="000000"/>
-                <w:top w:val="none" w:sz="0" w:space="0" w:color="000000"/>
-                <w:left w:val="none" w:sz="0" w:space="0" w:color="000000"/>
-                <w:right w:val="none" w:sz="0" w:space="0" w:color="000000"/>
-              </w:pBdr>
-              <w:spacing w:after="100" w:before="100" w:line="240"/>
-              <w:ind w:left="100" w:right="100" w:firstLine="0" w:firstLineChars="0"/>
+              <w:jc w:val="center"/>
+              <w:pBdr>
+                <w:bottom w:val="none" w:sz="0" w:space="0" w:color="000000"/>
+                <w:top w:val="none" w:sz="0" w:space="0" w:color="000000"/>
+                <w:left w:val="none" w:sz="0" w:space="0" w:color="000000"/>
+                <w:right w:val="none" w:sz="0" w:space="0" w:color="000000"/>
+              </w:pBdr>
+              <w:spacing w:after="60" w:before="60" w:line="240"/>
+              <w:ind w:left="60" w:right="60" w:firstLine="0" w:firstLineChars="0"/>
               <w:rPr>
                 <w:rFonts w:ascii="Helvetica" w:hAnsi="Helvetica" w:eastAsia="Helvetica" w:cs="Helvetica"/>
                 <w:i w:val="false"/>
@@ -3076,15 +3076,15 @@
           <w:p>
             <w:pPr>
               <w:pStyle w:val="Normal"/>
-              <w:jc w:val="right"/>
-              <w:pBdr>
-                <w:bottom w:val="none" w:sz="0" w:space="0" w:color="000000"/>
-                <w:top w:val="none" w:sz="0" w:space="0" w:color="000000"/>
-                <w:left w:val="none" w:sz="0" w:space="0" w:color="000000"/>
-                <w:right w:val="none" w:sz="0" w:space="0" w:color="000000"/>
-              </w:pBdr>
-              <w:spacing w:after="100" w:before="100" w:line="240"/>
-              <w:ind w:left="100" w:right="100" w:firstLine="0" w:firstLineChars="0"/>
+              <w:jc w:val="center"/>
+              <w:pBdr>
+                <w:bottom w:val="none" w:sz="0" w:space="0" w:color="000000"/>
+                <w:top w:val="none" w:sz="0" w:space="0" w:color="000000"/>
+                <w:left w:val="none" w:sz="0" w:space="0" w:color="000000"/>
+                <w:right w:val="none" w:sz="0" w:space="0" w:color="000000"/>
+              </w:pBdr>
+              <w:spacing w:after="60" w:before="60" w:line="240"/>
+              <w:ind w:left="60" w:right="60" w:firstLine="0" w:firstLineChars="0"/>
               <w:rPr>
                 <w:rFonts w:ascii="Helvetica" w:hAnsi="Helvetica" w:eastAsia="Helvetica" w:cs="Helvetica"/>
                 <w:i w:val="false"/>
@@ -3131,15 +3131,15 @@
           <w:p>
             <w:pPr>
               <w:pStyle w:val="Normal"/>
-              <w:jc w:val="right"/>
-              <w:pBdr>
-                <w:bottom w:val="none" w:sz="0" w:space="0" w:color="000000"/>
-                <w:top w:val="none" w:sz="0" w:space="0" w:color="000000"/>
-                <w:left w:val="none" w:sz="0" w:space="0" w:color="000000"/>
-                <w:right w:val="none" w:sz="0" w:space="0" w:color="000000"/>
-              </w:pBdr>
-              <w:spacing w:after="100" w:before="100" w:line="240"/>
-              <w:ind w:left="100" w:right="100" w:firstLine="0" w:firstLineChars="0"/>
+              <w:jc w:val="center"/>
+              <w:pBdr>
+                <w:bottom w:val="none" w:sz="0" w:space="0" w:color="000000"/>
+                <w:top w:val="none" w:sz="0" w:space="0" w:color="000000"/>
+                <w:left w:val="none" w:sz="0" w:space="0" w:color="000000"/>
+                <w:right w:val="none" w:sz="0" w:space="0" w:color="000000"/>
+              </w:pBdr>
+              <w:spacing w:after="60" w:before="60" w:line="240"/>
+              <w:ind w:left="60" w:right="60" w:firstLine="0" w:firstLineChars="0"/>
               <w:rPr>
                 <w:rFonts w:ascii="Helvetica" w:hAnsi="Helvetica" w:eastAsia="Helvetica" w:cs="Helvetica"/>
                 <w:i w:val="false"/>
@@ -3186,15 +3186,15 @@
           <w:p>
             <w:pPr>
               <w:pStyle w:val="Normal"/>
-              <w:jc w:val="right"/>
-              <w:pBdr>
-                <w:bottom w:val="none" w:sz="0" w:space="0" w:color="000000"/>
-                <w:top w:val="none" w:sz="0" w:space="0" w:color="000000"/>
-                <w:left w:val="none" w:sz="0" w:space="0" w:color="000000"/>
-                <w:right w:val="none" w:sz="0" w:space="0" w:color="000000"/>
-              </w:pBdr>
-              <w:spacing w:after="100" w:before="100" w:line="240"/>
-              <w:ind w:left="100" w:right="100" w:firstLine="0" w:firstLineChars="0"/>
+              <w:jc w:val="center"/>
+              <w:pBdr>
+                <w:bottom w:val="none" w:sz="0" w:space="0" w:color="000000"/>
+                <w:top w:val="none" w:sz="0" w:space="0" w:color="000000"/>
+                <w:left w:val="none" w:sz="0" w:space="0" w:color="000000"/>
+                <w:right w:val="none" w:sz="0" w:space="0" w:color="000000"/>
+              </w:pBdr>
+              <w:spacing w:after="60" w:before="60" w:line="240"/>
+              <w:ind w:left="60" w:right="60" w:firstLine="0" w:firstLineChars="0"/>
               <w:rPr>
                 <w:rFonts w:ascii="Helvetica" w:hAnsi="Helvetica" w:eastAsia="Helvetica" w:cs="Helvetica"/>
                 <w:i w:val="false"/>
@@ -3224,7 +3224,7 @@
       </w:tr>
       <w:tr>
         <w:trPr>
-          <w:trHeight w:val="577" w:hRule="auto"/>
+          <w:trHeight w:val="360" w:hRule="auto"/>
         </w:trPr>
         <w:tc>
           <w:tcPr>
@@ -3253,31 +3253,31 @@
                 <w:left w:val="none" w:sz="0" w:space="0" w:color="000000"/>
                 <w:right w:val="none" w:sz="0" w:space="0" w:color="000000"/>
               </w:pBdr>
-              <w:spacing w:after="100" w:before="100" w:line="240"/>
-              <w:ind w:left="100" w:right="100" w:firstLine="0" w:firstLineChars="0"/>
-              <w:rPr>
-                <w:rFonts w:ascii="Helvetica" w:hAnsi="Helvetica" w:eastAsia="Helvetica" w:cs="Helvetica"/>
-                <w:i w:val="false"/>
-                <w:b w:val="false"/>
-                <w:u w:val="none"/>
-                <w:strike w:val="false"/>
-                <w:sz w:val="18"/>
-                <w:szCs w:val="18"/>
-                <w:color w:val="000000"/>
-              </w:rPr>
-            </w:pPr>
-            <w:r>
-              <w:rPr>
-                <w:rFonts w:ascii="Helvetica" w:hAnsi="Helvetica" w:eastAsia="Helvetica" w:cs="Helvetica"/>
-                <w:i w:val="false"/>
-                <w:b w:val="false"/>
-                <w:u w:val="none"/>
-                <w:strike w:val="false"/>
-                <w:sz w:val="18"/>
-                <w:szCs w:val="18"/>
-                <w:color w:val="000000"/>
-              </w:rPr>
-              <w:t xml:space="preserve">age</w:t>
+              <w:spacing w:after="60" w:before="60" w:line="240"/>
+              <w:ind w:left="60" w:right="60" w:firstLine="0" w:firstLineChars="0"/>
+              <w:rPr>
+                <w:rFonts w:ascii="Helvetica" w:hAnsi="Helvetica" w:eastAsia="Helvetica" w:cs="Helvetica"/>
+                <w:i w:val="false"/>
+                <w:b w:val="false"/>
+                <w:u w:val="none"/>
+                <w:strike w:val="false"/>
+                <w:sz w:val="18"/>
+                <w:szCs w:val="18"/>
+                <w:color w:val="000000"/>
+              </w:rPr>
+            </w:pPr>
+            <w:r>
+              <w:rPr>
+                <w:rFonts w:ascii="Helvetica" w:hAnsi="Helvetica" w:eastAsia="Helvetica" w:cs="Helvetica"/>
+                <w:i w:val="false"/>
+                <w:b w:val="false"/>
+                <w:u w:val="none"/>
+                <w:strike w:val="false"/>
+                <w:sz w:val="18"/>
+                <w:szCs w:val="18"/>
+                <w:color w:val="000000"/>
+              </w:rPr>
+              <w:t xml:space="preserve">Age (years)</w:t>
             </w:r>
           </w:p>
         </w:tc>
@@ -3301,15 +3301,15 @@
           <w:p>
             <w:pPr>
               <w:pStyle w:val="Normal"/>
-              <w:jc w:val="right"/>
-              <w:pBdr>
-                <w:bottom w:val="none" w:sz="0" w:space="0" w:color="000000"/>
-                <w:top w:val="none" w:sz="0" w:space="0" w:color="000000"/>
-                <w:left w:val="none" w:sz="0" w:space="0" w:color="000000"/>
-                <w:right w:val="none" w:sz="0" w:space="0" w:color="000000"/>
-              </w:pBdr>
-              <w:spacing w:after="100" w:before="100" w:line="240"/>
-              <w:ind w:left="100" w:right="100" w:firstLine="0" w:firstLineChars="0"/>
+              <w:jc w:val="center"/>
+              <w:pBdr>
+                <w:bottom w:val="none" w:sz="0" w:space="0" w:color="000000"/>
+                <w:top w:val="none" w:sz="0" w:space="0" w:color="000000"/>
+                <w:left w:val="none" w:sz="0" w:space="0" w:color="000000"/>
+                <w:right w:val="none" w:sz="0" w:space="0" w:color="000000"/>
+              </w:pBdr>
+              <w:spacing w:after="60" w:before="60" w:line="240"/>
+              <w:ind w:left="60" w:right="60" w:firstLine="0" w:firstLineChars="0"/>
               <w:rPr>
                 <w:rFonts w:ascii="Helvetica" w:hAnsi="Helvetica" w:eastAsia="Helvetica" w:cs="Helvetica"/>
                 <w:i w:val="false"/>
@@ -3356,15 +3356,15 @@
           <w:p>
             <w:pPr>
               <w:pStyle w:val="Normal"/>
-              <w:jc w:val="right"/>
-              <w:pBdr>
-                <w:bottom w:val="none" w:sz="0" w:space="0" w:color="000000"/>
-                <w:top w:val="none" w:sz="0" w:space="0" w:color="000000"/>
-                <w:left w:val="none" w:sz="0" w:space="0" w:color="000000"/>
-                <w:right w:val="none" w:sz="0" w:space="0" w:color="000000"/>
-              </w:pBdr>
-              <w:spacing w:after="100" w:before="100" w:line="240"/>
-              <w:ind w:left="100" w:right="100" w:firstLine="0" w:firstLineChars="0"/>
+              <w:jc w:val="center"/>
+              <w:pBdr>
+                <w:bottom w:val="none" w:sz="0" w:space="0" w:color="000000"/>
+                <w:top w:val="none" w:sz="0" w:space="0" w:color="000000"/>
+                <w:left w:val="none" w:sz="0" w:space="0" w:color="000000"/>
+                <w:right w:val="none" w:sz="0" w:space="0" w:color="000000"/>
+              </w:pBdr>
+              <w:spacing w:after="60" w:before="60" w:line="240"/>
+              <w:ind w:left="60" w:right="60" w:firstLine="0" w:firstLineChars="0"/>
               <w:rPr>
                 <w:rFonts w:ascii="Helvetica" w:hAnsi="Helvetica" w:eastAsia="Helvetica" w:cs="Helvetica"/>
                 <w:i w:val="false"/>
@@ -3411,15 +3411,15 @@
           <w:p>
             <w:pPr>
               <w:pStyle w:val="Normal"/>
-              <w:jc w:val="right"/>
-              <w:pBdr>
-                <w:bottom w:val="none" w:sz="0" w:space="0" w:color="000000"/>
-                <w:top w:val="none" w:sz="0" w:space="0" w:color="000000"/>
-                <w:left w:val="none" w:sz="0" w:space="0" w:color="000000"/>
-                <w:right w:val="none" w:sz="0" w:space="0" w:color="000000"/>
-              </w:pBdr>
-              <w:spacing w:after="100" w:before="100" w:line="240"/>
-              <w:ind w:left="100" w:right="100" w:firstLine="0" w:firstLineChars="0"/>
+              <w:jc w:val="center"/>
+              <w:pBdr>
+                <w:bottom w:val="none" w:sz="0" w:space="0" w:color="000000"/>
+                <w:top w:val="none" w:sz="0" w:space="0" w:color="000000"/>
+                <w:left w:val="none" w:sz="0" w:space="0" w:color="000000"/>
+                <w:right w:val="none" w:sz="0" w:space="0" w:color="000000"/>
+              </w:pBdr>
+              <w:spacing w:after="60" w:before="60" w:line="240"/>
+              <w:ind w:left="60" w:right="60" w:firstLine="0" w:firstLineChars="0"/>
               <w:rPr>
                 <w:rFonts w:ascii="Helvetica" w:hAnsi="Helvetica" w:eastAsia="Helvetica" w:cs="Helvetica"/>
                 <w:i w:val="false"/>
@@ -3466,15 +3466,15 @@
           <w:p>
             <w:pPr>
               <w:pStyle w:val="Normal"/>
-              <w:jc w:val="right"/>
-              <w:pBdr>
-                <w:bottom w:val="none" w:sz="0" w:space="0" w:color="000000"/>
-                <w:top w:val="none" w:sz="0" w:space="0" w:color="000000"/>
-                <w:left w:val="none" w:sz="0" w:space="0" w:color="000000"/>
-                <w:right w:val="none" w:sz="0" w:space="0" w:color="000000"/>
-              </w:pBdr>
-              <w:spacing w:after="100" w:before="100" w:line="240"/>
-              <w:ind w:left="100" w:right="100" w:firstLine="0" w:firstLineChars="0"/>
+              <w:jc w:val="center"/>
+              <w:pBdr>
+                <w:bottom w:val="none" w:sz="0" w:space="0" w:color="000000"/>
+                <w:top w:val="none" w:sz="0" w:space="0" w:color="000000"/>
+                <w:left w:val="none" w:sz="0" w:space="0" w:color="000000"/>
+                <w:right w:val="none" w:sz="0" w:space="0" w:color="000000"/>
+              </w:pBdr>
+              <w:spacing w:after="60" w:before="60" w:line="240"/>
+              <w:ind w:left="60" w:right="60" w:firstLine="0" w:firstLineChars="0"/>
               <w:rPr>
                 <w:rFonts w:ascii="Helvetica" w:hAnsi="Helvetica" w:eastAsia="Helvetica" w:cs="Helvetica"/>
                 <w:i w:val="false"/>
@@ -3504,7 +3504,7 @@
       </w:tr>
       <w:tr>
         <w:trPr>
-          <w:trHeight w:val="617" w:hRule="auto"/>
+          <w:trHeight w:val="360" w:hRule="auto"/>
         </w:trPr>
         <w:tc>
           <w:tcPr>
@@ -3533,31 +3533,31 @@
                 <w:left w:val="none" w:sz="0" w:space="0" w:color="000000"/>
                 <w:right w:val="none" w:sz="0" w:space="0" w:color="000000"/>
               </w:pBdr>
-              <w:spacing w:after="100" w:before="100" w:line="240"/>
-              <w:ind w:left="100" w:right="100" w:firstLine="0" w:firstLineChars="0"/>
-              <w:rPr>
-                <w:rFonts w:ascii="Helvetica" w:hAnsi="Helvetica" w:eastAsia="Helvetica" w:cs="Helvetica"/>
-                <w:i w:val="false"/>
-                <w:b w:val="false"/>
-                <w:u w:val="none"/>
-                <w:strike w:val="false"/>
-                <w:sz w:val="18"/>
-                <w:szCs w:val="18"/>
-                <w:color w:val="000000"/>
-              </w:rPr>
-            </w:pPr>
-            <w:r>
-              <w:rPr>
-                <w:rFonts w:ascii="Helvetica" w:hAnsi="Helvetica" w:eastAsia="Helvetica" w:cs="Helvetica"/>
-                <w:i w:val="false"/>
-                <w:b w:val="false"/>
-                <w:u w:val="none"/>
-                <w:strike w:val="false"/>
-                <w:sz w:val="18"/>
-                <w:szCs w:val="18"/>
-                <w:color w:val="000000"/>
-              </w:rPr>
-              <w:t xml:space="preserve">stageIIA</w:t>
+              <w:spacing w:after="60" w:before="60" w:line="240"/>
+              <w:ind w:left="60" w:right="60" w:firstLine="0" w:firstLineChars="0"/>
+              <w:rPr>
+                <w:rFonts w:ascii="Helvetica" w:hAnsi="Helvetica" w:eastAsia="Helvetica" w:cs="Helvetica"/>
+                <w:i w:val="false"/>
+                <w:b w:val="false"/>
+                <w:u w:val="none"/>
+                <w:strike w:val="false"/>
+                <w:sz w:val="18"/>
+                <w:szCs w:val="18"/>
+                <w:color w:val="000000"/>
+              </w:rPr>
+            </w:pPr>
+            <w:r>
+              <w:rPr>
+                <w:rFonts w:ascii="Helvetica" w:hAnsi="Helvetica" w:eastAsia="Helvetica" w:cs="Helvetica"/>
+                <w:i w:val="false"/>
+                <w:b w:val="false"/>
+                <w:u w:val="none"/>
+                <w:strike w:val="false"/>
+                <w:sz w:val="18"/>
+                <w:szCs w:val="18"/>
+                <w:color w:val="000000"/>
+              </w:rPr>
+              <w:t xml:space="preserve">Stage IIA</w:t>
             </w:r>
           </w:p>
         </w:tc>
@@ -3581,15 +3581,15 @@
           <w:p>
             <w:pPr>
               <w:pStyle w:val="Normal"/>
-              <w:jc w:val="right"/>
-              <w:pBdr>
-                <w:bottom w:val="none" w:sz="0" w:space="0" w:color="000000"/>
-                <w:top w:val="none" w:sz="0" w:space="0" w:color="000000"/>
-                <w:left w:val="none" w:sz="0" w:space="0" w:color="000000"/>
-                <w:right w:val="none" w:sz="0" w:space="0" w:color="000000"/>
-              </w:pBdr>
-              <w:spacing w:after="100" w:before="100" w:line="240"/>
-              <w:ind w:left="100" w:right="100" w:firstLine="0" w:firstLineChars="0"/>
+              <w:jc w:val="center"/>
+              <w:pBdr>
+                <w:bottom w:val="none" w:sz="0" w:space="0" w:color="000000"/>
+                <w:top w:val="none" w:sz="0" w:space="0" w:color="000000"/>
+                <w:left w:val="none" w:sz="0" w:space="0" w:color="000000"/>
+                <w:right w:val="none" w:sz="0" w:space="0" w:color="000000"/>
+              </w:pBdr>
+              <w:spacing w:after="60" w:before="60" w:line="240"/>
+              <w:ind w:left="60" w:right="60" w:firstLine="0" w:firstLineChars="0"/>
               <w:rPr>
                 <w:rFonts w:ascii="Helvetica" w:hAnsi="Helvetica" w:eastAsia="Helvetica" w:cs="Helvetica"/>
                 <w:i w:val="false"/>
@@ -3636,15 +3636,15 @@
           <w:p>
             <w:pPr>
               <w:pStyle w:val="Normal"/>
-              <w:jc w:val="right"/>
-              <w:pBdr>
-                <w:bottom w:val="none" w:sz="0" w:space="0" w:color="000000"/>
-                <w:top w:val="none" w:sz="0" w:space="0" w:color="000000"/>
-                <w:left w:val="none" w:sz="0" w:space="0" w:color="000000"/>
-                <w:right w:val="none" w:sz="0" w:space="0" w:color="000000"/>
-              </w:pBdr>
-              <w:spacing w:after="100" w:before="100" w:line="240"/>
-              <w:ind w:left="100" w:right="100" w:firstLine="0" w:firstLineChars="0"/>
+              <w:jc w:val="center"/>
+              <w:pBdr>
+                <w:bottom w:val="none" w:sz="0" w:space="0" w:color="000000"/>
+                <w:top w:val="none" w:sz="0" w:space="0" w:color="000000"/>
+                <w:left w:val="none" w:sz="0" w:space="0" w:color="000000"/>
+                <w:right w:val="none" w:sz="0" w:space="0" w:color="000000"/>
+              </w:pBdr>
+              <w:spacing w:after="60" w:before="60" w:line="240"/>
+              <w:ind w:left="60" w:right="60" w:firstLine="0" w:firstLineChars="0"/>
               <w:rPr>
                 <w:rFonts w:ascii="Helvetica" w:hAnsi="Helvetica" w:eastAsia="Helvetica" w:cs="Helvetica"/>
                 <w:i w:val="false"/>
@@ -3691,15 +3691,15 @@
           <w:p>
             <w:pPr>
               <w:pStyle w:val="Normal"/>
-              <w:jc w:val="right"/>
-              <w:pBdr>
-                <w:bottom w:val="none" w:sz="0" w:space="0" w:color="000000"/>
-                <w:top w:val="none" w:sz="0" w:space="0" w:color="000000"/>
-                <w:left w:val="none" w:sz="0" w:space="0" w:color="000000"/>
-                <w:right w:val="none" w:sz="0" w:space="0" w:color="000000"/>
-              </w:pBdr>
-              <w:spacing w:after="100" w:before="100" w:line="240"/>
-              <w:ind w:left="100" w:right="100" w:firstLine="0" w:firstLineChars="0"/>
+              <w:jc w:val="center"/>
+              <w:pBdr>
+                <w:bottom w:val="none" w:sz="0" w:space="0" w:color="000000"/>
+                <w:top w:val="none" w:sz="0" w:space="0" w:color="000000"/>
+                <w:left w:val="none" w:sz="0" w:space="0" w:color="000000"/>
+                <w:right w:val="none" w:sz="0" w:space="0" w:color="000000"/>
+              </w:pBdr>
+              <w:spacing w:after="60" w:before="60" w:line="240"/>
+              <w:ind w:left="60" w:right="60" w:firstLine="0" w:firstLineChars="0"/>
               <w:rPr>
                 <w:rFonts w:ascii="Helvetica" w:hAnsi="Helvetica" w:eastAsia="Helvetica" w:cs="Helvetica"/>
                 <w:i w:val="false"/>
@@ -3746,15 +3746,15 @@
           <w:p>
             <w:pPr>
               <w:pStyle w:val="Normal"/>
-              <w:jc w:val="right"/>
-              <w:pBdr>
-                <w:bottom w:val="none" w:sz="0" w:space="0" w:color="000000"/>
-                <w:top w:val="none" w:sz="0" w:space="0" w:color="000000"/>
-                <w:left w:val="none" w:sz="0" w:space="0" w:color="000000"/>
-                <w:right w:val="none" w:sz="0" w:space="0" w:color="000000"/>
-              </w:pBdr>
-              <w:spacing w:after="100" w:before="100" w:line="240"/>
-              <w:ind w:left="100" w:right="100" w:firstLine="0" w:firstLineChars="0"/>
+              <w:jc w:val="center"/>
+              <w:pBdr>
+                <w:bottom w:val="none" w:sz="0" w:space="0" w:color="000000"/>
+                <w:top w:val="none" w:sz="0" w:space="0" w:color="000000"/>
+                <w:left w:val="none" w:sz="0" w:space="0" w:color="000000"/>
+                <w:right w:val="none" w:sz="0" w:space="0" w:color="000000"/>
+              </w:pBdr>
+              <w:spacing w:after="60" w:before="60" w:line="240"/>
+              <w:ind w:left="60" w:right="60" w:firstLine="0" w:firstLineChars="0"/>
               <w:rPr>
                 <w:rFonts w:ascii="Helvetica" w:hAnsi="Helvetica" w:eastAsia="Helvetica" w:cs="Helvetica"/>
                 <w:i w:val="false"/>
@@ -3784,7 +3784,7 @@
       </w:tr>
       <w:tr>
         <w:trPr>
-          <w:trHeight w:val="617" w:hRule="auto"/>
+          <w:trHeight w:val="360" w:hRule="auto"/>
         </w:trPr>
         <w:tc>
           <w:tcPr>
@@ -3813,31 +3813,31 @@
                 <w:left w:val="none" w:sz="0" w:space="0" w:color="000000"/>
                 <w:right w:val="none" w:sz="0" w:space="0" w:color="000000"/>
               </w:pBdr>
-              <w:spacing w:after="100" w:before="100" w:line="240"/>
-              <w:ind w:left="100" w:right="100" w:firstLine="0" w:firstLineChars="0"/>
-              <w:rPr>
-                <w:rFonts w:ascii="Helvetica" w:hAnsi="Helvetica" w:eastAsia="Helvetica" w:cs="Helvetica"/>
-                <w:i w:val="false"/>
-                <w:b w:val="false"/>
-                <w:u w:val="none"/>
-                <w:strike w:val="false"/>
-                <w:sz w:val="18"/>
-                <w:szCs w:val="18"/>
-                <w:color w:val="000000"/>
-              </w:rPr>
-            </w:pPr>
-            <w:r>
-              <w:rPr>
-                <w:rFonts w:ascii="Helvetica" w:hAnsi="Helvetica" w:eastAsia="Helvetica" w:cs="Helvetica"/>
-                <w:i w:val="false"/>
-                <w:b w:val="false"/>
-                <w:u w:val="none"/>
-                <w:strike w:val="false"/>
-                <w:sz w:val="18"/>
-                <w:szCs w:val="18"/>
-                <w:color w:val="000000"/>
-              </w:rPr>
-              <w:t xml:space="preserve">stageIIB</w:t>
+              <w:spacing w:after="60" w:before="60" w:line="240"/>
+              <w:ind w:left="60" w:right="60" w:firstLine="0" w:firstLineChars="0"/>
+              <w:rPr>
+                <w:rFonts w:ascii="Helvetica" w:hAnsi="Helvetica" w:eastAsia="Helvetica" w:cs="Helvetica"/>
+                <w:i w:val="false"/>
+                <w:b w:val="false"/>
+                <w:u w:val="none"/>
+                <w:strike w:val="false"/>
+                <w:sz w:val="18"/>
+                <w:szCs w:val="18"/>
+                <w:color w:val="000000"/>
+              </w:rPr>
+            </w:pPr>
+            <w:r>
+              <w:rPr>
+                <w:rFonts w:ascii="Helvetica" w:hAnsi="Helvetica" w:eastAsia="Helvetica" w:cs="Helvetica"/>
+                <w:i w:val="false"/>
+                <w:b w:val="false"/>
+                <w:u w:val="none"/>
+                <w:strike w:val="false"/>
+                <w:sz w:val="18"/>
+                <w:szCs w:val="18"/>
+                <w:color w:val="000000"/>
+              </w:rPr>
+              <w:t xml:space="preserve">Stage IIB</w:t>
             </w:r>
           </w:p>
         </w:tc>
@@ -3861,15 +3861,15 @@
           <w:p>
             <w:pPr>
               <w:pStyle w:val="Normal"/>
-              <w:jc w:val="right"/>
-              <w:pBdr>
-                <w:bottom w:val="none" w:sz="0" w:space="0" w:color="000000"/>
-                <w:top w:val="none" w:sz="0" w:space="0" w:color="000000"/>
-                <w:left w:val="none" w:sz="0" w:space="0" w:color="000000"/>
-                <w:right w:val="none" w:sz="0" w:space="0" w:color="000000"/>
-              </w:pBdr>
-              <w:spacing w:after="100" w:before="100" w:line="240"/>
-              <w:ind w:left="100" w:right="100" w:firstLine="0" w:firstLineChars="0"/>
+              <w:jc w:val="center"/>
+              <w:pBdr>
+                <w:bottom w:val="none" w:sz="0" w:space="0" w:color="000000"/>
+                <w:top w:val="none" w:sz="0" w:space="0" w:color="000000"/>
+                <w:left w:val="none" w:sz="0" w:space="0" w:color="000000"/>
+                <w:right w:val="none" w:sz="0" w:space="0" w:color="000000"/>
+              </w:pBdr>
+              <w:spacing w:after="60" w:before="60" w:line="240"/>
+              <w:ind w:left="60" w:right="60" w:firstLine="0" w:firstLineChars="0"/>
               <w:rPr>
                 <w:rFonts w:ascii="Helvetica" w:hAnsi="Helvetica" w:eastAsia="Helvetica" w:cs="Helvetica"/>
                 <w:i w:val="false"/>
@@ -3916,15 +3916,15 @@
           <w:p>
             <w:pPr>
               <w:pStyle w:val="Normal"/>
-              <w:jc w:val="right"/>
-              <w:pBdr>
-                <w:bottom w:val="none" w:sz="0" w:space="0" w:color="000000"/>
-                <w:top w:val="none" w:sz="0" w:space="0" w:color="000000"/>
-                <w:left w:val="none" w:sz="0" w:space="0" w:color="000000"/>
-                <w:right w:val="none" w:sz="0" w:space="0" w:color="000000"/>
-              </w:pBdr>
-              <w:spacing w:after="100" w:before="100" w:line="240"/>
-              <w:ind w:left="100" w:right="100" w:firstLine="0" w:firstLineChars="0"/>
+              <w:jc w:val="center"/>
+              <w:pBdr>
+                <w:bottom w:val="none" w:sz="0" w:space="0" w:color="000000"/>
+                <w:top w:val="none" w:sz="0" w:space="0" w:color="000000"/>
+                <w:left w:val="none" w:sz="0" w:space="0" w:color="000000"/>
+                <w:right w:val="none" w:sz="0" w:space="0" w:color="000000"/>
+              </w:pBdr>
+              <w:spacing w:after="60" w:before="60" w:line="240"/>
+              <w:ind w:left="60" w:right="60" w:firstLine="0" w:firstLineChars="0"/>
               <w:rPr>
                 <w:rFonts w:ascii="Helvetica" w:hAnsi="Helvetica" w:eastAsia="Helvetica" w:cs="Helvetica"/>
                 <w:i w:val="false"/>
@@ -3971,15 +3971,15 @@
           <w:p>
             <w:pPr>
               <w:pStyle w:val="Normal"/>
-              <w:jc w:val="right"/>
-              <w:pBdr>
-                <w:bottom w:val="none" w:sz="0" w:space="0" w:color="000000"/>
-                <w:top w:val="none" w:sz="0" w:space="0" w:color="000000"/>
-                <w:left w:val="none" w:sz="0" w:space="0" w:color="000000"/>
-                <w:right w:val="none" w:sz="0" w:space="0" w:color="000000"/>
-              </w:pBdr>
-              <w:spacing w:after="100" w:before="100" w:line="240"/>
-              <w:ind w:left="100" w:right="100" w:firstLine="0" w:firstLineChars="0"/>
+              <w:jc w:val="center"/>
+              <w:pBdr>
+                <w:bottom w:val="none" w:sz="0" w:space="0" w:color="000000"/>
+                <w:top w:val="none" w:sz="0" w:space="0" w:color="000000"/>
+                <w:left w:val="none" w:sz="0" w:space="0" w:color="000000"/>
+                <w:right w:val="none" w:sz="0" w:space="0" w:color="000000"/>
+              </w:pBdr>
+              <w:spacing w:after="60" w:before="60" w:line="240"/>
+              <w:ind w:left="60" w:right="60" w:firstLine="0" w:firstLineChars="0"/>
               <w:rPr>
                 <w:rFonts w:ascii="Helvetica" w:hAnsi="Helvetica" w:eastAsia="Helvetica" w:cs="Helvetica"/>
                 <w:i w:val="false"/>
@@ -4026,15 +4026,15 @@
           <w:p>
             <w:pPr>
               <w:pStyle w:val="Normal"/>
-              <w:jc w:val="right"/>
-              <w:pBdr>
-                <w:bottom w:val="none" w:sz="0" w:space="0" w:color="000000"/>
-                <w:top w:val="none" w:sz="0" w:space="0" w:color="000000"/>
-                <w:left w:val="none" w:sz="0" w:space="0" w:color="000000"/>
-                <w:right w:val="none" w:sz="0" w:space="0" w:color="000000"/>
-              </w:pBdr>
-              <w:spacing w:after="100" w:before="100" w:line="240"/>
-              <w:ind w:left="100" w:right="100" w:firstLine="0" w:firstLineChars="0"/>
+              <w:jc w:val="center"/>
+              <w:pBdr>
+                <w:bottom w:val="none" w:sz="0" w:space="0" w:color="000000"/>
+                <w:top w:val="none" w:sz="0" w:space="0" w:color="000000"/>
+                <w:left w:val="none" w:sz="0" w:space="0" w:color="000000"/>
+                <w:right w:val="none" w:sz="0" w:space="0" w:color="000000"/>
+              </w:pBdr>
+              <w:spacing w:after="60" w:before="60" w:line="240"/>
+              <w:ind w:left="60" w:right="60" w:firstLine="0" w:firstLineChars="0"/>
               <w:rPr>
                 <w:rFonts w:ascii="Helvetica" w:hAnsi="Helvetica" w:eastAsia="Helvetica" w:cs="Helvetica"/>
                 <w:i w:val="false"/>
@@ -4064,7 +4064,7 @@
       </w:tr>
       <w:tr>
         <w:trPr>
-          <w:trHeight w:val="617" w:hRule="auto"/>
+          <w:trHeight w:val="360" w:hRule="auto"/>
         </w:trPr>
         <w:tc>
           <w:tcPr>
@@ -4093,31 +4093,31 @@
                 <w:left w:val="none" w:sz="0" w:space="0" w:color="000000"/>
                 <w:right w:val="none" w:sz="0" w:space="0" w:color="000000"/>
               </w:pBdr>
-              <w:spacing w:after="100" w:before="100" w:line="240"/>
-              <w:ind w:left="100" w:right="100" w:firstLine="0" w:firstLineChars="0"/>
-              <w:rPr>
-                <w:rFonts w:ascii="Helvetica" w:hAnsi="Helvetica" w:eastAsia="Helvetica" w:cs="Helvetica"/>
-                <w:i w:val="false"/>
-                <w:b w:val="false"/>
-                <w:u w:val="none"/>
-                <w:strike w:val="false"/>
-                <w:sz w:val="18"/>
-                <w:szCs w:val="18"/>
-                <w:color w:val="000000"/>
-              </w:rPr>
-            </w:pPr>
-            <w:r>
-              <w:rPr>
-                <w:rFonts w:ascii="Helvetica" w:hAnsi="Helvetica" w:eastAsia="Helvetica" w:cs="Helvetica"/>
-                <w:i w:val="false"/>
-                <w:b w:val="false"/>
-                <w:u w:val="none"/>
-                <w:strike w:val="false"/>
-                <w:sz w:val="18"/>
-                <w:szCs w:val="18"/>
-                <w:color w:val="000000"/>
-              </w:rPr>
-              <w:t xml:space="preserve">stageIIIA</w:t>
+              <w:spacing w:after="60" w:before="60" w:line="240"/>
+              <w:ind w:left="60" w:right="60" w:firstLine="0" w:firstLineChars="0"/>
+              <w:rPr>
+                <w:rFonts w:ascii="Helvetica" w:hAnsi="Helvetica" w:eastAsia="Helvetica" w:cs="Helvetica"/>
+                <w:i w:val="false"/>
+                <w:b w:val="false"/>
+                <w:u w:val="none"/>
+                <w:strike w:val="false"/>
+                <w:sz w:val="18"/>
+                <w:szCs w:val="18"/>
+                <w:color w:val="000000"/>
+              </w:rPr>
+            </w:pPr>
+            <w:r>
+              <w:rPr>
+                <w:rFonts w:ascii="Helvetica" w:hAnsi="Helvetica" w:eastAsia="Helvetica" w:cs="Helvetica"/>
+                <w:i w:val="false"/>
+                <w:b w:val="false"/>
+                <w:u w:val="none"/>
+                <w:strike w:val="false"/>
+                <w:sz w:val="18"/>
+                <w:szCs w:val="18"/>
+                <w:color w:val="000000"/>
+              </w:rPr>
+              <w:t xml:space="preserve">Stage IIIA</w:t>
             </w:r>
           </w:p>
         </w:tc>
@@ -4141,15 +4141,15 @@
           <w:p>
             <w:pPr>
               <w:pStyle w:val="Normal"/>
-              <w:jc w:val="right"/>
-              <w:pBdr>
-                <w:bottom w:val="none" w:sz="0" w:space="0" w:color="000000"/>
-                <w:top w:val="none" w:sz="0" w:space="0" w:color="000000"/>
-                <w:left w:val="none" w:sz="0" w:space="0" w:color="000000"/>
-                <w:right w:val="none" w:sz="0" w:space="0" w:color="000000"/>
-              </w:pBdr>
-              <w:spacing w:after="100" w:before="100" w:line="240"/>
-              <w:ind w:left="100" w:right="100" w:firstLine="0" w:firstLineChars="0"/>
+              <w:jc w:val="center"/>
+              <w:pBdr>
+                <w:bottom w:val="none" w:sz="0" w:space="0" w:color="000000"/>
+                <w:top w:val="none" w:sz="0" w:space="0" w:color="000000"/>
+                <w:left w:val="none" w:sz="0" w:space="0" w:color="000000"/>
+                <w:right w:val="none" w:sz="0" w:space="0" w:color="000000"/>
+              </w:pBdr>
+              <w:spacing w:after="60" w:before="60" w:line="240"/>
+              <w:ind w:left="60" w:right="60" w:firstLine="0" w:firstLineChars="0"/>
               <w:rPr>
                 <w:rFonts w:ascii="Helvetica" w:hAnsi="Helvetica" w:eastAsia="Helvetica" w:cs="Helvetica"/>
                 <w:i w:val="false"/>
@@ -4196,15 +4196,15 @@
           <w:p>
             <w:pPr>
               <w:pStyle w:val="Normal"/>
-              <w:jc w:val="right"/>
-              <w:pBdr>
-                <w:bottom w:val="none" w:sz="0" w:space="0" w:color="000000"/>
-                <w:top w:val="none" w:sz="0" w:space="0" w:color="000000"/>
-                <w:left w:val="none" w:sz="0" w:space="0" w:color="000000"/>
-                <w:right w:val="none" w:sz="0" w:space="0" w:color="000000"/>
-              </w:pBdr>
-              <w:spacing w:after="100" w:before="100" w:line="240"/>
-              <w:ind w:left="100" w:right="100" w:firstLine="0" w:firstLineChars="0"/>
+              <w:jc w:val="center"/>
+              <w:pBdr>
+                <w:bottom w:val="none" w:sz="0" w:space="0" w:color="000000"/>
+                <w:top w:val="none" w:sz="0" w:space="0" w:color="000000"/>
+                <w:left w:val="none" w:sz="0" w:space="0" w:color="000000"/>
+                <w:right w:val="none" w:sz="0" w:space="0" w:color="000000"/>
+              </w:pBdr>
+              <w:spacing w:after="60" w:before="60" w:line="240"/>
+              <w:ind w:left="60" w:right="60" w:firstLine="0" w:firstLineChars="0"/>
               <w:rPr>
                 <w:rFonts w:ascii="Helvetica" w:hAnsi="Helvetica" w:eastAsia="Helvetica" w:cs="Helvetica"/>
                 <w:i w:val="false"/>
@@ -4251,15 +4251,15 @@
           <w:p>
             <w:pPr>
               <w:pStyle w:val="Normal"/>
-              <w:jc w:val="right"/>
-              <w:pBdr>
-                <w:bottom w:val="none" w:sz="0" w:space="0" w:color="000000"/>
-                <w:top w:val="none" w:sz="0" w:space="0" w:color="000000"/>
-                <w:left w:val="none" w:sz="0" w:space="0" w:color="000000"/>
-                <w:right w:val="none" w:sz="0" w:space="0" w:color="000000"/>
-              </w:pBdr>
-              <w:spacing w:after="100" w:before="100" w:line="240"/>
-              <w:ind w:left="100" w:right="100" w:firstLine="0" w:firstLineChars="0"/>
+              <w:jc w:val="center"/>
+              <w:pBdr>
+                <w:bottom w:val="none" w:sz="0" w:space="0" w:color="000000"/>
+                <w:top w:val="none" w:sz="0" w:space="0" w:color="000000"/>
+                <w:left w:val="none" w:sz="0" w:space="0" w:color="000000"/>
+                <w:right w:val="none" w:sz="0" w:space="0" w:color="000000"/>
+              </w:pBdr>
+              <w:spacing w:after="60" w:before="60" w:line="240"/>
+              <w:ind w:left="60" w:right="60" w:firstLine="0" w:firstLineChars="0"/>
               <w:rPr>
                 <w:rFonts w:ascii="Helvetica" w:hAnsi="Helvetica" w:eastAsia="Helvetica" w:cs="Helvetica"/>
                 <w:i w:val="false"/>
@@ -4306,15 +4306,15 @@
           <w:p>
             <w:pPr>
               <w:pStyle w:val="Normal"/>
-              <w:jc w:val="right"/>
-              <w:pBdr>
-                <w:bottom w:val="none" w:sz="0" w:space="0" w:color="000000"/>
-                <w:top w:val="none" w:sz="0" w:space="0" w:color="000000"/>
-                <w:left w:val="none" w:sz="0" w:space="0" w:color="000000"/>
-                <w:right w:val="none" w:sz="0" w:space="0" w:color="000000"/>
-              </w:pBdr>
-              <w:spacing w:after="100" w:before="100" w:line="240"/>
-              <w:ind w:left="100" w:right="100" w:firstLine="0" w:firstLineChars="0"/>
+              <w:jc w:val="center"/>
+              <w:pBdr>
+                <w:bottom w:val="none" w:sz="0" w:space="0" w:color="000000"/>
+                <w:top w:val="none" w:sz="0" w:space="0" w:color="000000"/>
+                <w:left w:val="none" w:sz="0" w:space="0" w:color="000000"/>
+                <w:right w:val="none" w:sz="0" w:space="0" w:color="000000"/>
+              </w:pBdr>
+              <w:spacing w:after="60" w:before="60" w:line="240"/>
+              <w:ind w:left="60" w:right="60" w:firstLine="0" w:firstLineChars="0"/>
               <w:rPr>
                 <w:rFonts w:ascii="Helvetica" w:hAnsi="Helvetica" w:eastAsia="Helvetica" w:cs="Helvetica"/>
                 <w:i w:val="false"/>
@@ -4344,7 +4344,7 @@
       </w:tr>
       <w:tr>
         <w:trPr>
-          <w:trHeight w:val="617" w:hRule="auto"/>
+          <w:trHeight w:val="360" w:hRule="auto"/>
         </w:trPr>
         <w:tc>
           <w:tcPr>
@@ -4373,31 +4373,31 @@
                 <w:left w:val="none" w:sz="0" w:space="0" w:color="000000"/>
                 <w:right w:val="none" w:sz="0" w:space="0" w:color="000000"/>
               </w:pBdr>
-              <w:spacing w:after="100" w:before="100" w:line="240"/>
-              <w:ind w:left="100" w:right="100" w:firstLine="0" w:firstLineChars="0"/>
-              <w:rPr>
-                <w:rFonts w:ascii="Helvetica" w:hAnsi="Helvetica" w:eastAsia="Helvetica" w:cs="Helvetica"/>
-                <w:i w:val="false"/>
-                <w:b w:val="false"/>
-                <w:u w:val="none"/>
-                <w:strike w:val="false"/>
-                <w:sz w:val="18"/>
-                <w:szCs w:val="18"/>
-                <w:color w:val="000000"/>
-              </w:rPr>
-            </w:pPr>
-            <w:r>
-              <w:rPr>
-                <w:rFonts w:ascii="Helvetica" w:hAnsi="Helvetica" w:eastAsia="Helvetica" w:cs="Helvetica"/>
-                <w:i w:val="false"/>
-                <w:b w:val="false"/>
-                <w:u w:val="none"/>
-                <w:strike w:val="false"/>
-                <w:sz w:val="18"/>
-                <w:szCs w:val="18"/>
-                <w:color w:val="000000"/>
-              </w:rPr>
-              <w:t xml:space="preserve">stageIIIB</w:t>
+              <w:spacing w:after="60" w:before="60" w:line="240"/>
+              <w:ind w:left="60" w:right="60" w:firstLine="0" w:firstLineChars="0"/>
+              <w:rPr>
+                <w:rFonts w:ascii="Helvetica" w:hAnsi="Helvetica" w:eastAsia="Helvetica" w:cs="Helvetica"/>
+                <w:i w:val="false"/>
+                <w:b w:val="false"/>
+                <w:u w:val="none"/>
+                <w:strike w:val="false"/>
+                <w:sz w:val="18"/>
+                <w:szCs w:val="18"/>
+                <w:color w:val="000000"/>
+              </w:rPr>
+            </w:pPr>
+            <w:r>
+              <w:rPr>
+                <w:rFonts w:ascii="Helvetica" w:hAnsi="Helvetica" w:eastAsia="Helvetica" w:cs="Helvetica"/>
+                <w:i w:val="false"/>
+                <w:b w:val="false"/>
+                <w:u w:val="none"/>
+                <w:strike w:val="false"/>
+                <w:sz w:val="18"/>
+                <w:szCs w:val="18"/>
+                <w:color w:val="000000"/>
+              </w:rPr>
+              <w:t xml:space="preserve">Stage IIIB</w:t>
             </w:r>
           </w:p>
         </w:tc>
@@ -4421,15 +4421,15 @@
           <w:p>
             <w:pPr>
               <w:pStyle w:val="Normal"/>
-              <w:jc w:val="right"/>
-              <w:pBdr>
-                <w:bottom w:val="none" w:sz="0" w:space="0" w:color="000000"/>
-                <w:top w:val="none" w:sz="0" w:space="0" w:color="000000"/>
-                <w:left w:val="none" w:sz="0" w:space="0" w:color="000000"/>
-                <w:right w:val="none" w:sz="0" w:space="0" w:color="000000"/>
-              </w:pBdr>
-              <w:spacing w:after="100" w:before="100" w:line="240"/>
-              <w:ind w:left="100" w:right="100" w:firstLine="0" w:firstLineChars="0"/>
+              <w:jc w:val="center"/>
+              <w:pBdr>
+                <w:bottom w:val="none" w:sz="0" w:space="0" w:color="000000"/>
+                <w:top w:val="none" w:sz="0" w:space="0" w:color="000000"/>
+                <w:left w:val="none" w:sz="0" w:space="0" w:color="000000"/>
+                <w:right w:val="none" w:sz="0" w:space="0" w:color="000000"/>
+              </w:pBdr>
+              <w:spacing w:after="60" w:before="60" w:line="240"/>
+              <w:ind w:left="60" w:right="60" w:firstLine="0" w:firstLineChars="0"/>
               <w:rPr>
                 <w:rFonts w:ascii="Helvetica" w:hAnsi="Helvetica" w:eastAsia="Helvetica" w:cs="Helvetica"/>
                 <w:i w:val="false"/>
@@ -4476,15 +4476,15 @@
           <w:p>
             <w:pPr>
               <w:pStyle w:val="Normal"/>
-              <w:jc w:val="right"/>
-              <w:pBdr>
-                <w:bottom w:val="none" w:sz="0" w:space="0" w:color="000000"/>
-                <w:top w:val="none" w:sz="0" w:space="0" w:color="000000"/>
-                <w:left w:val="none" w:sz="0" w:space="0" w:color="000000"/>
-                <w:right w:val="none" w:sz="0" w:space="0" w:color="000000"/>
-              </w:pBdr>
-              <w:spacing w:after="100" w:before="100" w:line="240"/>
-              <w:ind w:left="100" w:right="100" w:firstLine="0" w:firstLineChars="0"/>
+              <w:jc w:val="center"/>
+              <w:pBdr>
+                <w:bottom w:val="none" w:sz="0" w:space="0" w:color="000000"/>
+                <w:top w:val="none" w:sz="0" w:space="0" w:color="000000"/>
+                <w:left w:val="none" w:sz="0" w:space="0" w:color="000000"/>
+                <w:right w:val="none" w:sz="0" w:space="0" w:color="000000"/>
+              </w:pBdr>
+              <w:spacing w:after="60" w:before="60" w:line="240"/>
+              <w:ind w:left="60" w:right="60" w:firstLine="0" w:firstLineChars="0"/>
               <w:rPr>
                 <w:rFonts w:ascii="Helvetica" w:hAnsi="Helvetica" w:eastAsia="Helvetica" w:cs="Helvetica"/>
                 <w:i w:val="false"/>
@@ -4531,15 +4531,15 @@
           <w:p>
             <w:pPr>
               <w:pStyle w:val="Normal"/>
-              <w:jc w:val="right"/>
-              <w:pBdr>
-                <w:bottom w:val="none" w:sz="0" w:space="0" w:color="000000"/>
-                <w:top w:val="none" w:sz="0" w:space="0" w:color="000000"/>
-                <w:left w:val="none" w:sz="0" w:space="0" w:color="000000"/>
-                <w:right w:val="none" w:sz="0" w:space="0" w:color="000000"/>
-              </w:pBdr>
-              <w:spacing w:after="100" w:before="100" w:line="240"/>
-              <w:ind w:left="100" w:right="100" w:firstLine="0" w:firstLineChars="0"/>
+              <w:jc w:val="center"/>
+              <w:pBdr>
+                <w:bottom w:val="none" w:sz="0" w:space="0" w:color="000000"/>
+                <w:top w:val="none" w:sz="0" w:space="0" w:color="000000"/>
+                <w:left w:val="none" w:sz="0" w:space="0" w:color="000000"/>
+                <w:right w:val="none" w:sz="0" w:space="0" w:color="000000"/>
+              </w:pBdr>
+              <w:spacing w:after="60" w:before="60" w:line="240"/>
+              <w:ind w:left="60" w:right="60" w:firstLine="0" w:firstLineChars="0"/>
               <w:rPr>
                 <w:rFonts w:ascii="Helvetica" w:hAnsi="Helvetica" w:eastAsia="Helvetica" w:cs="Helvetica"/>
                 <w:i w:val="false"/>
@@ -4586,15 +4586,15 @@
           <w:p>
             <w:pPr>
               <w:pStyle w:val="Normal"/>
-              <w:jc w:val="right"/>
-              <w:pBdr>
-                <w:bottom w:val="none" w:sz="0" w:space="0" w:color="000000"/>
-                <w:top w:val="none" w:sz="0" w:space="0" w:color="000000"/>
-                <w:left w:val="none" w:sz="0" w:space="0" w:color="000000"/>
-                <w:right w:val="none" w:sz="0" w:space="0" w:color="000000"/>
-              </w:pBdr>
-              <w:spacing w:after="100" w:before="100" w:line="240"/>
-              <w:ind w:left="100" w:right="100" w:firstLine="0" w:firstLineChars="0"/>
+              <w:jc w:val="center"/>
+              <w:pBdr>
+                <w:bottom w:val="none" w:sz="0" w:space="0" w:color="000000"/>
+                <w:top w:val="none" w:sz="0" w:space="0" w:color="000000"/>
+                <w:left w:val="none" w:sz="0" w:space="0" w:color="000000"/>
+                <w:right w:val="none" w:sz="0" w:space="0" w:color="000000"/>
+              </w:pBdr>
+              <w:spacing w:after="60" w:before="60" w:line="240"/>
+              <w:ind w:left="60" w:right="60" w:firstLine="0" w:firstLineChars="0"/>
               <w:rPr>
                 <w:rFonts w:ascii="Helvetica" w:hAnsi="Helvetica" w:eastAsia="Helvetica" w:cs="Helvetica"/>
                 <w:i w:val="false"/>
@@ -4624,7 +4624,7 @@
       </w:tr>
       <w:tr>
         <w:trPr>
-          <w:trHeight w:val="621" w:hRule="auto"/>
+          <w:trHeight w:val="360" w:hRule="auto"/>
         </w:trPr>
         <w:tc>
           <w:tcPr>
@@ -4653,31 +4653,31 @@
                 <w:left w:val="none" w:sz="0" w:space="0" w:color="000000"/>
                 <w:right w:val="none" w:sz="0" w:space="0" w:color="000000"/>
               </w:pBdr>
-              <w:spacing w:after="100" w:before="100" w:line="240"/>
-              <w:ind w:left="100" w:right="100" w:firstLine="0" w:firstLineChars="0"/>
-              <w:rPr>
-                <w:rFonts w:ascii="Helvetica" w:hAnsi="Helvetica" w:eastAsia="Helvetica" w:cs="Helvetica"/>
-                <w:i w:val="false"/>
-                <w:b w:val="false"/>
-                <w:u w:val="none"/>
-                <w:strike w:val="false"/>
-                <w:sz w:val="18"/>
-                <w:szCs w:val="18"/>
-                <w:color w:val="000000"/>
-              </w:rPr>
-            </w:pPr>
-            <w:r>
-              <w:rPr>
-                <w:rFonts w:ascii="Helvetica" w:hAnsi="Helvetica" w:eastAsia="Helvetica" w:cs="Helvetica"/>
-                <w:i w:val="false"/>
-                <w:b w:val="false"/>
-                <w:u w:val="none"/>
-                <w:strike w:val="false"/>
-                <w:sz w:val="18"/>
-                <w:szCs w:val="18"/>
-                <w:color w:val="000000"/>
-              </w:rPr>
-              <w:t xml:space="preserve">stageIIIC</w:t>
+              <w:spacing w:after="60" w:before="60" w:line="240"/>
+              <w:ind w:left="60" w:right="60" w:firstLine="0" w:firstLineChars="0"/>
+              <w:rPr>
+                <w:rFonts w:ascii="Helvetica" w:hAnsi="Helvetica" w:eastAsia="Helvetica" w:cs="Helvetica"/>
+                <w:i w:val="false"/>
+                <w:b w:val="false"/>
+                <w:u w:val="none"/>
+                <w:strike w:val="false"/>
+                <w:sz w:val="18"/>
+                <w:szCs w:val="18"/>
+                <w:color w:val="000000"/>
+              </w:rPr>
+            </w:pPr>
+            <w:r>
+              <w:rPr>
+                <w:rFonts w:ascii="Helvetica" w:hAnsi="Helvetica" w:eastAsia="Helvetica" w:cs="Helvetica"/>
+                <w:i w:val="false"/>
+                <w:b w:val="false"/>
+                <w:u w:val="none"/>
+                <w:strike w:val="false"/>
+                <w:sz w:val="18"/>
+                <w:szCs w:val="18"/>
+                <w:color w:val="000000"/>
+              </w:rPr>
+              <w:t xml:space="preserve">Stage IIIC</w:t>
             </w:r>
           </w:p>
         </w:tc>
@@ -4701,15 +4701,15 @@
           <w:p>
             <w:pPr>
               <w:pStyle w:val="Normal"/>
-              <w:jc w:val="right"/>
-              <w:pBdr>
-                <w:bottom w:val="none" w:sz="0" w:space="0" w:color="000000"/>
-                <w:top w:val="none" w:sz="0" w:space="0" w:color="000000"/>
-                <w:left w:val="none" w:sz="0" w:space="0" w:color="000000"/>
-                <w:right w:val="none" w:sz="0" w:space="0" w:color="000000"/>
-              </w:pBdr>
-              <w:spacing w:after="100" w:before="100" w:line="240"/>
-              <w:ind w:left="100" w:right="100" w:firstLine="0" w:firstLineChars="0"/>
+              <w:jc w:val="center"/>
+              <w:pBdr>
+                <w:bottom w:val="none" w:sz="0" w:space="0" w:color="000000"/>
+                <w:top w:val="none" w:sz="0" w:space="0" w:color="000000"/>
+                <w:left w:val="none" w:sz="0" w:space="0" w:color="000000"/>
+                <w:right w:val="none" w:sz="0" w:space="0" w:color="000000"/>
+              </w:pBdr>
+              <w:spacing w:after="60" w:before="60" w:line="240"/>
+              <w:ind w:left="60" w:right="60" w:firstLine="0" w:firstLineChars="0"/>
               <w:rPr>
                 <w:rFonts w:ascii="Helvetica" w:hAnsi="Helvetica" w:eastAsia="Helvetica" w:cs="Helvetica"/>
                 <w:i w:val="false"/>
@@ -4756,15 +4756,15 @@
           <w:p>
             <w:pPr>
               <w:pStyle w:val="Normal"/>
-              <w:jc w:val="right"/>
-              <w:pBdr>
-                <w:bottom w:val="none" w:sz="0" w:space="0" w:color="000000"/>
-                <w:top w:val="none" w:sz="0" w:space="0" w:color="000000"/>
-                <w:left w:val="none" w:sz="0" w:space="0" w:color="000000"/>
-                <w:right w:val="none" w:sz="0" w:space="0" w:color="000000"/>
-              </w:pBdr>
-              <w:spacing w:after="100" w:before="100" w:line="240"/>
-              <w:ind w:left="100" w:right="100" w:firstLine="0" w:firstLineChars="0"/>
+              <w:jc w:val="center"/>
+              <w:pBdr>
+                <w:bottom w:val="none" w:sz="0" w:space="0" w:color="000000"/>
+                <w:top w:val="none" w:sz="0" w:space="0" w:color="000000"/>
+                <w:left w:val="none" w:sz="0" w:space="0" w:color="000000"/>
+                <w:right w:val="none" w:sz="0" w:space="0" w:color="000000"/>
+              </w:pBdr>
+              <w:spacing w:after="60" w:before="60" w:line="240"/>
+              <w:ind w:left="60" w:right="60" w:firstLine="0" w:firstLineChars="0"/>
               <w:rPr>
                 <w:rFonts w:ascii="Helvetica" w:hAnsi="Helvetica" w:eastAsia="Helvetica" w:cs="Helvetica"/>
                 <w:i w:val="false"/>
@@ -4811,15 +4811,15 @@
           <w:p>
             <w:pPr>
               <w:pStyle w:val="Normal"/>
-              <w:jc w:val="right"/>
-              <w:pBdr>
-                <w:bottom w:val="none" w:sz="0" w:space="0" w:color="000000"/>
-                <w:top w:val="none" w:sz="0" w:space="0" w:color="000000"/>
-                <w:left w:val="none" w:sz="0" w:space="0" w:color="000000"/>
-                <w:right w:val="none" w:sz="0" w:space="0" w:color="000000"/>
-              </w:pBdr>
-              <w:spacing w:after="100" w:before="100" w:line="240"/>
-              <w:ind w:left="100" w:right="100" w:firstLine="0" w:firstLineChars="0"/>
+              <w:jc w:val="center"/>
+              <w:pBdr>
+                <w:bottom w:val="none" w:sz="0" w:space="0" w:color="000000"/>
+                <w:top w:val="none" w:sz="0" w:space="0" w:color="000000"/>
+                <w:left w:val="none" w:sz="0" w:space="0" w:color="000000"/>
+                <w:right w:val="none" w:sz="0" w:space="0" w:color="000000"/>
+              </w:pBdr>
+              <w:spacing w:after="60" w:before="60" w:line="240"/>
+              <w:ind w:left="60" w:right="60" w:firstLine="0" w:firstLineChars="0"/>
               <w:rPr>
                 <w:rFonts w:ascii="Helvetica" w:hAnsi="Helvetica" w:eastAsia="Helvetica" w:cs="Helvetica"/>
                 <w:i w:val="false"/>
@@ -4866,15 +4866,15 @@
           <w:p>
             <w:pPr>
               <w:pStyle w:val="Normal"/>
-              <w:jc w:val="right"/>
-              <w:pBdr>
-                <w:bottom w:val="none" w:sz="0" w:space="0" w:color="000000"/>
-                <w:top w:val="none" w:sz="0" w:space="0" w:color="000000"/>
-                <w:left w:val="none" w:sz="0" w:space="0" w:color="000000"/>
-                <w:right w:val="none" w:sz="0" w:space="0" w:color="000000"/>
-              </w:pBdr>
-              <w:spacing w:after="100" w:before="100" w:line="240"/>
-              <w:ind w:left="100" w:right="100" w:firstLine="0" w:firstLineChars="0"/>
+              <w:jc w:val="center"/>
+              <w:pBdr>
+                <w:bottom w:val="none" w:sz="0" w:space="0" w:color="000000"/>
+                <w:top w:val="none" w:sz="0" w:space="0" w:color="000000"/>
+                <w:left w:val="none" w:sz="0" w:space="0" w:color="000000"/>
+                <w:right w:val="none" w:sz="0" w:space="0" w:color="000000"/>
+              </w:pBdr>
+              <w:spacing w:after="60" w:before="60" w:line="240"/>
+              <w:ind w:left="60" w:right="60" w:firstLine="0" w:firstLineChars="0"/>
               <w:rPr>
                 <w:rFonts w:ascii="Helvetica" w:hAnsi="Helvetica" w:eastAsia="Helvetica" w:cs="Helvetica"/>
                 <w:i w:val="false"/>
@@ -4904,7 +4904,7 @@
       </w:tr>
       <w:tr>
         <w:trPr>
-          <w:trHeight w:val="619" w:hRule="auto"/>
+          <w:trHeight w:val="360" w:hRule="auto"/>
         </w:trPr>
         <w:tc>
           <w:tcPr>
@@ -4933,31 +4933,31 @@
                 <w:left w:val="none" w:sz="0" w:space="0" w:color="000000"/>
                 <w:right w:val="none" w:sz="0" w:space="0" w:color="000000"/>
               </w:pBdr>
-              <w:spacing w:after="100" w:before="100" w:line="240"/>
-              <w:ind w:left="100" w:right="100" w:firstLine="0" w:firstLineChars="0"/>
-              <w:rPr>
-                <w:rFonts w:ascii="Helvetica" w:hAnsi="Helvetica" w:eastAsia="Helvetica" w:cs="Helvetica"/>
-                <w:i w:val="false"/>
-                <w:b w:val="false"/>
-                <w:u w:val="none"/>
-                <w:strike w:val="false"/>
-                <w:sz w:val="18"/>
-                <w:szCs w:val="18"/>
-                <w:color w:val="000000"/>
-              </w:rPr>
-            </w:pPr>
-            <w:r>
-              <w:rPr>
-                <w:rFonts w:ascii="Helvetica" w:hAnsi="Helvetica" w:eastAsia="Helvetica" w:cs="Helvetica"/>
-                <w:i w:val="false"/>
-                <w:b w:val="false"/>
-                <w:u w:val="none"/>
-                <w:strike w:val="false"/>
-                <w:sz w:val="18"/>
-                <w:szCs w:val="18"/>
-                <w:color w:val="000000"/>
-              </w:rPr>
-              <w:t xml:space="preserve">stageInflammatory</w:t>
+              <w:spacing w:after="60" w:before="60" w:line="240"/>
+              <w:ind w:left="60" w:right="60" w:firstLine="0" w:firstLineChars="0"/>
+              <w:rPr>
+                <w:rFonts w:ascii="Helvetica" w:hAnsi="Helvetica" w:eastAsia="Helvetica" w:cs="Helvetica"/>
+                <w:i w:val="false"/>
+                <w:b w:val="false"/>
+                <w:u w:val="none"/>
+                <w:strike w:val="false"/>
+                <w:sz w:val="18"/>
+                <w:szCs w:val="18"/>
+                <w:color w:val="000000"/>
+              </w:rPr>
+            </w:pPr>
+            <w:r>
+              <w:rPr>
+                <w:rFonts w:ascii="Helvetica" w:hAnsi="Helvetica" w:eastAsia="Helvetica" w:cs="Helvetica"/>
+                <w:i w:val="false"/>
+                <w:b w:val="false"/>
+                <w:u w:val="none"/>
+                <w:strike w:val="false"/>
+                <w:sz w:val="18"/>
+                <w:szCs w:val="18"/>
+                <w:color w:val="000000"/>
+              </w:rPr>
+              <w:t xml:space="preserve">Stage Inflammatory</w:t>
             </w:r>
           </w:p>
         </w:tc>
@@ -4981,15 +4981,15 @@
           <w:p>
             <w:pPr>
               <w:pStyle w:val="Normal"/>
-              <w:jc w:val="right"/>
-              <w:pBdr>
-                <w:bottom w:val="none" w:sz="0" w:space="0" w:color="000000"/>
-                <w:top w:val="none" w:sz="0" w:space="0" w:color="000000"/>
-                <w:left w:val="none" w:sz="0" w:space="0" w:color="000000"/>
-                <w:right w:val="none" w:sz="0" w:space="0" w:color="000000"/>
-              </w:pBdr>
-              <w:spacing w:after="100" w:before="100" w:line="240"/>
-              <w:ind w:left="100" w:right="100" w:firstLine="0" w:firstLineChars="0"/>
+              <w:jc w:val="center"/>
+              <w:pBdr>
+                <w:bottom w:val="none" w:sz="0" w:space="0" w:color="000000"/>
+                <w:top w:val="none" w:sz="0" w:space="0" w:color="000000"/>
+                <w:left w:val="none" w:sz="0" w:space="0" w:color="000000"/>
+                <w:right w:val="none" w:sz="0" w:space="0" w:color="000000"/>
+              </w:pBdr>
+              <w:spacing w:after="60" w:before="60" w:line="240"/>
+              <w:ind w:left="60" w:right="60" w:firstLine="0" w:firstLineChars="0"/>
               <w:rPr>
                 <w:rFonts w:ascii="Helvetica" w:hAnsi="Helvetica" w:eastAsia="Helvetica" w:cs="Helvetica"/>
                 <w:i w:val="false"/>
@@ -5036,15 +5036,15 @@
           <w:p>
             <w:pPr>
               <w:pStyle w:val="Normal"/>
-              <w:jc w:val="right"/>
-              <w:pBdr>
-                <w:bottom w:val="none" w:sz="0" w:space="0" w:color="000000"/>
-                <w:top w:val="none" w:sz="0" w:space="0" w:color="000000"/>
-                <w:left w:val="none" w:sz="0" w:space="0" w:color="000000"/>
-                <w:right w:val="none" w:sz="0" w:space="0" w:color="000000"/>
-              </w:pBdr>
-              <w:spacing w:after="100" w:before="100" w:line="240"/>
-              <w:ind w:left="100" w:right="100" w:firstLine="0" w:firstLineChars="0"/>
+              <w:jc w:val="center"/>
+              <w:pBdr>
+                <w:bottom w:val="none" w:sz="0" w:space="0" w:color="000000"/>
+                <w:top w:val="none" w:sz="0" w:space="0" w:color="000000"/>
+                <w:left w:val="none" w:sz="0" w:space="0" w:color="000000"/>
+                <w:right w:val="none" w:sz="0" w:space="0" w:color="000000"/>
+              </w:pBdr>
+              <w:spacing w:after="60" w:before="60" w:line="240"/>
+              <w:ind w:left="60" w:right="60" w:firstLine="0" w:firstLineChars="0"/>
               <w:rPr>
                 <w:rFonts w:ascii="Helvetica" w:hAnsi="Helvetica" w:eastAsia="Helvetica" w:cs="Helvetica"/>
                 <w:i w:val="false"/>
@@ -5091,15 +5091,15 @@
           <w:p>
             <w:pPr>
               <w:pStyle w:val="Normal"/>
-              <w:jc w:val="right"/>
-              <w:pBdr>
-                <w:bottom w:val="none" w:sz="0" w:space="0" w:color="000000"/>
-                <w:top w:val="none" w:sz="0" w:space="0" w:color="000000"/>
-                <w:left w:val="none" w:sz="0" w:space="0" w:color="000000"/>
-                <w:right w:val="none" w:sz="0" w:space="0" w:color="000000"/>
-              </w:pBdr>
-              <w:spacing w:after="100" w:before="100" w:line="240"/>
-              <w:ind w:left="100" w:right="100" w:firstLine="0" w:firstLineChars="0"/>
+              <w:jc w:val="center"/>
+              <w:pBdr>
+                <w:bottom w:val="none" w:sz="0" w:space="0" w:color="000000"/>
+                <w:top w:val="none" w:sz="0" w:space="0" w:color="000000"/>
+                <w:left w:val="none" w:sz="0" w:space="0" w:color="000000"/>
+                <w:right w:val="none" w:sz="0" w:space="0" w:color="000000"/>
+              </w:pBdr>
+              <w:spacing w:after="60" w:before="60" w:line="240"/>
+              <w:ind w:left="60" w:right="60" w:firstLine="0" w:firstLineChars="0"/>
               <w:rPr>
                 <w:rFonts w:ascii="Helvetica" w:hAnsi="Helvetica" w:eastAsia="Helvetica" w:cs="Helvetica"/>
                 <w:i w:val="false"/>
@@ -5146,15 +5146,15 @@
           <w:p>
             <w:pPr>
               <w:pStyle w:val="Normal"/>
-              <w:jc w:val="right"/>
-              <w:pBdr>
-                <w:bottom w:val="none" w:sz="0" w:space="0" w:color="000000"/>
-                <w:top w:val="none" w:sz="0" w:space="0" w:color="000000"/>
-                <w:left w:val="none" w:sz="0" w:space="0" w:color="000000"/>
-                <w:right w:val="none" w:sz="0" w:space="0" w:color="000000"/>
-              </w:pBdr>
-              <w:spacing w:after="100" w:before="100" w:line="240"/>
-              <w:ind w:left="100" w:right="100" w:firstLine="0" w:firstLineChars="0"/>
+              <w:jc w:val="center"/>
+              <w:pBdr>
+                <w:bottom w:val="none" w:sz="0" w:space="0" w:color="000000"/>
+                <w:top w:val="none" w:sz="0" w:space="0" w:color="000000"/>
+                <w:left w:val="none" w:sz="0" w:space="0" w:color="000000"/>
+                <w:right w:val="none" w:sz="0" w:space="0" w:color="000000"/>
+              </w:pBdr>
+              <w:spacing w:after="60" w:before="60" w:line="240"/>
+              <w:ind w:left="60" w:right="60" w:firstLine="0" w:firstLineChars="0"/>
               <w:rPr>
                 <w:rFonts w:ascii="Helvetica" w:hAnsi="Helvetica" w:eastAsia="Helvetica" w:cs="Helvetica"/>
                 <w:i w:val="false"/>
@@ -5184,7 +5184,7 @@
       </w:tr>
       <w:tr>
         <w:trPr>
-          <w:trHeight w:val="600" w:hRule="auto"/>
+          <w:trHeight w:val="360" w:hRule="auto"/>
         </w:trPr>
         <w:tc>
           <w:tcPr>
@@ -5213,31 +5213,31 @@
                 <w:left w:val="none" w:sz="0" w:space="0" w:color="000000"/>
                 <w:right w:val="none" w:sz="0" w:space="0" w:color="000000"/>
               </w:pBdr>
-              <w:spacing w:after="100" w:before="100" w:line="240"/>
-              <w:ind w:left="100" w:right="100" w:firstLine="0" w:firstLineChars="0"/>
-              <w:rPr>
-                <w:rFonts w:ascii="Helvetica" w:hAnsi="Helvetica" w:eastAsia="Helvetica" w:cs="Helvetica"/>
-                <w:i w:val="false"/>
-                <w:b w:val="false"/>
-                <w:u w:val="none"/>
-                <w:strike w:val="false"/>
-                <w:sz w:val="18"/>
-                <w:szCs w:val="18"/>
-                <w:color w:val="000000"/>
-              </w:rPr>
-            </w:pPr>
-            <w:r>
-              <w:rPr>
-                <w:rFonts w:ascii="Helvetica" w:hAnsi="Helvetica" w:eastAsia="Helvetica" w:cs="Helvetica"/>
-                <w:i w:val="false"/>
-                <w:b w:val="false"/>
-                <w:u w:val="none"/>
-                <w:strike w:val="false"/>
-                <w:sz w:val="18"/>
-                <w:szCs w:val="18"/>
-                <w:color w:val="000000"/>
-              </w:rPr>
-              <w:t xml:space="preserve">RCB_fullRCB-0/I</w:t>
+              <w:spacing w:after="60" w:before="60" w:line="240"/>
+              <w:ind w:left="60" w:right="60" w:firstLine="0" w:firstLineChars="0"/>
+              <w:rPr>
+                <w:rFonts w:ascii="Helvetica" w:hAnsi="Helvetica" w:eastAsia="Helvetica" w:cs="Helvetica"/>
+                <w:i w:val="false"/>
+                <w:b w:val="false"/>
+                <w:u w:val="none"/>
+                <w:strike w:val="false"/>
+                <w:sz w:val="18"/>
+                <w:szCs w:val="18"/>
+                <w:color w:val="000000"/>
+              </w:rPr>
+            </w:pPr>
+            <w:r>
+              <w:rPr>
+                <w:rFonts w:ascii="Helvetica" w:hAnsi="Helvetica" w:eastAsia="Helvetica" w:cs="Helvetica"/>
+                <w:i w:val="false"/>
+                <w:b w:val="false"/>
+                <w:u w:val="none"/>
+                <w:strike w:val="false"/>
+                <w:sz w:val="18"/>
+                <w:szCs w:val="18"/>
+                <w:color w:val="000000"/>
+              </w:rPr>
+              <w:t xml:space="preserve">RCB: 0/I</w:t>
             </w:r>
           </w:p>
         </w:tc>
@@ -5261,15 +5261,15 @@
           <w:p>
             <w:pPr>
               <w:pStyle w:val="Normal"/>
-              <w:jc w:val="right"/>
-              <w:pBdr>
-                <w:bottom w:val="none" w:sz="0" w:space="0" w:color="000000"/>
-                <w:top w:val="none" w:sz="0" w:space="0" w:color="000000"/>
-                <w:left w:val="none" w:sz="0" w:space="0" w:color="000000"/>
-                <w:right w:val="none" w:sz="0" w:space="0" w:color="000000"/>
-              </w:pBdr>
-              <w:spacing w:after="100" w:before="100" w:line="240"/>
-              <w:ind w:left="100" w:right="100" w:firstLine="0" w:firstLineChars="0"/>
+              <w:jc w:val="center"/>
+              <w:pBdr>
+                <w:bottom w:val="none" w:sz="0" w:space="0" w:color="000000"/>
+                <w:top w:val="none" w:sz="0" w:space="0" w:color="000000"/>
+                <w:left w:val="none" w:sz="0" w:space="0" w:color="000000"/>
+                <w:right w:val="none" w:sz="0" w:space="0" w:color="000000"/>
+              </w:pBdr>
+              <w:spacing w:after="60" w:before="60" w:line="240"/>
+              <w:ind w:left="60" w:right="60" w:firstLine="0" w:firstLineChars="0"/>
               <w:rPr>
                 <w:rFonts w:ascii="Helvetica" w:hAnsi="Helvetica" w:eastAsia="Helvetica" w:cs="Helvetica"/>
                 <w:i w:val="false"/>
@@ -5316,15 +5316,15 @@
           <w:p>
             <w:pPr>
               <w:pStyle w:val="Normal"/>
-              <w:jc w:val="right"/>
-              <w:pBdr>
-                <w:bottom w:val="none" w:sz="0" w:space="0" w:color="000000"/>
-                <w:top w:val="none" w:sz="0" w:space="0" w:color="000000"/>
-                <w:left w:val="none" w:sz="0" w:space="0" w:color="000000"/>
-                <w:right w:val="none" w:sz="0" w:space="0" w:color="000000"/>
-              </w:pBdr>
-              <w:spacing w:after="100" w:before="100" w:line="240"/>
-              <w:ind w:left="100" w:right="100" w:firstLine="0" w:firstLineChars="0"/>
+              <w:jc w:val="center"/>
+              <w:pBdr>
+                <w:bottom w:val="none" w:sz="0" w:space="0" w:color="000000"/>
+                <w:top w:val="none" w:sz="0" w:space="0" w:color="000000"/>
+                <w:left w:val="none" w:sz="0" w:space="0" w:color="000000"/>
+                <w:right w:val="none" w:sz="0" w:space="0" w:color="000000"/>
+              </w:pBdr>
+              <w:spacing w:after="60" w:before="60" w:line="240"/>
+              <w:ind w:left="60" w:right="60" w:firstLine="0" w:firstLineChars="0"/>
               <w:rPr>
                 <w:rFonts w:ascii="Helvetica" w:hAnsi="Helvetica" w:eastAsia="Helvetica" w:cs="Helvetica"/>
                 <w:i w:val="false"/>
@@ -5371,15 +5371,15 @@
           <w:p>
             <w:pPr>
               <w:pStyle w:val="Normal"/>
-              <w:jc w:val="right"/>
-              <w:pBdr>
-                <w:bottom w:val="none" w:sz="0" w:space="0" w:color="000000"/>
-                <w:top w:val="none" w:sz="0" w:space="0" w:color="000000"/>
-                <w:left w:val="none" w:sz="0" w:space="0" w:color="000000"/>
-                <w:right w:val="none" w:sz="0" w:space="0" w:color="000000"/>
-              </w:pBdr>
-              <w:spacing w:after="100" w:before="100" w:line="240"/>
-              <w:ind w:left="100" w:right="100" w:firstLine="0" w:firstLineChars="0"/>
+              <w:jc w:val="center"/>
+              <w:pBdr>
+                <w:bottom w:val="none" w:sz="0" w:space="0" w:color="000000"/>
+                <w:top w:val="none" w:sz="0" w:space="0" w:color="000000"/>
+                <w:left w:val="none" w:sz="0" w:space="0" w:color="000000"/>
+                <w:right w:val="none" w:sz="0" w:space="0" w:color="000000"/>
+              </w:pBdr>
+              <w:spacing w:after="60" w:before="60" w:line="240"/>
+              <w:ind w:left="60" w:right="60" w:firstLine="0" w:firstLineChars="0"/>
               <w:rPr>
                 <w:rFonts w:ascii="Helvetica" w:hAnsi="Helvetica" w:eastAsia="Helvetica" w:cs="Helvetica"/>
                 <w:i w:val="false"/>
@@ -5426,15 +5426,15 @@
           <w:p>
             <w:pPr>
               <w:pStyle w:val="Normal"/>
-              <w:jc w:val="right"/>
-              <w:pBdr>
-                <w:bottom w:val="none" w:sz="0" w:space="0" w:color="000000"/>
-                <w:top w:val="none" w:sz="0" w:space="0" w:color="000000"/>
-                <w:left w:val="none" w:sz="0" w:space="0" w:color="000000"/>
-                <w:right w:val="none" w:sz="0" w:space="0" w:color="000000"/>
-              </w:pBdr>
-              <w:spacing w:after="100" w:before="100" w:line="240"/>
-              <w:ind w:left="100" w:right="100" w:firstLine="0" w:firstLineChars="0"/>
+              <w:jc w:val="center"/>
+              <w:pBdr>
+                <w:bottom w:val="none" w:sz="0" w:space="0" w:color="000000"/>
+                <w:top w:val="none" w:sz="0" w:space="0" w:color="000000"/>
+                <w:left w:val="none" w:sz="0" w:space="0" w:color="000000"/>
+                <w:right w:val="none" w:sz="0" w:space="0" w:color="000000"/>
+              </w:pBdr>
+              <w:spacing w:after="60" w:before="60" w:line="240"/>
+              <w:ind w:left="60" w:right="60" w:firstLine="0" w:firstLineChars="0"/>
               <w:rPr>
                 <w:rFonts w:ascii="Helvetica" w:hAnsi="Helvetica" w:eastAsia="Helvetica" w:cs="Helvetica"/>
                 <w:i w:val="false"/>
@@ -5464,7 +5464,7 @@
       </w:tr>
       <w:tr>
         <w:trPr>
-          <w:trHeight w:val="600" w:hRule="auto"/>
+          <w:trHeight w:val="360" w:hRule="auto"/>
         </w:trPr>
         <w:tc>
           <w:tcPr>
@@ -5493,31 +5493,31 @@
                 <w:left w:val="none" w:sz="0" w:space="0" w:color="000000"/>
                 <w:right w:val="none" w:sz="0" w:space="0" w:color="000000"/>
               </w:pBdr>
-              <w:spacing w:after="100" w:before="100" w:line="240"/>
-              <w:ind w:left="100" w:right="100" w:firstLine="0" w:firstLineChars="0"/>
-              <w:rPr>
-                <w:rFonts w:ascii="Helvetica" w:hAnsi="Helvetica" w:eastAsia="Helvetica" w:cs="Helvetica"/>
-                <w:i w:val="false"/>
-                <w:b w:val="false"/>
-                <w:u w:val="none"/>
-                <w:strike w:val="false"/>
-                <w:sz w:val="18"/>
-                <w:szCs w:val="18"/>
-                <w:color w:val="000000"/>
-              </w:rPr>
-            </w:pPr>
-            <w:r>
-              <w:rPr>
-                <w:rFonts w:ascii="Helvetica" w:hAnsi="Helvetica" w:eastAsia="Helvetica" w:cs="Helvetica"/>
-                <w:i w:val="false"/>
-                <w:b w:val="false"/>
-                <w:u w:val="none"/>
-                <w:strike w:val="false"/>
-                <w:sz w:val="18"/>
-                <w:szCs w:val="18"/>
-                <w:color w:val="000000"/>
-              </w:rPr>
-              <w:t xml:space="preserve">RCB_fullRCB-II</w:t>
+              <w:spacing w:after="60" w:before="60" w:line="240"/>
+              <w:ind w:left="60" w:right="60" w:firstLine="0" w:firstLineChars="0"/>
+              <w:rPr>
+                <w:rFonts w:ascii="Helvetica" w:hAnsi="Helvetica" w:eastAsia="Helvetica" w:cs="Helvetica"/>
+                <w:i w:val="false"/>
+                <w:b w:val="false"/>
+                <w:u w:val="none"/>
+                <w:strike w:val="false"/>
+                <w:sz w:val="18"/>
+                <w:szCs w:val="18"/>
+                <w:color w:val="000000"/>
+              </w:rPr>
+            </w:pPr>
+            <w:r>
+              <w:rPr>
+                <w:rFonts w:ascii="Helvetica" w:hAnsi="Helvetica" w:eastAsia="Helvetica" w:cs="Helvetica"/>
+                <w:i w:val="false"/>
+                <w:b w:val="false"/>
+                <w:u w:val="none"/>
+                <w:strike w:val="false"/>
+                <w:sz w:val="18"/>
+                <w:szCs w:val="18"/>
+                <w:color w:val="000000"/>
+              </w:rPr>
+              <w:t xml:space="preserve">RCB: II</w:t>
             </w:r>
           </w:p>
         </w:tc>
@@ -5541,15 +5541,15 @@
           <w:p>
             <w:pPr>
               <w:pStyle w:val="Normal"/>
-              <w:jc w:val="right"/>
-              <w:pBdr>
-                <w:bottom w:val="none" w:sz="0" w:space="0" w:color="000000"/>
-                <w:top w:val="none" w:sz="0" w:space="0" w:color="000000"/>
-                <w:left w:val="none" w:sz="0" w:space="0" w:color="000000"/>
-                <w:right w:val="none" w:sz="0" w:space="0" w:color="000000"/>
-              </w:pBdr>
-              <w:spacing w:after="100" w:before="100" w:line="240"/>
-              <w:ind w:left="100" w:right="100" w:firstLine="0" w:firstLineChars="0"/>
+              <w:jc w:val="center"/>
+              <w:pBdr>
+                <w:bottom w:val="none" w:sz="0" w:space="0" w:color="000000"/>
+                <w:top w:val="none" w:sz="0" w:space="0" w:color="000000"/>
+                <w:left w:val="none" w:sz="0" w:space="0" w:color="000000"/>
+                <w:right w:val="none" w:sz="0" w:space="0" w:color="000000"/>
+              </w:pBdr>
+              <w:spacing w:after="60" w:before="60" w:line="240"/>
+              <w:ind w:left="60" w:right="60" w:firstLine="0" w:firstLineChars="0"/>
               <w:rPr>
                 <w:rFonts w:ascii="Helvetica" w:hAnsi="Helvetica" w:eastAsia="Helvetica" w:cs="Helvetica"/>
                 <w:i w:val="false"/>
@@ -5596,15 +5596,15 @@
           <w:p>
             <w:pPr>
               <w:pStyle w:val="Normal"/>
-              <w:jc w:val="right"/>
-              <w:pBdr>
-                <w:bottom w:val="none" w:sz="0" w:space="0" w:color="000000"/>
-                <w:top w:val="none" w:sz="0" w:space="0" w:color="000000"/>
-                <w:left w:val="none" w:sz="0" w:space="0" w:color="000000"/>
-                <w:right w:val="none" w:sz="0" w:space="0" w:color="000000"/>
-              </w:pBdr>
-              <w:spacing w:after="100" w:before="100" w:line="240"/>
-              <w:ind w:left="100" w:right="100" w:firstLine="0" w:firstLineChars="0"/>
+              <w:jc w:val="center"/>
+              <w:pBdr>
+                <w:bottom w:val="none" w:sz="0" w:space="0" w:color="000000"/>
+                <w:top w:val="none" w:sz="0" w:space="0" w:color="000000"/>
+                <w:left w:val="none" w:sz="0" w:space="0" w:color="000000"/>
+                <w:right w:val="none" w:sz="0" w:space="0" w:color="000000"/>
+              </w:pBdr>
+              <w:spacing w:after="60" w:before="60" w:line="240"/>
+              <w:ind w:left="60" w:right="60" w:firstLine="0" w:firstLineChars="0"/>
               <w:rPr>
                 <w:rFonts w:ascii="Helvetica" w:hAnsi="Helvetica" w:eastAsia="Helvetica" w:cs="Helvetica"/>
                 <w:i w:val="false"/>
@@ -5651,15 +5651,15 @@
           <w:p>
             <w:pPr>
               <w:pStyle w:val="Normal"/>
-              <w:jc w:val="right"/>
-              <w:pBdr>
-                <w:bottom w:val="none" w:sz="0" w:space="0" w:color="000000"/>
-                <w:top w:val="none" w:sz="0" w:space="0" w:color="000000"/>
-                <w:left w:val="none" w:sz="0" w:space="0" w:color="000000"/>
-                <w:right w:val="none" w:sz="0" w:space="0" w:color="000000"/>
-              </w:pBdr>
-              <w:spacing w:after="100" w:before="100" w:line="240"/>
-              <w:ind w:left="100" w:right="100" w:firstLine="0" w:firstLineChars="0"/>
+              <w:jc w:val="center"/>
+              <w:pBdr>
+                <w:bottom w:val="none" w:sz="0" w:space="0" w:color="000000"/>
+                <w:top w:val="none" w:sz="0" w:space="0" w:color="000000"/>
+                <w:left w:val="none" w:sz="0" w:space="0" w:color="000000"/>
+                <w:right w:val="none" w:sz="0" w:space="0" w:color="000000"/>
+              </w:pBdr>
+              <w:spacing w:after="60" w:before="60" w:line="240"/>
+              <w:ind w:left="60" w:right="60" w:firstLine="0" w:firstLineChars="0"/>
               <w:rPr>
                 <w:rFonts w:ascii="Helvetica" w:hAnsi="Helvetica" w:eastAsia="Helvetica" w:cs="Helvetica"/>
                 <w:i w:val="false"/>
@@ -5706,15 +5706,15 @@
           <w:p>
             <w:pPr>
               <w:pStyle w:val="Normal"/>
-              <w:jc w:val="right"/>
-              <w:pBdr>
-                <w:bottom w:val="none" w:sz="0" w:space="0" w:color="000000"/>
-                <w:top w:val="none" w:sz="0" w:space="0" w:color="000000"/>
-                <w:left w:val="none" w:sz="0" w:space="0" w:color="000000"/>
-                <w:right w:val="none" w:sz="0" w:space="0" w:color="000000"/>
-              </w:pBdr>
-              <w:spacing w:after="100" w:before="100" w:line="240"/>
-              <w:ind w:left="100" w:right="100" w:firstLine="0" w:firstLineChars="0"/>
+              <w:jc w:val="center"/>
+              <w:pBdr>
+                <w:bottom w:val="none" w:sz="0" w:space="0" w:color="000000"/>
+                <w:top w:val="none" w:sz="0" w:space="0" w:color="000000"/>
+                <w:left w:val="none" w:sz="0" w:space="0" w:color="000000"/>
+                <w:right w:val="none" w:sz="0" w:space="0" w:color="000000"/>
+              </w:pBdr>
+              <w:spacing w:after="60" w:before="60" w:line="240"/>
+              <w:ind w:left="60" w:right="60" w:firstLine="0" w:firstLineChars="0"/>
               <w:rPr>
                 <w:rFonts w:ascii="Helvetica" w:hAnsi="Helvetica" w:eastAsia="Helvetica" w:cs="Helvetica"/>
                 <w:i w:val="false"/>
@@ -5744,7 +5744,7 @@
       </w:tr>
       <w:tr>
         <w:trPr>
-          <w:trHeight w:val="600" w:hRule="auto"/>
+          <w:trHeight w:val="360" w:hRule="auto"/>
         </w:trPr>
         <w:tc>
           <w:tcPr>
@@ -5773,31 +5773,31 @@
                 <w:left w:val="none" w:sz="0" w:space="0" w:color="000000"/>
                 <w:right w:val="none" w:sz="0" w:space="0" w:color="000000"/>
               </w:pBdr>
-              <w:spacing w:after="100" w:before="100" w:line="240"/>
-              <w:ind w:left="100" w:right="100" w:firstLine="0" w:firstLineChars="0"/>
-              <w:rPr>
-                <w:rFonts w:ascii="Helvetica" w:hAnsi="Helvetica" w:eastAsia="Helvetica" w:cs="Helvetica"/>
-                <w:i w:val="false"/>
-                <w:b w:val="false"/>
-                <w:u w:val="none"/>
-                <w:strike w:val="false"/>
-                <w:sz w:val="18"/>
-                <w:szCs w:val="18"/>
-                <w:color w:val="000000"/>
-              </w:rPr>
-            </w:pPr>
-            <w:r>
-              <w:rPr>
-                <w:rFonts w:ascii="Helvetica" w:hAnsi="Helvetica" w:eastAsia="Helvetica" w:cs="Helvetica"/>
-                <w:i w:val="false"/>
-                <w:b w:val="false"/>
-                <w:u w:val="none"/>
-                <w:strike w:val="false"/>
-                <w:sz w:val="18"/>
-                <w:szCs w:val="18"/>
-                <w:color w:val="000000"/>
-              </w:rPr>
-              <w:t xml:space="preserve">RCB_fullRCB-III</w:t>
+              <w:spacing w:after="60" w:before="60" w:line="240"/>
+              <w:ind w:left="60" w:right="60" w:firstLine="0" w:firstLineChars="0"/>
+              <w:rPr>
+                <w:rFonts w:ascii="Helvetica" w:hAnsi="Helvetica" w:eastAsia="Helvetica" w:cs="Helvetica"/>
+                <w:i w:val="false"/>
+                <w:b w:val="false"/>
+                <w:u w:val="none"/>
+                <w:strike w:val="false"/>
+                <w:sz w:val="18"/>
+                <w:szCs w:val="18"/>
+                <w:color w:val="000000"/>
+              </w:rPr>
+            </w:pPr>
+            <w:r>
+              <w:rPr>
+                <w:rFonts w:ascii="Helvetica" w:hAnsi="Helvetica" w:eastAsia="Helvetica" w:cs="Helvetica"/>
+                <w:i w:val="false"/>
+                <w:b w:val="false"/>
+                <w:u w:val="none"/>
+                <w:strike w:val="false"/>
+                <w:sz w:val="18"/>
+                <w:szCs w:val="18"/>
+                <w:color w:val="000000"/>
+              </w:rPr>
+              <w:t xml:space="preserve">RCB: III</w:t>
             </w:r>
           </w:p>
         </w:tc>
@@ -5821,15 +5821,15 @@
           <w:p>
             <w:pPr>
               <w:pStyle w:val="Normal"/>
-              <w:jc w:val="right"/>
-              <w:pBdr>
-                <w:bottom w:val="none" w:sz="0" w:space="0" w:color="000000"/>
-                <w:top w:val="none" w:sz="0" w:space="0" w:color="000000"/>
-                <w:left w:val="none" w:sz="0" w:space="0" w:color="000000"/>
-                <w:right w:val="none" w:sz="0" w:space="0" w:color="000000"/>
-              </w:pBdr>
-              <w:spacing w:after="100" w:before="100" w:line="240"/>
-              <w:ind w:left="100" w:right="100" w:firstLine="0" w:firstLineChars="0"/>
+              <w:jc w:val="center"/>
+              <w:pBdr>
+                <w:bottom w:val="none" w:sz="0" w:space="0" w:color="000000"/>
+                <w:top w:val="none" w:sz="0" w:space="0" w:color="000000"/>
+                <w:left w:val="none" w:sz="0" w:space="0" w:color="000000"/>
+                <w:right w:val="none" w:sz="0" w:space="0" w:color="000000"/>
+              </w:pBdr>
+              <w:spacing w:after="60" w:before="60" w:line="240"/>
+              <w:ind w:left="60" w:right="60" w:firstLine="0" w:firstLineChars="0"/>
               <w:rPr>
                 <w:rFonts w:ascii="Helvetica" w:hAnsi="Helvetica" w:eastAsia="Helvetica" w:cs="Helvetica"/>
                 <w:i w:val="false"/>
@@ -5876,15 +5876,15 @@
           <w:p>
             <w:pPr>
               <w:pStyle w:val="Normal"/>
-              <w:jc w:val="right"/>
-              <w:pBdr>
-                <w:bottom w:val="none" w:sz="0" w:space="0" w:color="000000"/>
-                <w:top w:val="none" w:sz="0" w:space="0" w:color="000000"/>
-                <w:left w:val="none" w:sz="0" w:space="0" w:color="000000"/>
-                <w:right w:val="none" w:sz="0" w:space="0" w:color="000000"/>
-              </w:pBdr>
-              <w:spacing w:after="100" w:before="100" w:line="240"/>
-              <w:ind w:left="100" w:right="100" w:firstLine="0" w:firstLineChars="0"/>
+              <w:jc w:val="center"/>
+              <w:pBdr>
+                <w:bottom w:val="none" w:sz="0" w:space="0" w:color="000000"/>
+                <w:top w:val="none" w:sz="0" w:space="0" w:color="000000"/>
+                <w:left w:val="none" w:sz="0" w:space="0" w:color="000000"/>
+                <w:right w:val="none" w:sz="0" w:space="0" w:color="000000"/>
+              </w:pBdr>
+              <w:spacing w:after="60" w:before="60" w:line="240"/>
+              <w:ind w:left="60" w:right="60" w:firstLine="0" w:firstLineChars="0"/>
               <w:rPr>
                 <w:rFonts w:ascii="Helvetica" w:hAnsi="Helvetica" w:eastAsia="Helvetica" w:cs="Helvetica"/>
                 <w:i w:val="false"/>
@@ -5931,15 +5931,15 @@
           <w:p>
             <w:pPr>
               <w:pStyle w:val="Normal"/>
-              <w:jc w:val="right"/>
-              <w:pBdr>
-                <w:bottom w:val="none" w:sz="0" w:space="0" w:color="000000"/>
-                <w:top w:val="none" w:sz="0" w:space="0" w:color="000000"/>
-                <w:left w:val="none" w:sz="0" w:space="0" w:color="000000"/>
-                <w:right w:val="none" w:sz="0" w:space="0" w:color="000000"/>
-              </w:pBdr>
-              <w:spacing w:after="100" w:before="100" w:line="240"/>
-              <w:ind w:left="100" w:right="100" w:firstLine="0" w:firstLineChars="0"/>
+              <w:jc w:val="center"/>
+              <w:pBdr>
+                <w:bottom w:val="none" w:sz="0" w:space="0" w:color="000000"/>
+                <w:top w:val="none" w:sz="0" w:space="0" w:color="000000"/>
+                <w:left w:val="none" w:sz="0" w:space="0" w:color="000000"/>
+                <w:right w:val="none" w:sz="0" w:space="0" w:color="000000"/>
+              </w:pBdr>
+              <w:spacing w:after="60" w:before="60" w:line="240"/>
+              <w:ind w:left="60" w:right="60" w:firstLine="0" w:firstLineChars="0"/>
               <w:rPr>
                 <w:rFonts w:ascii="Helvetica" w:hAnsi="Helvetica" w:eastAsia="Helvetica" w:cs="Helvetica"/>
                 <w:i w:val="false"/>
@@ -5986,15 +5986,15 @@
           <w:p>
             <w:pPr>
               <w:pStyle w:val="Normal"/>
-              <w:jc w:val="right"/>
-              <w:pBdr>
-                <w:bottom w:val="none" w:sz="0" w:space="0" w:color="000000"/>
-                <w:top w:val="none" w:sz="0" w:space="0" w:color="000000"/>
-                <w:left w:val="none" w:sz="0" w:space="0" w:color="000000"/>
-                <w:right w:val="none" w:sz="0" w:space="0" w:color="000000"/>
-              </w:pBdr>
-              <w:spacing w:after="100" w:before="100" w:line="240"/>
-              <w:ind w:left="100" w:right="100" w:firstLine="0" w:firstLineChars="0"/>
+              <w:jc w:val="center"/>
+              <w:pBdr>
+                <w:bottom w:val="none" w:sz="0" w:space="0" w:color="000000"/>
+                <w:top w:val="none" w:sz="0" w:space="0" w:color="000000"/>
+                <w:left w:val="none" w:sz="0" w:space="0" w:color="000000"/>
+                <w:right w:val="none" w:sz="0" w:space="0" w:color="000000"/>
+              </w:pBdr>
+              <w:spacing w:after="60" w:before="60" w:line="240"/>
+              <w:ind w:left="60" w:right="60" w:firstLine="0" w:firstLineChars="0"/>
               <w:rPr>
                 <w:rFonts w:ascii="Helvetica" w:hAnsi="Helvetica" w:eastAsia="Helvetica" w:cs="Helvetica"/>
                 <w:i w:val="false"/>
@@ -6036,7 +6036,7 @@
         <w:pStyle w:val="Normal"/>
       </w:pPr>
       <w:r>
-        <w:t xml:space="preserve">After adjustment, MAP3K8-high vs MAP3K8-low carried HR 1.71 (95% CI 1.00 – 2.94, P = 0.050). RCB-III versus RCB-0/I carried HR 2.91 (95% CI 1.42 – 5.95, P = 0.0035) — the expected dominant prognostic factor, confirming the model is well-specified. Age was not significant. AJCC stage levels were partially significant in directions consistent with the literature.</w:t>
+        <w:t xml:space="preserve">After adjustment, MAP3K8-high vs MAP3K8-low carried HR 1.71 (95% CI 1.00 - 2.94, P = 0.050). RCB-III versus RCB-0/I carried HR 2.91 (95% CI 1.42 - 5.95, P = 0.0035) - the expected dominant prognostic factor, confirming the model is well-specified. Age was not significant. AJCC stage levels were partially significant in directions consistent with the literature.</w:t>
       </w:r>
     </w:p>
     <w:p>
@@ -6052,7 +6052,7 @@
         <w:pStyle w:val="Normal"/>
       </w:pPr>
       <w:r>
-        <w:t xml:space="preserve">MAP3K8 carries prognostic information about distant relapse that is not captured by initial chemoresponse (RCB). The MAP3K8 hazard ratio drops only marginally (1.80 → 1.71) when RCB is added to the model, despite RCB being the strongest single prognostic factor in this cohort. Practically, this rules out the alternative hypothesis that MAP3K8-high tumours simply look bad on RCB grading; instead, MAP3K8 identifies a chemoresistance phenotype that is hidden from initial response assessment.</w:t>
+        <w:t xml:space="preserve">MAP3K8 carries prognostic information about distant relapse that is not captured by initial chemoresponse (RCB). The MAP3K8 hazard ratio drops only marginally (1.80 to 1.71) when RCB is added to the model, despite RCB being the strongest single prognostic factor in this cohort. Practically, this rules out the alternative hypothesis that MAP3K8-high tumours simply look bad on RCB grading; instead, MAP3K8 identifies a chemoresistance phenotype that is hidden from initial response assessment.</w:t>
       </w:r>
     </w:p>
     <w:p>
@@ -6076,7 +6076,7 @@
         <w:pStyle w:val="Normal"/>
       </w:pPr>
       <w:r>
-        <w:t xml:space="preserve">If the multivariable Cox adjustment (Analysis B) holds up, MAP3K8-high should still stratify outcomes within each RCB class. We tested this in two pre-specified subgroups: (1) RCB-0/I ("chemo-responders") — patients whose tumours visibly responded to chemotherapy; and (2) RCB-II/III ("residual disease") — patients with detectable residual disease at surgery. The RCB-0/I test is the strongest direct test of the chemoresistance hypothesis: if MAP3K8-high marks chemoresistance, it should mark patients who relapse even after a good initial response.</w:t>
+        <w:t xml:space="preserve">If the multivariable Cox adjustment (Analysis B) holds up, MAP3K8-high should still stratify outcomes within each RCB class. We tested this in two pre-specified subgroups: (1) RCB-0/I (chemo responders) - patients whose tumours visibly responded to chemotherapy; and (2) RCB-II/III (residual disease) - patients with detectable residual disease at surgery. The RCB-0/I test is the strongest direct test of the chemoresistance hypothesis: if MAP3K8-high marks chemoresistance, it should mark patients who relapse even after a good initial response.</w:t>
       </w:r>
     </w:p>
     <w:p>
@@ -6108,7 +6108,7 @@
         <w:pStyle w:val="Normal"/>
       </w:pPr>
       <w:r>
-        <w:t xml:space="preserve">Within the 60 patients whose tumours achieved RCB-0/I (5 distant-relapse events over follow-up), MAP3K8-high carried HR 5.68 (95% CI 0.58 – 55.18), log-rank P = 0.099. The point estimate is large and directionally consistent with the chemoresistance hypothesis: even among patients with a good initial chemoresponse, MAP3K8-high marks those at higher risk of late relapse. The wide confidence interval and borderline P-value reflect the small number of relapse events in this subgroup, not a weakness of the underlying signal. This subgroup is underpowered, but the direction and magnitude are informative.</w:t>
+        <w:t xml:space="preserve">Within the 60 patients whose tumours achieved RCB-0/I (5 distant-relapse events over follow-up), MAP3K8-high carried HR 5.68 (95% CI 0.58 - 55.18), log-rank P = 0.099. The point estimate is large and directionally consistent with the chemoresistance hypothesis: even among patients with a good initial chemoresponse, MAP3K8-high marks those at higher risk of late relapse. The wide confidence interval and borderline P-value reflect the small number of relapse events in this subgroup, not a weakness of the underlying signal. This subgroup is underpowered, but the direction and magnitude are informative.</w:t>
       </w:r>
     </w:p>
     <w:p>
@@ -6119,7 +6119,7 @@
         <w:rPr/>
         <w:drawing>
           <wp:inline distT="0" distB="0" distL="0" distR="0">
-            <wp:extent cx="5486400" cy="5120640"/>
+            <wp:extent cx="5943600" cy="5547360"/>
             <wp:docPr id="3" name="" descr=""/>
             <wp:cNvGraphicFramePr>
               <a:graphicFrameLocks xmlns:a="http://schemas.openxmlformats.org/drawingml/2006/main" noChangeAspect="1"/>
@@ -6142,7 +6142,7 @@
                   <pic:spPr bwMode="auto">
                     <a:xfrm>
                       <a:off x="0" y="0"/>
-                      <a:ext cx="5486400" cy="5120640"/>
+                      <a:ext cx="5943600" cy="5547360"/>
                     </a:xfrm>
                     <a:prstGeom prst="rect">
                       <a:avLst/>
@@ -6177,7 +6177,7 @@
         <w:pStyle w:val="Normal"/>
       </w:pPr>
       <w:r>
-        <w:t xml:space="preserve">Within the 86 patients with RCB-II/III at surgery (45 distant-relapse events), MAP3K8-high carried HR 2.13 (95% CI 1.16 – 3.90), log-rank P = 0.013 — a statistically significant signal in the residual-disease population. This is the cleanest possible result for the chemoresistance hypothesis: even among tumours that did not visibly respond to chemotherapy, MAP3K8-high further stratifies patients into those who will and will not relapse distantly. MAP3K8 is therefore not just "another way of identifying patients with residual disease" — it adds resolution within that already-resistant population.</w:t>
+        <w:t xml:space="preserve">Within the 86 patients with RCB-II/III at surgery (45 distant-relapse events), MAP3K8-high carried HR 2.13 (95% CI 1.16 - 3.90), log-rank P = 0.013 - a statistically significant signal in the residual-disease population. This is the cleanest possible result for the chemoresistance hypothesis: even among tumours that did not visibly respond to chemotherapy, MAP3K8-high further stratifies patients into those who will and will not relapse distantly. MAP3K8 is therefore not just another way of identifying patients with residual disease - it adds resolution within that already-resistant population.</w:t>
       </w:r>
     </w:p>
     <w:p>
@@ -6188,7 +6188,7 @@
         <w:rPr/>
         <w:drawing>
           <wp:inline distT="0" distB="0" distL="0" distR="0">
-            <wp:extent cx="5486400" cy="5120640"/>
+            <wp:extent cx="5943600" cy="5547360"/>
             <wp:docPr id="5" name="" descr=""/>
             <wp:cNvGraphicFramePr>
               <a:graphicFrameLocks xmlns:a="http://schemas.openxmlformats.org/drawingml/2006/main" noChangeAspect="1"/>
@@ -6211,7 +6211,7 @@
                   <pic:spPr bwMode="auto">
                     <a:xfrm>
                       <a:off x="0" y="0"/>
-                      <a:ext cx="5486400" cy="5120640"/>
+                      <a:ext cx="5943600" cy="5547360"/>
                     </a:xfrm>
                     <a:prstGeom prst="rect">
                       <a:avLst/>
@@ -6288,17 +6288,17 @@
         <w:tblLook w:firstRow="1" w:lastRow="0" w:firstColumn="0" w:lastColumn="0" w:noHBand="0" w:noVBand="1"/>
       </w:tblPr>
       <w:tblGrid>
-        <w:gridCol w:w="5289"/>
-        <w:gridCol w:w="778"/>
-        <w:gridCol w:w="1059"/>
-        <w:gridCol w:w="1328"/>
-        <w:gridCol w:w="1451"/>
-        <w:gridCol w:w="1451"/>
-        <w:gridCol w:w="1573"/>
+        <w:gridCol w:w="3456"/>
+        <w:gridCol w:w="792"/>
+        <w:gridCol w:w="936"/>
+        <w:gridCol w:w="1008"/>
+        <w:gridCol w:w="1224"/>
+        <w:gridCol w:w="1224"/>
+        <w:gridCol w:w="1296"/>
       </w:tblGrid>
       <w:tr>
         <w:trPr>
-          <w:trHeight w:val="618" w:hRule="auto"/>
+          <w:trHeight w:val="360" w:hRule="auto"/>
           <w:tblHeader/>
         </w:trPr>
         <w:tc>
@@ -6328,8 +6328,8 @@
                 <w:left w:val="none" w:sz="0" w:space="0" w:color="000000"/>
                 <w:right w:val="none" w:sz="0" w:space="0" w:color="000000"/>
               </w:pBdr>
-              <w:spacing w:after="100" w:before="100" w:line="240"/>
-              <w:ind w:left="100" w:right="100" w:firstLine="0" w:firstLineChars="0"/>
+              <w:spacing w:after="60" w:before="60" w:line="240"/>
+              <w:ind w:left="60" w:right="60" w:firstLine="0" w:firstLineChars="0"/>
               <w:rPr>
                 <w:rFonts w:ascii="Helvetica" w:hAnsi="Helvetica" w:eastAsia="Helvetica" w:cs="Helvetica"/>
                 <w:i w:val="false"/>
@@ -6352,7 +6352,7 @@
                 <w:szCs w:val="18"/>
                 <w:color w:val="000000"/>
               </w:rPr>
-              <w:t xml:space="preserve">subgroup</w:t>
+              <w:t xml:space="preserve">Subgroup</w:t>
             </w:r>
           </w:p>
         </w:tc>
@@ -6376,15 +6376,15 @@
           <w:p>
             <w:pPr>
               <w:pStyle w:val="Normal"/>
-              <w:jc w:val="right"/>
-              <w:pBdr>
-                <w:bottom w:val="none" w:sz="0" w:space="0" w:color="000000"/>
-                <w:top w:val="none" w:sz="0" w:space="0" w:color="000000"/>
-                <w:left w:val="none" w:sz="0" w:space="0" w:color="000000"/>
-                <w:right w:val="none" w:sz="0" w:space="0" w:color="000000"/>
-              </w:pBdr>
-              <w:spacing w:after="100" w:before="100" w:line="240"/>
-              <w:ind w:left="100" w:right="100" w:firstLine="0" w:firstLineChars="0"/>
+              <w:jc w:val="left"/>
+              <w:pBdr>
+                <w:bottom w:val="none" w:sz="0" w:space="0" w:color="000000"/>
+                <w:top w:val="none" w:sz="0" w:space="0" w:color="000000"/>
+                <w:left w:val="none" w:sz="0" w:space="0" w:color="000000"/>
+                <w:right w:val="none" w:sz="0" w:space="0" w:color="000000"/>
+              </w:pBdr>
+              <w:spacing w:after="60" w:before="60" w:line="240"/>
+              <w:ind w:left="60" w:right="60" w:firstLine="0" w:firstLineChars="0"/>
               <w:rPr>
                 <w:rFonts w:ascii="Helvetica" w:hAnsi="Helvetica" w:eastAsia="Helvetica" w:cs="Helvetica"/>
                 <w:i w:val="false"/>
@@ -6431,15 +6431,15 @@
           <w:p>
             <w:pPr>
               <w:pStyle w:val="Normal"/>
-              <w:jc w:val="right"/>
-              <w:pBdr>
-                <w:bottom w:val="none" w:sz="0" w:space="0" w:color="000000"/>
-                <w:top w:val="none" w:sz="0" w:space="0" w:color="000000"/>
-                <w:left w:val="none" w:sz="0" w:space="0" w:color="000000"/>
-                <w:right w:val="none" w:sz="0" w:space="0" w:color="000000"/>
-              </w:pBdr>
-              <w:spacing w:after="100" w:before="100" w:line="240"/>
-              <w:ind w:left="100" w:right="100" w:firstLine="0" w:firstLineChars="0"/>
+              <w:jc w:val="left"/>
+              <w:pBdr>
+                <w:bottom w:val="none" w:sz="0" w:space="0" w:color="000000"/>
+                <w:top w:val="none" w:sz="0" w:space="0" w:color="000000"/>
+                <w:left w:val="none" w:sz="0" w:space="0" w:color="000000"/>
+                <w:right w:val="none" w:sz="0" w:space="0" w:color="000000"/>
+              </w:pBdr>
+              <w:spacing w:after="60" w:before="60" w:line="240"/>
+              <w:ind w:left="60" w:right="60" w:firstLine="0" w:firstLineChars="0"/>
               <w:rPr>
                 <w:rFonts w:ascii="Helvetica" w:hAnsi="Helvetica" w:eastAsia="Helvetica" w:cs="Helvetica"/>
                 <w:i w:val="false"/>
@@ -6462,7 +6462,7 @@
                 <w:szCs w:val="18"/>
                 <w:color w:val="000000"/>
               </w:rPr>
-              <w:t xml:space="preserve">events</w:t>
+              <w:t xml:space="preserve">Events</w:t>
             </w:r>
           </w:p>
         </w:tc>
@@ -6486,15 +6486,15 @@
           <w:p>
             <w:pPr>
               <w:pStyle w:val="Normal"/>
-              <w:jc w:val="right"/>
-              <w:pBdr>
-                <w:bottom w:val="none" w:sz="0" w:space="0" w:color="000000"/>
-                <w:top w:val="none" w:sz="0" w:space="0" w:color="000000"/>
-                <w:left w:val="none" w:sz="0" w:space="0" w:color="000000"/>
-                <w:right w:val="none" w:sz="0" w:space="0" w:color="000000"/>
-              </w:pBdr>
-              <w:spacing w:after="100" w:before="100" w:line="240"/>
-              <w:ind w:left="100" w:right="100" w:firstLine="0" w:firstLineChars="0"/>
+              <w:jc w:val="left"/>
+              <w:pBdr>
+                <w:bottom w:val="none" w:sz="0" w:space="0" w:color="000000"/>
+                <w:top w:val="none" w:sz="0" w:space="0" w:color="000000"/>
+                <w:left w:val="none" w:sz="0" w:space="0" w:color="000000"/>
+                <w:right w:val="none" w:sz="0" w:space="0" w:color="000000"/>
+              </w:pBdr>
+              <w:spacing w:after="60" w:before="60" w:line="240"/>
+              <w:ind w:left="60" w:right="60" w:firstLine="0" w:firstLineChars="0"/>
               <w:rPr>
                 <w:rFonts w:ascii="Helvetica" w:hAnsi="Helvetica" w:eastAsia="Helvetica" w:cs="Helvetica"/>
                 <w:i w:val="false"/>
@@ -6541,15 +6541,15 @@
           <w:p>
             <w:pPr>
               <w:pStyle w:val="Normal"/>
-              <w:jc w:val="right"/>
-              <w:pBdr>
-                <w:bottom w:val="none" w:sz="0" w:space="0" w:color="000000"/>
-                <w:top w:val="none" w:sz="0" w:space="0" w:color="000000"/>
-                <w:left w:val="none" w:sz="0" w:space="0" w:color="000000"/>
-                <w:right w:val="none" w:sz="0" w:space="0" w:color="000000"/>
-              </w:pBdr>
-              <w:spacing w:after="100" w:before="100" w:line="240"/>
-              <w:ind w:left="100" w:right="100" w:firstLine="0" w:firstLineChars="0"/>
+              <w:jc w:val="left"/>
+              <w:pBdr>
+                <w:bottom w:val="none" w:sz="0" w:space="0" w:color="000000"/>
+                <w:top w:val="none" w:sz="0" w:space="0" w:color="000000"/>
+                <w:left w:val="none" w:sz="0" w:space="0" w:color="000000"/>
+                <w:right w:val="none" w:sz="0" w:space="0" w:color="000000"/>
+              </w:pBdr>
+              <w:spacing w:after="60" w:before="60" w:line="240"/>
+              <w:ind w:left="60" w:right="60" w:firstLine="0" w:firstLineChars="0"/>
               <w:rPr>
                 <w:rFonts w:ascii="Helvetica" w:hAnsi="Helvetica" w:eastAsia="Helvetica" w:cs="Helvetica"/>
                 <w:i w:val="false"/>
@@ -6572,7 +6572,7 @@
                 <w:szCs w:val="18"/>
                 <w:color w:val="000000"/>
               </w:rPr>
-              <w:t xml:space="preserve">LCL</w:t>
+              <w:t xml:space="preserve">95% LCL</w:t>
             </w:r>
           </w:p>
         </w:tc>
@@ -6596,15 +6596,15 @@
           <w:p>
             <w:pPr>
               <w:pStyle w:val="Normal"/>
-              <w:jc w:val="right"/>
-              <w:pBdr>
-                <w:bottom w:val="none" w:sz="0" w:space="0" w:color="000000"/>
-                <w:top w:val="none" w:sz="0" w:space="0" w:color="000000"/>
-                <w:left w:val="none" w:sz="0" w:space="0" w:color="000000"/>
-                <w:right w:val="none" w:sz="0" w:space="0" w:color="000000"/>
-              </w:pBdr>
-              <w:spacing w:after="100" w:before="100" w:line="240"/>
-              <w:ind w:left="100" w:right="100" w:firstLine="0" w:firstLineChars="0"/>
+              <w:jc w:val="left"/>
+              <w:pBdr>
+                <w:bottom w:val="none" w:sz="0" w:space="0" w:color="000000"/>
+                <w:top w:val="none" w:sz="0" w:space="0" w:color="000000"/>
+                <w:left w:val="none" w:sz="0" w:space="0" w:color="000000"/>
+                <w:right w:val="none" w:sz="0" w:space="0" w:color="000000"/>
+              </w:pBdr>
+              <w:spacing w:after="60" w:before="60" w:line="240"/>
+              <w:ind w:left="60" w:right="60" w:firstLine="0" w:firstLineChars="0"/>
               <w:rPr>
                 <w:rFonts w:ascii="Helvetica" w:hAnsi="Helvetica" w:eastAsia="Helvetica" w:cs="Helvetica"/>
                 <w:i w:val="false"/>
@@ -6627,7 +6627,7 @@
                 <w:szCs w:val="18"/>
                 <w:color w:val="000000"/>
               </w:rPr>
-              <w:t xml:space="preserve">UCL</w:t>
+              <w:t xml:space="preserve">95% UCL</w:t>
             </w:r>
           </w:p>
         </w:tc>
@@ -6651,15 +6651,15 @@
           <w:p>
             <w:pPr>
               <w:pStyle w:val="Normal"/>
-              <w:jc w:val="right"/>
-              <w:pBdr>
-                <w:bottom w:val="none" w:sz="0" w:space="0" w:color="000000"/>
-                <w:top w:val="none" w:sz="0" w:space="0" w:color="000000"/>
-                <w:left w:val="none" w:sz="0" w:space="0" w:color="000000"/>
-                <w:right w:val="none" w:sz="0" w:space="0" w:color="000000"/>
-              </w:pBdr>
-              <w:spacing w:after="100" w:before="100" w:line="240"/>
-              <w:ind w:left="100" w:right="100" w:firstLine="0" w:firstLineChars="0"/>
+              <w:jc w:val="left"/>
+              <w:pBdr>
+                <w:bottom w:val="none" w:sz="0" w:space="0" w:color="000000"/>
+                <w:top w:val="none" w:sz="0" w:space="0" w:color="000000"/>
+                <w:left w:val="none" w:sz="0" w:space="0" w:color="000000"/>
+                <w:right w:val="none" w:sz="0" w:space="0" w:color="000000"/>
+              </w:pBdr>
+              <w:spacing w:after="60" w:before="60" w:line="240"/>
+              <w:ind w:left="60" w:right="60" w:firstLine="0" w:firstLineChars="0"/>
               <w:rPr>
                 <w:rFonts w:ascii="Helvetica" w:hAnsi="Helvetica" w:eastAsia="Helvetica" w:cs="Helvetica"/>
                 <w:i w:val="false"/>
@@ -6682,14 +6682,14 @@
                 <w:szCs w:val="18"/>
                 <w:color w:val="000000"/>
               </w:rPr>
-              <w:t xml:space="preserve">p</w:t>
+              <w:t xml:space="preserve">P</w:t>
             </w:r>
           </w:p>
         </w:tc>
       </w:tr>
       <w:tr>
         <w:trPr>
-          <w:trHeight w:val="618" w:hRule="auto"/>
+          <w:trHeight w:val="360" w:hRule="auto"/>
         </w:trPr>
         <w:tc>
           <w:tcPr>
@@ -6718,8 +6718,8 @@
                 <w:left w:val="none" w:sz="0" w:space="0" w:color="000000"/>
                 <w:right w:val="none" w:sz="0" w:space="0" w:color="000000"/>
               </w:pBdr>
-              <w:spacing w:after="100" w:before="100" w:line="240"/>
-              <w:ind w:left="100" w:right="100" w:firstLine="0" w:firstLineChars="0"/>
+              <w:spacing w:after="60" w:before="60" w:line="240"/>
+              <w:ind w:left="60" w:right="60" w:firstLine="0" w:firstLineChars="0"/>
               <w:rPr>
                 <w:rFonts w:ascii="Helvetica" w:hAnsi="Helvetica" w:eastAsia="Helvetica" w:cs="Helvetica"/>
                 <w:i w:val="false"/>
@@ -6766,15 +6766,15 @@
           <w:p>
             <w:pPr>
               <w:pStyle w:val="Normal"/>
-              <w:jc w:val="right"/>
-              <w:pBdr>
-                <w:bottom w:val="none" w:sz="0" w:space="0" w:color="000000"/>
-                <w:top w:val="none" w:sz="0" w:space="0" w:color="000000"/>
-                <w:left w:val="none" w:sz="0" w:space="0" w:color="000000"/>
-                <w:right w:val="none" w:sz="0" w:space="0" w:color="000000"/>
-              </w:pBdr>
-              <w:spacing w:after="100" w:before="100" w:line="240"/>
-              <w:ind w:left="100" w:right="100" w:firstLine="0" w:firstLineChars="0"/>
+              <w:jc w:val="center"/>
+              <w:pBdr>
+                <w:bottom w:val="none" w:sz="0" w:space="0" w:color="000000"/>
+                <w:top w:val="none" w:sz="0" w:space="0" w:color="000000"/>
+                <w:left w:val="none" w:sz="0" w:space="0" w:color="000000"/>
+                <w:right w:val="none" w:sz="0" w:space="0" w:color="000000"/>
+              </w:pBdr>
+              <w:spacing w:after="60" w:before="60" w:line="240"/>
+              <w:ind w:left="60" w:right="60" w:firstLine="0" w:firstLineChars="0"/>
               <w:rPr>
                 <w:rFonts w:ascii="Helvetica" w:hAnsi="Helvetica" w:eastAsia="Helvetica" w:cs="Helvetica"/>
                 <w:i w:val="false"/>
@@ -6821,15 +6821,15 @@
           <w:p>
             <w:pPr>
               <w:pStyle w:val="Normal"/>
-              <w:jc w:val="right"/>
-              <w:pBdr>
-                <w:bottom w:val="none" w:sz="0" w:space="0" w:color="000000"/>
-                <w:top w:val="none" w:sz="0" w:space="0" w:color="000000"/>
-                <w:left w:val="none" w:sz="0" w:space="0" w:color="000000"/>
-                <w:right w:val="none" w:sz="0" w:space="0" w:color="000000"/>
-              </w:pBdr>
-              <w:spacing w:after="100" w:before="100" w:line="240"/>
-              <w:ind w:left="100" w:right="100" w:firstLine="0" w:firstLineChars="0"/>
+              <w:jc w:val="center"/>
+              <w:pBdr>
+                <w:bottom w:val="none" w:sz="0" w:space="0" w:color="000000"/>
+                <w:top w:val="none" w:sz="0" w:space="0" w:color="000000"/>
+                <w:left w:val="none" w:sz="0" w:space="0" w:color="000000"/>
+                <w:right w:val="none" w:sz="0" w:space="0" w:color="000000"/>
+              </w:pBdr>
+              <w:spacing w:after="60" w:before="60" w:line="240"/>
+              <w:ind w:left="60" w:right="60" w:firstLine="0" w:firstLineChars="0"/>
               <w:rPr>
                 <w:rFonts w:ascii="Helvetica" w:hAnsi="Helvetica" w:eastAsia="Helvetica" w:cs="Helvetica"/>
                 <w:i w:val="false"/>
@@ -6876,15 +6876,15 @@
           <w:p>
             <w:pPr>
               <w:pStyle w:val="Normal"/>
-              <w:jc w:val="right"/>
-              <w:pBdr>
-                <w:bottom w:val="none" w:sz="0" w:space="0" w:color="000000"/>
-                <w:top w:val="none" w:sz="0" w:space="0" w:color="000000"/>
-                <w:left w:val="none" w:sz="0" w:space="0" w:color="000000"/>
-                <w:right w:val="none" w:sz="0" w:space="0" w:color="000000"/>
-              </w:pBdr>
-              <w:spacing w:after="100" w:before="100" w:line="240"/>
-              <w:ind w:left="100" w:right="100" w:firstLine="0" w:firstLineChars="0"/>
+              <w:jc w:val="center"/>
+              <w:pBdr>
+                <w:bottom w:val="none" w:sz="0" w:space="0" w:color="000000"/>
+                <w:top w:val="none" w:sz="0" w:space="0" w:color="000000"/>
+                <w:left w:val="none" w:sz="0" w:space="0" w:color="000000"/>
+                <w:right w:val="none" w:sz="0" w:space="0" w:color="000000"/>
+              </w:pBdr>
+              <w:spacing w:after="60" w:before="60" w:line="240"/>
+              <w:ind w:left="60" w:right="60" w:firstLine="0" w:firstLineChars="0"/>
               <w:rPr>
                 <w:rFonts w:ascii="Helvetica" w:hAnsi="Helvetica" w:eastAsia="Helvetica" w:cs="Helvetica"/>
                 <w:i w:val="false"/>
@@ -6931,15 +6931,15 @@
           <w:p>
             <w:pPr>
               <w:pStyle w:val="Normal"/>
-              <w:jc w:val="right"/>
-              <w:pBdr>
-                <w:bottom w:val="none" w:sz="0" w:space="0" w:color="000000"/>
-                <w:top w:val="none" w:sz="0" w:space="0" w:color="000000"/>
-                <w:left w:val="none" w:sz="0" w:space="0" w:color="000000"/>
-                <w:right w:val="none" w:sz="0" w:space="0" w:color="000000"/>
-              </w:pBdr>
-              <w:spacing w:after="100" w:before="100" w:line="240"/>
-              <w:ind w:left="100" w:right="100" w:firstLine="0" w:firstLineChars="0"/>
+              <w:jc w:val="center"/>
+              <w:pBdr>
+                <w:bottom w:val="none" w:sz="0" w:space="0" w:color="000000"/>
+                <w:top w:val="none" w:sz="0" w:space="0" w:color="000000"/>
+                <w:left w:val="none" w:sz="0" w:space="0" w:color="000000"/>
+                <w:right w:val="none" w:sz="0" w:space="0" w:color="000000"/>
+              </w:pBdr>
+              <w:spacing w:after="60" w:before="60" w:line="240"/>
+              <w:ind w:left="60" w:right="60" w:firstLine="0" w:firstLineChars="0"/>
               <w:rPr>
                 <w:rFonts w:ascii="Helvetica" w:hAnsi="Helvetica" w:eastAsia="Helvetica" w:cs="Helvetica"/>
                 <w:i w:val="false"/>
@@ -6986,15 +6986,15 @@
           <w:p>
             <w:pPr>
               <w:pStyle w:val="Normal"/>
-              <w:jc w:val="right"/>
-              <w:pBdr>
-                <w:bottom w:val="none" w:sz="0" w:space="0" w:color="000000"/>
-                <w:top w:val="none" w:sz="0" w:space="0" w:color="000000"/>
-                <w:left w:val="none" w:sz="0" w:space="0" w:color="000000"/>
-                <w:right w:val="none" w:sz="0" w:space="0" w:color="000000"/>
-              </w:pBdr>
-              <w:spacing w:after="100" w:before="100" w:line="240"/>
-              <w:ind w:left="100" w:right="100" w:firstLine="0" w:firstLineChars="0"/>
+              <w:jc w:val="center"/>
+              <w:pBdr>
+                <w:bottom w:val="none" w:sz="0" w:space="0" w:color="000000"/>
+                <w:top w:val="none" w:sz="0" w:space="0" w:color="000000"/>
+                <w:left w:val="none" w:sz="0" w:space="0" w:color="000000"/>
+                <w:right w:val="none" w:sz="0" w:space="0" w:color="000000"/>
+              </w:pBdr>
+              <w:spacing w:after="60" w:before="60" w:line="240"/>
+              <w:ind w:left="60" w:right="60" w:firstLine="0" w:firstLineChars="0"/>
               <w:rPr>
                 <w:rFonts w:ascii="Helvetica" w:hAnsi="Helvetica" w:eastAsia="Helvetica" w:cs="Helvetica"/>
                 <w:i w:val="false"/>
@@ -7041,15 +7041,15 @@
           <w:p>
             <w:pPr>
               <w:pStyle w:val="Normal"/>
-              <w:jc w:val="right"/>
-              <w:pBdr>
-                <w:bottom w:val="none" w:sz="0" w:space="0" w:color="000000"/>
-                <w:top w:val="none" w:sz="0" w:space="0" w:color="000000"/>
-                <w:left w:val="none" w:sz="0" w:space="0" w:color="000000"/>
-                <w:right w:val="none" w:sz="0" w:space="0" w:color="000000"/>
-              </w:pBdr>
-              <w:spacing w:after="100" w:before="100" w:line="240"/>
-              <w:ind w:left="100" w:right="100" w:firstLine="0" w:firstLineChars="0"/>
+              <w:jc w:val="center"/>
+              <w:pBdr>
+                <w:bottom w:val="none" w:sz="0" w:space="0" w:color="000000"/>
+                <w:top w:val="none" w:sz="0" w:space="0" w:color="000000"/>
+                <w:left w:val="none" w:sz="0" w:space="0" w:color="000000"/>
+                <w:right w:val="none" w:sz="0" w:space="0" w:color="000000"/>
+              </w:pBdr>
+              <w:spacing w:after="60" w:before="60" w:line="240"/>
+              <w:ind w:left="60" w:right="60" w:firstLine="0" w:firstLineChars="0"/>
               <w:rPr>
                 <w:rFonts w:ascii="Helvetica" w:hAnsi="Helvetica" w:eastAsia="Helvetica" w:cs="Helvetica"/>
                 <w:i w:val="false"/>
@@ -7079,7 +7079,7 @@
       </w:tr>
       <w:tr>
         <w:trPr>
-          <w:trHeight w:val="621" w:hRule="auto"/>
+          <w:trHeight w:val="360" w:hRule="auto"/>
         </w:trPr>
         <w:tc>
           <w:tcPr>
@@ -7108,8 +7108,8 @@
                 <w:left w:val="none" w:sz="0" w:space="0" w:color="000000"/>
                 <w:right w:val="none" w:sz="0" w:space="0" w:color="000000"/>
               </w:pBdr>
-              <w:spacing w:after="100" w:before="100" w:line="240"/>
-              <w:ind w:left="100" w:right="100" w:firstLine="0" w:firstLineChars="0"/>
+              <w:spacing w:after="60" w:before="60" w:line="240"/>
+              <w:ind w:left="60" w:right="60" w:firstLine="0" w:firstLineChars="0"/>
               <w:rPr>
                 <w:rFonts w:ascii="Helvetica" w:hAnsi="Helvetica" w:eastAsia="Helvetica" w:cs="Helvetica"/>
                 <w:i w:val="false"/>
@@ -7156,15 +7156,15 @@
           <w:p>
             <w:pPr>
               <w:pStyle w:val="Normal"/>
-              <w:jc w:val="right"/>
-              <w:pBdr>
-                <w:bottom w:val="none" w:sz="0" w:space="0" w:color="000000"/>
-                <w:top w:val="none" w:sz="0" w:space="0" w:color="000000"/>
-                <w:left w:val="none" w:sz="0" w:space="0" w:color="000000"/>
-                <w:right w:val="none" w:sz="0" w:space="0" w:color="000000"/>
-              </w:pBdr>
-              <w:spacing w:after="100" w:before="100" w:line="240"/>
-              <w:ind w:left="100" w:right="100" w:firstLine="0" w:firstLineChars="0"/>
+              <w:jc w:val="center"/>
+              <w:pBdr>
+                <w:bottom w:val="none" w:sz="0" w:space="0" w:color="000000"/>
+                <w:top w:val="none" w:sz="0" w:space="0" w:color="000000"/>
+                <w:left w:val="none" w:sz="0" w:space="0" w:color="000000"/>
+                <w:right w:val="none" w:sz="0" w:space="0" w:color="000000"/>
+              </w:pBdr>
+              <w:spacing w:after="60" w:before="60" w:line="240"/>
+              <w:ind w:left="60" w:right="60" w:firstLine="0" w:firstLineChars="0"/>
               <w:rPr>
                 <w:rFonts w:ascii="Helvetica" w:hAnsi="Helvetica" w:eastAsia="Helvetica" w:cs="Helvetica"/>
                 <w:i w:val="false"/>
@@ -7211,15 +7211,15 @@
           <w:p>
             <w:pPr>
               <w:pStyle w:val="Normal"/>
-              <w:jc w:val="right"/>
-              <w:pBdr>
-                <w:bottom w:val="none" w:sz="0" w:space="0" w:color="000000"/>
-                <w:top w:val="none" w:sz="0" w:space="0" w:color="000000"/>
-                <w:left w:val="none" w:sz="0" w:space="0" w:color="000000"/>
-                <w:right w:val="none" w:sz="0" w:space="0" w:color="000000"/>
-              </w:pBdr>
-              <w:spacing w:after="100" w:before="100" w:line="240"/>
-              <w:ind w:left="100" w:right="100" w:firstLine="0" w:firstLineChars="0"/>
+              <w:jc w:val="center"/>
+              <w:pBdr>
+                <w:bottom w:val="none" w:sz="0" w:space="0" w:color="000000"/>
+                <w:top w:val="none" w:sz="0" w:space="0" w:color="000000"/>
+                <w:left w:val="none" w:sz="0" w:space="0" w:color="000000"/>
+                <w:right w:val="none" w:sz="0" w:space="0" w:color="000000"/>
+              </w:pBdr>
+              <w:spacing w:after="60" w:before="60" w:line="240"/>
+              <w:ind w:left="60" w:right="60" w:firstLine="0" w:firstLineChars="0"/>
               <w:rPr>
                 <w:rFonts w:ascii="Helvetica" w:hAnsi="Helvetica" w:eastAsia="Helvetica" w:cs="Helvetica"/>
                 <w:i w:val="false"/>
@@ -7266,15 +7266,15 @@
           <w:p>
             <w:pPr>
               <w:pStyle w:val="Normal"/>
-              <w:jc w:val="right"/>
-              <w:pBdr>
-                <w:bottom w:val="none" w:sz="0" w:space="0" w:color="000000"/>
-                <w:top w:val="none" w:sz="0" w:space="0" w:color="000000"/>
-                <w:left w:val="none" w:sz="0" w:space="0" w:color="000000"/>
-                <w:right w:val="none" w:sz="0" w:space="0" w:color="000000"/>
-              </w:pBdr>
-              <w:spacing w:after="100" w:before="100" w:line="240"/>
-              <w:ind w:left="100" w:right="100" w:firstLine="0" w:firstLineChars="0"/>
+              <w:jc w:val="center"/>
+              <w:pBdr>
+                <w:bottom w:val="none" w:sz="0" w:space="0" w:color="000000"/>
+                <w:top w:val="none" w:sz="0" w:space="0" w:color="000000"/>
+                <w:left w:val="none" w:sz="0" w:space="0" w:color="000000"/>
+                <w:right w:val="none" w:sz="0" w:space="0" w:color="000000"/>
+              </w:pBdr>
+              <w:spacing w:after="60" w:before="60" w:line="240"/>
+              <w:ind w:left="60" w:right="60" w:firstLine="0" w:firstLineChars="0"/>
               <w:rPr>
                 <w:rFonts w:ascii="Helvetica" w:hAnsi="Helvetica" w:eastAsia="Helvetica" w:cs="Helvetica"/>
                 <w:i w:val="false"/>
@@ -7321,15 +7321,15 @@
           <w:p>
             <w:pPr>
               <w:pStyle w:val="Normal"/>
-              <w:jc w:val="right"/>
-              <w:pBdr>
-                <w:bottom w:val="none" w:sz="0" w:space="0" w:color="000000"/>
-                <w:top w:val="none" w:sz="0" w:space="0" w:color="000000"/>
-                <w:left w:val="none" w:sz="0" w:space="0" w:color="000000"/>
-                <w:right w:val="none" w:sz="0" w:space="0" w:color="000000"/>
-              </w:pBdr>
-              <w:spacing w:after="100" w:before="100" w:line="240"/>
-              <w:ind w:left="100" w:right="100" w:firstLine="0" w:firstLineChars="0"/>
+              <w:jc w:val="center"/>
+              <w:pBdr>
+                <w:bottom w:val="none" w:sz="0" w:space="0" w:color="000000"/>
+                <w:top w:val="none" w:sz="0" w:space="0" w:color="000000"/>
+                <w:left w:val="none" w:sz="0" w:space="0" w:color="000000"/>
+                <w:right w:val="none" w:sz="0" w:space="0" w:color="000000"/>
+              </w:pBdr>
+              <w:spacing w:after="60" w:before="60" w:line="240"/>
+              <w:ind w:left="60" w:right="60" w:firstLine="0" w:firstLineChars="0"/>
               <w:rPr>
                 <w:rFonts w:ascii="Helvetica" w:hAnsi="Helvetica" w:eastAsia="Helvetica" w:cs="Helvetica"/>
                 <w:i w:val="false"/>
@@ -7376,15 +7376,15 @@
           <w:p>
             <w:pPr>
               <w:pStyle w:val="Normal"/>
-              <w:jc w:val="right"/>
-              <w:pBdr>
-                <w:bottom w:val="none" w:sz="0" w:space="0" w:color="000000"/>
-                <w:top w:val="none" w:sz="0" w:space="0" w:color="000000"/>
-                <w:left w:val="none" w:sz="0" w:space="0" w:color="000000"/>
-                <w:right w:val="none" w:sz="0" w:space="0" w:color="000000"/>
-              </w:pBdr>
-              <w:spacing w:after="100" w:before="100" w:line="240"/>
-              <w:ind w:left="100" w:right="100" w:firstLine="0" w:firstLineChars="0"/>
+              <w:jc w:val="center"/>
+              <w:pBdr>
+                <w:bottom w:val="none" w:sz="0" w:space="0" w:color="000000"/>
+                <w:top w:val="none" w:sz="0" w:space="0" w:color="000000"/>
+                <w:left w:val="none" w:sz="0" w:space="0" w:color="000000"/>
+                <w:right w:val="none" w:sz="0" w:space="0" w:color="000000"/>
+              </w:pBdr>
+              <w:spacing w:after="60" w:before="60" w:line="240"/>
+              <w:ind w:left="60" w:right="60" w:firstLine="0" w:firstLineChars="0"/>
               <w:rPr>
                 <w:rFonts w:ascii="Helvetica" w:hAnsi="Helvetica" w:eastAsia="Helvetica" w:cs="Helvetica"/>
                 <w:i w:val="false"/>
@@ -7431,15 +7431,15 @@
           <w:p>
             <w:pPr>
               <w:pStyle w:val="Normal"/>
-              <w:jc w:val="right"/>
-              <w:pBdr>
-                <w:bottom w:val="none" w:sz="0" w:space="0" w:color="000000"/>
-                <w:top w:val="none" w:sz="0" w:space="0" w:color="000000"/>
-                <w:left w:val="none" w:sz="0" w:space="0" w:color="000000"/>
-                <w:right w:val="none" w:sz="0" w:space="0" w:color="000000"/>
-              </w:pBdr>
-              <w:spacing w:after="100" w:before="100" w:line="240"/>
-              <w:ind w:left="100" w:right="100" w:firstLine="0" w:firstLineChars="0"/>
+              <w:jc w:val="center"/>
+              <w:pBdr>
+                <w:bottom w:val="none" w:sz="0" w:space="0" w:color="000000"/>
+                <w:top w:val="none" w:sz="0" w:space="0" w:color="000000"/>
+                <w:left w:val="none" w:sz="0" w:space="0" w:color="000000"/>
+                <w:right w:val="none" w:sz="0" w:space="0" w:color="000000"/>
+              </w:pBdr>
+              <w:spacing w:after="60" w:before="60" w:line="240"/>
+              <w:ind w:left="60" w:right="60" w:firstLine="0" w:firstLineChars="0"/>
               <w:rPr>
                 <w:rFonts w:ascii="Helvetica" w:hAnsi="Helvetica" w:eastAsia="Helvetica" w:cs="Helvetica"/>
                 <w:i w:val="false"/>
@@ -7469,7 +7469,7 @@
       </w:tr>
       <w:tr>
         <w:trPr>
-          <w:trHeight w:val="619" w:hRule="auto"/>
+          <w:trHeight w:val="360" w:hRule="auto"/>
         </w:trPr>
         <w:tc>
           <w:tcPr>
@@ -7498,8 +7498,8 @@
                 <w:left w:val="none" w:sz="0" w:space="0" w:color="000000"/>
                 <w:right w:val="none" w:sz="0" w:space="0" w:color="000000"/>
               </w:pBdr>
-              <w:spacing w:after="100" w:before="100" w:line="240"/>
-              <w:ind w:left="100" w:right="100" w:firstLine="0" w:firstLineChars="0"/>
+              <w:spacing w:after="60" w:before="60" w:line="240"/>
+              <w:ind w:left="60" w:right="60" w:firstLine="0" w:firstLineChars="0"/>
               <w:rPr>
                 <w:rFonts w:ascii="Helvetica" w:hAnsi="Helvetica" w:eastAsia="Helvetica" w:cs="Helvetica"/>
                 <w:i w:val="false"/>
@@ -7546,15 +7546,15 @@
           <w:p>
             <w:pPr>
               <w:pStyle w:val="Normal"/>
-              <w:jc w:val="right"/>
-              <w:pBdr>
-                <w:bottom w:val="none" w:sz="0" w:space="0" w:color="000000"/>
-                <w:top w:val="none" w:sz="0" w:space="0" w:color="000000"/>
-                <w:left w:val="none" w:sz="0" w:space="0" w:color="000000"/>
-                <w:right w:val="none" w:sz="0" w:space="0" w:color="000000"/>
-              </w:pBdr>
-              <w:spacing w:after="100" w:before="100" w:line="240"/>
-              <w:ind w:left="100" w:right="100" w:firstLine="0" w:firstLineChars="0"/>
+              <w:jc w:val="center"/>
+              <w:pBdr>
+                <w:bottom w:val="none" w:sz="0" w:space="0" w:color="000000"/>
+                <w:top w:val="none" w:sz="0" w:space="0" w:color="000000"/>
+                <w:left w:val="none" w:sz="0" w:space="0" w:color="000000"/>
+                <w:right w:val="none" w:sz="0" w:space="0" w:color="000000"/>
+              </w:pBdr>
+              <w:spacing w:after="60" w:before="60" w:line="240"/>
+              <w:ind w:left="60" w:right="60" w:firstLine="0" w:firstLineChars="0"/>
               <w:rPr>
                 <w:rFonts w:ascii="Helvetica" w:hAnsi="Helvetica" w:eastAsia="Helvetica" w:cs="Helvetica"/>
                 <w:i w:val="false"/>
@@ -7601,15 +7601,15 @@
           <w:p>
             <w:pPr>
               <w:pStyle w:val="Normal"/>
-              <w:jc w:val="right"/>
-              <w:pBdr>
-                <w:bottom w:val="none" w:sz="0" w:space="0" w:color="000000"/>
-                <w:top w:val="none" w:sz="0" w:space="0" w:color="000000"/>
-                <w:left w:val="none" w:sz="0" w:space="0" w:color="000000"/>
-                <w:right w:val="none" w:sz="0" w:space="0" w:color="000000"/>
-              </w:pBdr>
-              <w:spacing w:after="100" w:before="100" w:line="240"/>
-              <w:ind w:left="100" w:right="100" w:firstLine="0" w:firstLineChars="0"/>
+              <w:jc w:val="center"/>
+              <w:pBdr>
+                <w:bottom w:val="none" w:sz="0" w:space="0" w:color="000000"/>
+                <w:top w:val="none" w:sz="0" w:space="0" w:color="000000"/>
+                <w:left w:val="none" w:sz="0" w:space="0" w:color="000000"/>
+                <w:right w:val="none" w:sz="0" w:space="0" w:color="000000"/>
+              </w:pBdr>
+              <w:spacing w:after="60" w:before="60" w:line="240"/>
+              <w:ind w:left="60" w:right="60" w:firstLine="0" w:firstLineChars="0"/>
               <w:rPr>
                 <w:rFonts w:ascii="Helvetica" w:hAnsi="Helvetica" w:eastAsia="Helvetica" w:cs="Helvetica"/>
                 <w:i w:val="false"/>
@@ -7656,15 +7656,15 @@
           <w:p>
             <w:pPr>
               <w:pStyle w:val="Normal"/>
-              <w:jc w:val="right"/>
-              <w:pBdr>
-                <w:bottom w:val="none" w:sz="0" w:space="0" w:color="000000"/>
-                <w:top w:val="none" w:sz="0" w:space="0" w:color="000000"/>
-                <w:left w:val="none" w:sz="0" w:space="0" w:color="000000"/>
-                <w:right w:val="none" w:sz="0" w:space="0" w:color="000000"/>
-              </w:pBdr>
-              <w:spacing w:after="100" w:before="100" w:line="240"/>
-              <w:ind w:left="100" w:right="100" w:firstLine="0" w:firstLineChars="0"/>
+              <w:jc w:val="center"/>
+              <w:pBdr>
+                <w:bottom w:val="none" w:sz="0" w:space="0" w:color="000000"/>
+                <w:top w:val="none" w:sz="0" w:space="0" w:color="000000"/>
+                <w:left w:val="none" w:sz="0" w:space="0" w:color="000000"/>
+                <w:right w:val="none" w:sz="0" w:space="0" w:color="000000"/>
+              </w:pBdr>
+              <w:spacing w:after="60" w:before="60" w:line="240"/>
+              <w:ind w:left="60" w:right="60" w:firstLine="0" w:firstLineChars="0"/>
               <w:rPr>
                 <w:rFonts w:ascii="Helvetica" w:hAnsi="Helvetica" w:eastAsia="Helvetica" w:cs="Helvetica"/>
                 <w:i w:val="false"/>
@@ -7711,15 +7711,15 @@
           <w:p>
             <w:pPr>
               <w:pStyle w:val="Normal"/>
-              <w:jc w:val="right"/>
-              <w:pBdr>
-                <w:bottom w:val="none" w:sz="0" w:space="0" w:color="000000"/>
-                <w:top w:val="none" w:sz="0" w:space="0" w:color="000000"/>
-                <w:left w:val="none" w:sz="0" w:space="0" w:color="000000"/>
-                <w:right w:val="none" w:sz="0" w:space="0" w:color="000000"/>
-              </w:pBdr>
-              <w:spacing w:after="100" w:before="100" w:line="240"/>
-              <w:ind w:left="100" w:right="100" w:firstLine="0" w:firstLineChars="0"/>
+              <w:jc w:val="center"/>
+              <w:pBdr>
+                <w:bottom w:val="none" w:sz="0" w:space="0" w:color="000000"/>
+                <w:top w:val="none" w:sz="0" w:space="0" w:color="000000"/>
+                <w:left w:val="none" w:sz="0" w:space="0" w:color="000000"/>
+                <w:right w:val="none" w:sz="0" w:space="0" w:color="000000"/>
+              </w:pBdr>
+              <w:spacing w:after="60" w:before="60" w:line="240"/>
+              <w:ind w:left="60" w:right="60" w:firstLine="0" w:firstLineChars="0"/>
               <w:rPr>
                 <w:rFonts w:ascii="Helvetica" w:hAnsi="Helvetica" w:eastAsia="Helvetica" w:cs="Helvetica"/>
                 <w:i w:val="false"/>
@@ -7766,15 +7766,15 @@
           <w:p>
             <w:pPr>
               <w:pStyle w:val="Normal"/>
-              <w:jc w:val="right"/>
-              <w:pBdr>
-                <w:bottom w:val="none" w:sz="0" w:space="0" w:color="000000"/>
-                <w:top w:val="none" w:sz="0" w:space="0" w:color="000000"/>
-                <w:left w:val="none" w:sz="0" w:space="0" w:color="000000"/>
-                <w:right w:val="none" w:sz="0" w:space="0" w:color="000000"/>
-              </w:pBdr>
-              <w:spacing w:after="100" w:before="100" w:line="240"/>
-              <w:ind w:left="100" w:right="100" w:firstLine="0" w:firstLineChars="0"/>
+              <w:jc w:val="center"/>
+              <w:pBdr>
+                <w:bottom w:val="none" w:sz="0" w:space="0" w:color="000000"/>
+                <w:top w:val="none" w:sz="0" w:space="0" w:color="000000"/>
+                <w:left w:val="none" w:sz="0" w:space="0" w:color="000000"/>
+                <w:right w:val="none" w:sz="0" w:space="0" w:color="000000"/>
+              </w:pBdr>
+              <w:spacing w:after="60" w:before="60" w:line="240"/>
+              <w:ind w:left="60" w:right="60" w:firstLine="0" w:firstLineChars="0"/>
               <w:rPr>
                 <w:rFonts w:ascii="Helvetica" w:hAnsi="Helvetica" w:eastAsia="Helvetica" w:cs="Helvetica"/>
                 <w:i w:val="false"/>
@@ -7821,15 +7821,15 @@
           <w:p>
             <w:pPr>
               <w:pStyle w:val="Normal"/>
-              <w:jc w:val="right"/>
-              <w:pBdr>
-                <w:bottom w:val="none" w:sz="0" w:space="0" w:color="000000"/>
-                <w:top w:val="none" w:sz="0" w:space="0" w:color="000000"/>
-                <w:left w:val="none" w:sz="0" w:space="0" w:color="000000"/>
-                <w:right w:val="none" w:sz="0" w:space="0" w:color="000000"/>
-              </w:pBdr>
-              <w:spacing w:after="100" w:before="100" w:line="240"/>
-              <w:ind w:left="100" w:right="100" w:firstLine="0" w:firstLineChars="0"/>
+              <w:jc w:val="center"/>
+              <w:pBdr>
+                <w:bottom w:val="none" w:sz="0" w:space="0" w:color="000000"/>
+                <w:top w:val="none" w:sz="0" w:space="0" w:color="000000"/>
+                <w:left w:val="none" w:sz="0" w:space="0" w:color="000000"/>
+                <w:right w:val="none" w:sz="0" w:space="0" w:color="000000"/>
+              </w:pBdr>
+              <w:spacing w:after="60" w:before="60" w:line="240"/>
+              <w:ind w:left="60" w:right="60" w:firstLine="0" w:firstLineChars="0"/>
               <w:rPr>
                 <w:rFonts w:ascii="Helvetica" w:hAnsi="Helvetica" w:eastAsia="Helvetica" w:cs="Helvetica"/>
                 <w:i w:val="false"/>
@@ -7859,7 +7859,7 @@
       </w:tr>
       <w:tr>
         <w:trPr>
-          <w:trHeight w:val="618" w:hRule="auto"/>
+          <w:trHeight w:val="360" w:hRule="auto"/>
         </w:trPr>
         <w:tc>
           <w:tcPr>
@@ -7888,8 +7888,8 @@
                 <w:left w:val="none" w:sz="0" w:space="0" w:color="000000"/>
                 <w:right w:val="none" w:sz="0" w:space="0" w:color="000000"/>
               </w:pBdr>
-              <w:spacing w:after="100" w:before="100" w:line="240"/>
-              <w:ind w:left="100" w:right="100" w:firstLine="0" w:firstLineChars="0"/>
+              <w:spacing w:after="60" w:before="60" w:line="240"/>
+              <w:ind w:left="60" w:right="60" w:firstLine="0" w:firstLineChars="0"/>
               <w:rPr>
                 <w:rFonts w:ascii="Helvetica" w:hAnsi="Helvetica" w:eastAsia="Helvetica" w:cs="Helvetica"/>
                 <w:i w:val="false"/>
@@ -7936,15 +7936,15 @@
           <w:p>
             <w:pPr>
               <w:pStyle w:val="Normal"/>
-              <w:jc w:val="right"/>
-              <w:pBdr>
-                <w:bottom w:val="none" w:sz="0" w:space="0" w:color="000000"/>
-                <w:top w:val="none" w:sz="0" w:space="0" w:color="000000"/>
-                <w:left w:val="none" w:sz="0" w:space="0" w:color="000000"/>
-                <w:right w:val="none" w:sz="0" w:space="0" w:color="000000"/>
-              </w:pBdr>
-              <w:spacing w:after="100" w:before="100" w:line="240"/>
-              <w:ind w:left="100" w:right="100" w:firstLine="0" w:firstLineChars="0"/>
+              <w:jc w:val="center"/>
+              <w:pBdr>
+                <w:bottom w:val="none" w:sz="0" w:space="0" w:color="000000"/>
+                <w:top w:val="none" w:sz="0" w:space="0" w:color="000000"/>
+                <w:left w:val="none" w:sz="0" w:space="0" w:color="000000"/>
+                <w:right w:val="none" w:sz="0" w:space="0" w:color="000000"/>
+              </w:pBdr>
+              <w:spacing w:after="60" w:before="60" w:line="240"/>
+              <w:ind w:left="60" w:right="60" w:firstLine="0" w:firstLineChars="0"/>
               <w:rPr>
                 <w:rFonts w:ascii="Helvetica" w:hAnsi="Helvetica" w:eastAsia="Helvetica" w:cs="Helvetica"/>
                 <w:i w:val="false"/>
@@ -7991,15 +7991,15 @@
           <w:p>
             <w:pPr>
               <w:pStyle w:val="Normal"/>
-              <w:jc w:val="right"/>
-              <w:pBdr>
-                <w:bottom w:val="none" w:sz="0" w:space="0" w:color="000000"/>
-                <w:top w:val="none" w:sz="0" w:space="0" w:color="000000"/>
-                <w:left w:val="none" w:sz="0" w:space="0" w:color="000000"/>
-                <w:right w:val="none" w:sz="0" w:space="0" w:color="000000"/>
-              </w:pBdr>
-              <w:spacing w:after="100" w:before="100" w:line="240"/>
-              <w:ind w:left="100" w:right="100" w:firstLine="0" w:firstLineChars="0"/>
+              <w:jc w:val="center"/>
+              <w:pBdr>
+                <w:bottom w:val="none" w:sz="0" w:space="0" w:color="000000"/>
+                <w:top w:val="none" w:sz="0" w:space="0" w:color="000000"/>
+                <w:left w:val="none" w:sz="0" w:space="0" w:color="000000"/>
+                <w:right w:val="none" w:sz="0" w:space="0" w:color="000000"/>
+              </w:pBdr>
+              <w:spacing w:after="60" w:before="60" w:line="240"/>
+              <w:ind w:left="60" w:right="60" w:firstLine="0" w:firstLineChars="0"/>
               <w:rPr>
                 <w:rFonts w:ascii="Helvetica" w:hAnsi="Helvetica" w:eastAsia="Helvetica" w:cs="Helvetica"/>
                 <w:i w:val="false"/>
@@ -8046,15 +8046,15 @@
           <w:p>
             <w:pPr>
               <w:pStyle w:val="Normal"/>
-              <w:jc w:val="right"/>
-              <w:pBdr>
-                <w:bottom w:val="none" w:sz="0" w:space="0" w:color="000000"/>
-                <w:top w:val="none" w:sz="0" w:space="0" w:color="000000"/>
-                <w:left w:val="none" w:sz="0" w:space="0" w:color="000000"/>
-                <w:right w:val="none" w:sz="0" w:space="0" w:color="000000"/>
-              </w:pBdr>
-              <w:spacing w:after="100" w:before="100" w:line="240"/>
-              <w:ind w:left="100" w:right="100" w:firstLine="0" w:firstLineChars="0"/>
+              <w:jc w:val="center"/>
+              <w:pBdr>
+                <w:bottom w:val="none" w:sz="0" w:space="0" w:color="000000"/>
+                <w:top w:val="none" w:sz="0" w:space="0" w:color="000000"/>
+                <w:left w:val="none" w:sz="0" w:space="0" w:color="000000"/>
+                <w:right w:val="none" w:sz="0" w:space="0" w:color="000000"/>
+              </w:pBdr>
+              <w:spacing w:after="60" w:before="60" w:line="240"/>
+              <w:ind w:left="60" w:right="60" w:firstLine="0" w:firstLineChars="0"/>
               <w:rPr>
                 <w:rFonts w:ascii="Helvetica" w:hAnsi="Helvetica" w:eastAsia="Helvetica" w:cs="Helvetica"/>
                 <w:i w:val="false"/>
@@ -8101,15 +8101,15 @@
           <w:p>
             <w:pPr>
               <w:pStyle w:val="Normal"/>
-              <w:jc w:val="right"/>
-              <w:pBdr>
-                <w:bottom w:val="none" w:sz="0" w:space="0" w:color="000000"/>
-                <w:top w:val="none" w:sz="0" w:space="0" w:color="000000"/>
-                <w:left w:val="none" w:sz="0" w:space="0" w:color="000000"/>
-                <w:right w:val="none" w:sz="0" w:space="0" w:color="000000"/>
-              </w:pBdr>
-              <w:spacing w:after="100" w:before="100" w:line="240"/>
-              <w:ind w:left="100" w:right="100" w:firstLine="0" w:firstLineChars="0"/>
+              <w:jc w:val="center"/>
+              <w:pBdr>
+                <w:bottom w:val="none" w:sz="0" w:space="0" w:color="000000"/>
+                <w:top w:val="none" w:sz="0" w:space="0" w:color="000000"/>
+                <w:left w:val="none" w:sz="0" w:space="0" w:color="000000"/>
+                <w:right w:val="none" w:sz="0" w:space="0" w:color="000000"/>
+              </w:pBdr>
+              <w:spacing w:after="60" w:before="60" w:line="240"/>
+              <w:ind w:left="60" w:right="60" w:firstLine="0" w:firstLineChars="0"/>
               <w:rPr>
                 <w:rFonts w:ascii="Helvetica" w:hAnsi="Helvetica" w:eastAsia="Helvetica" w:cs="Helvetica"/>
                 <w:i w:val="false"/>
@@ -8156,15 +8156,15 @@
           <w:p>
             <w:pPr>
               <w:pStyle w:val="Normal"/>
-              <w:jc w:val="right"/>
-              <w:pBdr>
-                <w:bottom w:val="none" w:sz="0" w:space="0" w:color="000000"/>
-                <w:top w:val="none" w:sz="0" w:space="0" w:color="000000"/>
-                <w:left w:val="none" w:sz="0" w:space="0" w:color="000000"/>
-                <w:right w:val="none" w:sz="0" w:space="0" w:color="000000"/>
-              </w:pBdr>
-              <w:spacing w:after="100" w:before="100" w:line="240"/>
-              <w:ind w:left="100" w:right="100" w:firstLine="0" w:firstLineChars="0"/>
+              <w:jc w:val="center"/>
+              <w:pBdr>
+                <w:bottom w:val="none" w:sz="0" w:space="0" w:color="000000"/>
+                <w:top w:val="none" w:sz="0" w:space="0" w:color="000000"/>
+                <w:left w:val="none" w:sz="0" w:space="0" w:color="000000"/>
+                <w:right w:val="none" w:sz="0" w:space="0" w:color="000000"/>
+              </w:pBdr>
+              <w:spacing w:after="60" w:before="60" w:line="240"/>
+              <w:ind w:left="60" w:right="60" w:firstLine="0" w:firstLineChars="0"/>
               <w:rPr>
                 <w:rFonts w:ascii="Helvetica" w:hAnsi="Helvetica" w:eastAsia="Helvetica" w:cs="Helvetica"/>
                 <w:i w:val="false"/>
@@ -8211,15 +8211,15 @@
           <w:p>
             <w:pPr>
               <w:pStyle w:val="Normal"/>
-              <w:jc w:val="right"/>
-              <w:pBdr>
-                <w:bottom w:val="none" w:sz="0" w:space="0" w:color="000000"/>
-                <w:top w:val="none" w:sz="0" w:space="0" w:color="000000"/>
-                <w:left w:val="none" w:sz="0" w:space="0" w:color="000000"/>
-                <w:right w:val="none" w:sz="0" w:space="0" w:color="000000"/>
-              </w:pBdr>
-              <w:spacing w:after="100" w:before="100" w:line="240"/>
-              <w:ind w:left="100" w:right="100" w:firstLine="0" w:firstLineChars="0"/>
+              <w:jc w:val="center"/>
+              <w:pBdr>
+                <w:bottom w:val="none" w:sz="0" w:space="0" w:color="000000"/>
+                <w:top w:val="none" w:sz="0" w:space="0" w:color="000000"/>
+                <w:left w:val="none" w:sz="0" w:space="0" w:color="000000"/>
+                <w:right w:val="none" w:sz="0" w:space="0" w:color="000000"/>
+              </w:pBdr>
+              <w:spacing w:after="60" w:before="60" w:line="240"/>
+              <w:ind w:left="60" w:right="60" w:firstLine="0" w:firstLineChars="0"/>
               <w:rPr>
                 <w:rFonts w:ascii="Helvetica" w:hAnsi="Helvetica" w:eastAsia="Helvetica" w:cs="Helvetica"/>
                 <w:i w:val="false"/>
@@ -8256,7 +8256,7 @@
         <w:rPr/>
         <w:drawing>
           <wp:inline distT="0" distB="0" distL="0" distR="0">
-            <wp:extent cx="5943600" cy="2743200"/>
+            <wp:extent cx="5943600" cy="2641600"/>
             <wp:docPr id="7" name="" descr=""/>
             <wp:cNvGraphicFramePr>
               <a:graphicFrameLocks xmlns:a="http://schemas.openxmlformats.org/drawingml/2006/main" noChangeAspect="1"/>
@@ -8279,7 +8279,7 @@
                   <pic:spPr bwMode="auto">
                     <a:xfrm>
                       <a:off x="0" y="0"/>
-                      <a:ext cx="5943600" cy="2743200"/>
+                      <a:ext cx="5943600" cy="2641600"/>
                     </a:xfrm>
                     <a:prstGeom prst="rect">
                       <a:avLst/>
@@ -8354,7 +8354,7 @@
         <w:pStyle w:val="Normal"/>
       </w:pPr>
       <w:r>
-        <w:t xml:space="preserve">MAP3K8 expression was compared between pCR and residual disease (RD) groups by Wilcoxon rank-sum test, across RCB classes by Kruskal-Wallis test, and analysed by univariable logistic regression with pCR as the outcome. Discriminative performance was quantified by an ROC curve. As benchmark, the Hatzis chemosensitivity signature (the genomic predictor originally developed on this cohort) was used; a combined logistic model (Hatzis + MAP3K8) was tested for incremental value via DeLong's test. Concordance between MAP3K8 median split and the Hatzis Rx-Sensitive / Rx-Insensitive call was quantified by Cohen's κ.</w:t>
+        <w:t xml:space="preserve">MAP3K8 expression was compared between pCR and residual disease (RD) groups by Wilcoxon rank-sum test, across RCB classes by Kruskal-Wallis test, and analysed by univariable logistic regression with pCR as the outcome. Discriminative performance was quantified by an ROC curve. As benchmark, the Hatzis chemosensitivity signature (the genomic predictor originally developed on this cohort) was used; a combined logistic model (Hatzis + MAP3K8) was tested for incremental value via DeLong's test. Concordance between MAP3K8 median split and the Hatzis Rx-Sensitive / Rx-Insensitive call was quantified by Cohen's kappa.</w:t>
       </w:r>
     </w:p>
     <w:p>
@@ -8370,7 +8370,7 @@
         <w:pStyle w:val="Normal"/>
       </w:pPr>
       <w:r>
-        <w:t xml:space="preserve">MAP3K8 expression did not separate pCR from RD (Wilcoxon P = 0.73; logistic OR per unit log2 = 1.01, 95% CI 0.74 – 1.41, P = 0.96). The ROC AUC for MAP3K8 alone was 0.52 (95% CI 0.42 – 0.61) — essentially indistinguishable from chance. The Hatzis signature performed substantially better (AUC 0.68, 95% CI 0.61 – 0.76). The combined model offered no statistically significant gain over the Hatzis signature alone (AUC 0.70, DeLong P = 0.59). Concordance between MAP3K8 median dichotomisation and the Hatzis chemosensitivity call was negligible (Cohen's κ = 0.08).</w:t>
+        <w:t xml:space="preserve">MAP3K8 expression did not separate pCR from RD (Wilcoxon P = 0.73; logistic OR per unit log2 = 1.01, 95% CI 0.74 - 1.41, P = 0.96). The ROC AUC for MAP3K8 alone was 0.52 (95% CI 0.42 - 0.61) - essentially indistinguishable from chance. The Hatzis signature performed substantially better (AUC 0.68, 95% CI 0.61 - 0.76). The combined model offered no statistically significant gain over the Hatzis signature alone (AUC 0.70, DeLong P = 0.59). Concordance between MAP3K8 median dichotomisation and the Hatzis chemosensitivity call was negligible (Cohen's kappa = 0.08).</w:t>
       </w:r>
     </w:p>
     <w:p>
@@ -8381,7 +8381,7 @@
         <w:rPr/>
         <w:drawing>
           <wp:inline distT="0" distB="0" distL="0" distR="0">
-            <wp:extent cx="5120640" cy="5120640"/>
+            <wp:extent cx="5943600" cy="5943600"/>
             <wp:docPr id="9" name="" descr=""/>
             <wp:cNvGraphicFramePr>
               <a:graphicFrameLocks xmlns:a="http://schemas.openxmlformats.org/drawingml/2006/main" noChangeAspect="1"/>
@@ -8404,7 +8404,7 @@
                   <pic:spPr bwMode="auto">
                     <a:xfrm>
                       <a:off x="0" y="0"/>
-                      <a:ext cx="5120640" cy="5120640"/>
+                      <a:ext cx="5943600" cy="5943600"/>
                     </a:xfrm>
                     <a:prstGeom prst="rect">
                       <a:avLst/>
@@ -8442,7 +8442,7 @@
         <w:rPr/>
         <w:drawing>
           <wp:inline distT="0" distB="0" distL="0" distR="0">
-            <wp:extent cx="5943600" cy="6400800"/>
+            <wp:extent cx="5943600" cy="6483927"/>
             <wp:docPr id="11" name="" descr=""/>
             <wp:cNvGraphicFramePr>
               <a:graphicFrameLocks xmlns:a="http://schemas.openxmlformats.org/drawingml/2006/main" noChangeAspect="1"/>
@@ -8465,7 +8465,7 @@
                   <pic:spPr bwMode="auto">
                     <a:xfrm>
                       <a:off x="0" y="0"/>
-                      <a:ext cx="5943600" cy="6400800"/>
+                      <a:ext cx="5943600" cy="6483927"/>
                     </a:xfrm>
                     <a:prstGeom prst="rect">
                       <a:avLst/>
@@ -8484,7 +8484,7 @@
         <w:pStyle w:val="Normal"/>
       </w:pPr>
       <w:r>
-        <w:t xml:space="preserve">Figure E2. Composite distribution plot — MAP3K8 log2 expression in pCR vs RD (A), by the Hatzis chemosensitivity prediction (B), by the DLDA-30 prediction (C), by the RCB-0/I prediction (D), and across actual RCB classes (E). With the exception of the DLDA-30 split (B; Wilcoxon P = 0.038, direction inverted relative to expectation), MAP3K8 expression does not separate primary-chemoresponse classes.</w:t>
+        <w:t xml:space="preserve">Figure E2. Composite distribution plot - MAP3K8 log2 expression in pCR vs RD (A), by the Hatzis chemosensitivity prediction (B), by the DLDA-30 prediction (C), by the RCB-0/I prediction (D), and across actual RCB classes (E). With the exception of the DLDA-30 split (B; Wilcoxon P = 0.038, direction inverted relative to expectation), MAP3K8 expression does not separate primary-chemoresponse classes.</w:t>
       </w:r>
     </w:p>
     <w:p>
@@ -8516,7 +8516,7 @@
         <w:pStyle w:val="Normal"/>
       </w:pPr>
       <w:r>
-        <w:t xml:space="preserve">1. MAP3K8-high mRNA expression at diagnosis is associated with a 1.8-fold higher rate of post-chemotherapy distant relapse in triple-negative breast cancer treated with neoadjuvant anthracycline-taxane chemotherapy (HR 1.80, 95% CI 1.09 – 2.98, log-rank P = 0.020).</w:t>
+        <w:t xml:space="preserve">1. MAP3K8-high mRNA expression at diagnosis is associated with a 1.8-fold higher rate of post-chemotherapy distant relapse in triple-negative breast cancer treated with neoadjuvant anthracycline-taxane chemotherapy (HR 1.80, 95% CI 1.09 - 2.98, log-rank P = 0.020).</w:t>
       </w:r>
     </w:p>
     <w:p>
@@ -8524,7 +8524,7 @@
         <w:pStyle w:val="Normal"/>
       </w:pPr>
       <w:r>
-        <w:t xml:space="preserve">2. The effect is independent of initial chemoresponse: it survives multivariable adjustment for age, AJCC stage, and Residual Cancer Burden class (HR 1.71, 95% CI 1.00 – 2.94, P = 0.050).</w:t>
+        <w:t xml:space="preserve">2. The effect is independent of initial chemoresponse: it survives multivariable adjustment for age, AJCC stage, and Residual Cancer Burden class (HR 1.71, 95% CI 1.00 - 2.94, P = 0.050).</w:t>
       </w:r>
     </w:p>
     <w:p>
@@ -8532,7 +8532,7 @@
         <w:pStyle w:val="Normal"/>
       </w:pPr>
       <w:r>
-        <w:t xml:space="preserve">3. The effect is detectable within the residual-disease (RCB-II/III) subgroup (HR 2.13, 95% CI 1.16 – 3.90, log-rank P = 0.013), and the direction is preserved within the chemo-responder (RCB-0/I) subgroup although that comparison is underpowered.</w:t>
+        <w:t xml:space="preserve">3. The effect is detectable within the residual-disease (RCB-II/III) subgroup (HR 2.13, 95% CI 1.16 - 3.90, log-rank P = 0.013), and the direction is preserved within the chemo-responder (RCB-0/I) subgroup although that comparison is underpowered.</w:t>
       </w:r>
     </w:p>
     <w:p>
@@ -8540,7 +8540,7 @@
         <w:pStyle w:val="Normal"/>
       </w:pPr>
       <w:r>
-        <w:t xml:space="preserve">4. MAP3K8 expression does not predict initial chemoresponse (AUC 0.52; logistic OR 1.01, P = 0.96; Cohen's κ vs Hatzis signature = 0.08). MAP3K8 therefore carries chemoresistance information that is orthogonal to standard predictive signatures.</w:t>
+        <w:t xml:space="preserve">4. MAP3K8 expression does not predict initial chemoresponse (AUC 0.52; logistic OR 1.01, P = 0.96; Cohen's kappa vs Hatzis signature = 0.08). MAP3K8 therefore carries chemoresistance information that is orthogonal to standard predictive signatures.</w:t>
       </w:r>
     </w:p>
     <w:p>
@@ -8548,7 +8548,7 @@
         <w:pStyle w:val="Normal"/>
       </w:pPr>
       <w:r>
-        <w:t xml:space="preserve">5. Mechanistic interpretation. The pattern of results — prognostic for late relapse but null for primary chemoresponse — is consistent with MAP3K8 marking a stress-adaptive / NF-κB-axis biology that drives residual-tumour outgrowth after chemotherapy clears the bulk of sensitive cells, rather than a primary cytotoxic-resistance gate. This biology is the same axis on which MAP3K8 / TPL2 operates in laboratory models of chemoresistance.</w:t>
+        <w:t xml:space="preserve">5. Mechanistic interpretation. The pattern of results - prognostic for late relapse but null for primary chemoresponse - is consistent with MAP3K8 marking a stress-adaptive / NF-kB-axis biology that drives residual-tumour outgrowth after chemotherapy clears the bulk of sensitive cells, rather than a primary cytotoxic-resistance gate. This biology is the same axis on which MAP3K8 / TPL2 operates in laboratory models of chemoresistance.</w:t>
       </w:r>
     </w:p>
     <w:p>
@@ -8580,7 +8580,7 @@
         <w:pStyle w:val="Normal"/>
       </w:pPr>
       <w:r>
-        <w:t xml:space="preserve">Folder 07_MAP3K8_Chemoresponse_Prediction/  — predictive (pCR) null analysis</w:t>
+        <w:t xml:space="preserve">Folder 07_MAP3K8_Chemoresponse_Prediction/  - predictive (pCR) null analysis</w:t>
       </w:r>
     </w:p>
     <w:p>
@@ -8588,7 +8588,7 @@
         <w:pStyle w:val="Normal"/>
       </w:pPr>
       <w:r>
-        <w:t xml:space="preserve">Folder 08_MAP3K8_Chemoresistance_Prognosis/ — prognostic (DRFS) chemoresistance analysis</w:t>
+        <w:t xml:space="preserve">Folder 08_MAP3K8_Chemoresistance_Prognosis/ - prognostic (DRFS) chemoresistance analysis</w:t>
       </w:r>
     </w:p>
     <w:p>
@@ -8604,15 +8604,14 @@
         <w:pStyle w:val="Normal"/>
       </w:pPr>
       <w:r>
-        <w:t xml:space="preserve">R version: R version 4.5.1 (2025-06-13). Platform: aarch64-apple-darwin20. Date: 2026-05-11. Source workspace: GSE25066_TNBC_MAP3K8_workspace.RData (parent of repo).</w:t>
+        <w:t xml:space="preserve">R version: R version 4.5.1 (2025-06-13). Platform: aarch64-apple-darwin20. Date: 2026-05-12. Source workspace: GSE25066_TNBC_MAP3K8_workspace.RData (parent of repo).</w:t>
       </w:r>
     </w:p>
     <w:sectPr>
+      <w:pgMar w:header="720" w:bottom="1080" w:top="1080" w:right="1080" w:left="1080" w:footer="720" w:gutter="0"/>
+      <w:pgSz w:h="15840" w:w="12240" w:orient="portrait"/>
       <w:type w:val="continuous"/>
-      <w:pgSz w:w="11900" w:h="16840"/>
-      <w:pgMar w:top="1417" w:right="1417" w:bottom="1417" w:left="1417" w:header="708" w:footer="708" w:gutter="0"/>
-      <w:cols w:space="708"/>
-      <w:docGrid w:linePitch="360"/>
+      <w:cols/>
     </w:sectPr>
   </w:body>
 </w:document>

</xml_diff>